<commit_message>
Add comparison API endpoint and updated report
</commit_message>
<xml_diff>
--- a/Report_Kirill_Postrehan_2026.docx
+++ b/Report_Kirill_Postrehan_2026.docx
@@ -122,12 +122,12 @@
             <wp:extent cx="5943600" cy="3022600"/>
             <wp:effectExtent b="0" l="0" r="0" t="0"/>
             <wp:wrapSquare wrapText="bothSides" distB="0" distT="0" distL="0" distR="0"/>
-            <wp:docPr id="31" name="image21.png"/>
+            <wp:docPr id="37" name="image37.png"/>
             <a:graphic>
               <a:graphicData uri="http://schemas.openxmlformats.org/drawingml/2006/picture">
                 <pic:pic>
                   <pic:nvPicPr>
-                    <pic:cNvPr id="0" name="image21.png"/>
+                    <pic:cNvPr id="0" name="image37.png"/>
                     <pic:cNvPicPr preferRelativeResize="0"/>
                   </pic:nvPicPr>
                   <pic:blipFill>
@@ -177,7 +177,7 @@
             <wp:extent cx="6332220" cy="2113915"/>
             <wp:effectExtent b="0" l="0" r="0" t="0"/>
             <wp:wrapSquare wrapText="bothSides" distB="0" distT="0" distL="0" distR="0"/>
-            <wp:docPr id="15" name="image1.png"/>
+            <wp:docPr id="19" name="image1.png"/>
             <a:graphic>
               <a:graphicData uri="http://schemas.openxmlformats.org/drawingml/2006/picture">
                 <pic:pic>
@@ -420,12 +420,12 @@
             <wp:extent cx="5943600" cy="2152015"/>
             <wp:effectExtent b="0" l="0" r="0" t="0"/>
             <wp:wrapSquare wrapText="bothSides" distB="0" distT="0" distL="0" distR="0"/>
-            <wp:docPr id="24" name="image8.png"/>
+            <wp:docPr id="29" name="image19.png"/>
             <a:graphic>
               <a:graphicData uri="http://schemas.openxmlformats.org/drawingml/2006/picture">
                 <pic:pic>
                   <pic:nvPicPr>
-                    <pic:cNvPr id="0" name="image8.png"/>
+                    <pic:cNvPr id="0" name="image19.png"/>
                     <pic:cNvPicPr preferRelativeResize="0"/>
                   </pic:nvPicPr>
                   <pic:blipFill>
@@ -475,12 +475,12 @@
           <wp:inline distB="114300" distT="114300" distL="114300" distR="114300">
             <wp:extent cx="5943600" cy="1638300"/>
             <wp:effectExtent b="0" l="0" r="0" t="0"/>
-            <wp:docPr id="47" name="image45.png"/>
+            <wp:docPr id="55" name="image53.png"/>
             <a:graphic>
               <a:graphicData uri="http://schemas.openxmlformats.org/drawingml/2006/picture">
                 <pic:pic>
                   <pic:nvPicPr>
-                    <pic:cNvPr id="0" name="image45.png"/>
+                    <pic:cNvPr id="0" name="image53.png"/>
                     <pic:cNvPicPr preferRelativeResize="0"/>
                   </pic:nvPicPr>
                   <pic:blipFill>
@@ -541,12 +541,12 @@
           <wp:inline distB="114300" distT="114300" distL="114300" distR="114300">
             <wp:extent cx="3833813" cy="2746337"/>
             <wp:effectExtent b="0" l="0" r="0" t="0"/>
-            <wp:docPr id="5" name="image3.png"/>
+            <wp:docPr id="6" name="image8.png"/>
             <a:graphic>
               <a:graphicData uri="http://schemas.openxmlformats.org/drawingml/2006/picture">
                 <pic:pic>
                   <pic:nvPicPr>
-                    <pic:cNvPr id="0" name="image3.png"/>
+                    <pic:cNvPr id="0" name="image8.png"/>
                     <pic:cNvPicPr preferRelativeResize="0"/>
                   </pic:nvPicPr>
                   <pic:blipFill>
@@ -719,12 +719,12 @@
           <wp:inline distB="114300" distT="114300" distL="114300" distR="114300">
             <wp:extent cx="3490913" cy="1149272"/>
             <wp:effectExtent b="0" l="0" r="0" t="0"/>
-            <wp:docPr id="21" name="image17.png"/>
+            <wp:docPr id="25" name="image23.png"/>
             <a:graphic>
               <a:graphicData uri="http://schemas.openxmlformats.org/drawingml/2006/picture">
                 <pic:pic>
                   <pic:nvPicPr>
-                    <pic:cNvPr id="0" name="image17.png"/>
+                    <pic:cNvPr id="0" name="image23.png"/>
                     <pic:cNvPicPr preferRelativeResize="0"/>
                   </pic:nvPicPr>
                   <pic:blipFill>
@@ -805,12 +805,12 @@
           <wp:inline distB="114300" distT="114300" distL="114300" distR="114300">
             <wp:extent cx="5943600" cy="863600"/>
             <wp:effectExtent b="0" l="0" r="0" t="0"/>
-            <wp:docPr id="19" name="image11.png"/>
+            <wp:docPr id="23" name="image21.png"/>
             <a:graphic>
               <a:graphicData uri="http://schemas.openxmlformats.org/drawingml/2006/picture">
                 <pic:pic>
                   <pic:nvPicPr>
-                    <pic:cNvPr id="0" name="image11.png"/>
+                    <pic:cNvPr id="0" name="image21.png"/>
                     <pic:cNvPicPr preferRelativeResize="0"/>
                   </pic:nvPicPr>
                   <pic:blipFill>
@@ -901,12 +901,12 @@
           <wp:inline distB="114300" distT="114300" distL="114300" distR="114300">
             <wp:extent cx="5943600" cy="2463800"/>
             <wp:effectExtent b="0" l="0" r="0" t="0"/>
-            <wp:docPr id="14" name="image10.png"/>
+            <wp:docPr id="18" name="image29.png"/>
             <a:graphic>
               <a:graphicData uri="http://schemas.openxmlformats.org/drawingml/2006/picture">
                 <pic:pic>
                   <pic:nvPicPr>
-                    <pic:cNvPr id="0" name="image10.png"/>
+                    <pic:cNvPr id="0" name="image29.png"/>
                     <pic:cNvPicPr preferRelativeResize="0"/>
                   </pic:nvPicPr>
                   <pic:blipFill>
@@ -1042,12 +1042,12 @@
           <wp:inline distB="114300" distT="114300" distL="114300" distR="114300">
             <wp:extent cx="3190875" cy="952500"/>
             <wp:effectExtent b="0" l="0" r="0" t="0"/>
-            <wp:docPr id="40" name="image47.png"/>
+            <wp:docPr id="47" name="image35.png"/>
             <a:graphic>
               <a:graphicData uri="http://schemas.openxmlformats.org/drawingml/2006/picture">
                 <pic:pic>
                   <pic:nvPicPr>
-                    <pic:cNvPr id="0" name="image47.png"/>
+                    <pic:cNvPr id="0" name="image35.png"/>
                     <pic:cNvPicPr preferRelativeResize="0"/>
                   </pic:nvPicPr>
                   <pic:blipFill>
@@ -1157,12 +1157,12 @@
           <wp:inline distB="114300" distT="114300" distL="114300" distR="114300">
             <wp:extent cx="5943600" cy="2527300"/>
             <wp:effectExtent b="0" l="0" r="0" t="0"/>
-            <wp:docPr id="1" name="image28.png"/>
+            <wp:docPr id="1" name="image54.png"/>
             <a:graphic>
               <a:graphicData uri="http://schemas.openxmlformats.org/drawingml/2006/picture">
                 <pic:pic>
                   <pic:nvPicPr>
-                    <pic:cNvPr id="0" name="image28.png"/>
+                    <pic:cNvPr id="0" name="image54.png"/>
                     <pic:cNvPicPr preferRelativeResize="0"/>
                   </pic:nvPicPr>
                   <pic:blipFill>
@@ -1246,12 +1246,12 @@
           <wp:inline distB="114300" distT="114300" distL="114300" distR="114300">
             <wp:extent cx="5943600" cy="3098800"/>
             <wp:effectExtent b="0" l="0" r="0" t="0"/>
-            <wp:docPr id="36" name="image41.png"/>
+            <wp:docPr id="42" name="image45.png"/>
             <a:graphic>
               <a:graphicData uri="http://schemas.openxmlformats.org/drawingml/2006/picture">
                 <pic:pic>
                   <pic:nvPicPr>
-                    <pic:cNvPr id="0" name="image41.png"/>
+                    <pic:cNvPr id="0" name="image45.png"/>
                     <pic:cNvPicPr preferRelativeResize="0"/>
                   </pic:nvPicPr>
                   <pic:blipFill>
@@ -1358,12 +1358,12 @@
           <wp:inline distB="114300" distT="114300" distL="114300" distR="114300">
             <wp:extent cx="5591175" cy="790575"/>
             <wp:effectExtent b="0" l="0" r="0" t="0"/>
-            <wp:docPr id="18" name="image4.png"/>
+            <wp:docPr id="22" name="image5.png"/>
             <a:graphic>
               <a:graphicData uri="http://schemas.openxmlformats.org/drawingml/2006/picture">
                 <pic:pic>
                   <pic:nvPicPr>
-                    <pic:cNvPr id="0" name="image4.png"/>
+                    <pic:cNvPr id="0" name="image5.png"/>
                     <pic:cNvPicPr preferRelativeResize="0"/>
                   </pic:nvPicPr>
                   <pic:blipFill>
@@ -1523,12 +1523,12 @@
           <wp:inline distB="114300" distT="114300" distL="114300" distR="114300">
             <wp:extent cx="5943600" cy="711200"/>
             <wp:effectExtent b="0" l="0" r="0" t="0"/>
-            <wp:docPr id="20" name="image9.png"/>
+            <wp:docPr id="24" name="image14.png"/>
             <a:graphic>
               <a:graphicData uri="http://schemas.openxmlformats.org/drawingml/2006/picture">
                 <pic:pic>
                   <pic:nvPicPr>
-                    <pic:cNvPr id="0" name="image9.png"/>
+                    <pic:cNvPr id="0" name="image14.png"/>
                     <pic:cNvPicPr preferRelativeResize="0"/>
                   </pic:nvPicPr>
                   <pic:blipFill>
@@ -1612,12 +1612,12 @@
           <wp:inline distB="114300" distT="114300" distL="114300" distR="114300">
             <wp:extent cx="5943600" cy="711200"/>
             <wp:effectExtent b="0" l="0" r="0" t="0"/>
-            <wp:docPr id="17" name="image5.png"/>
+            <wp:docPr id="21" name="image9.png"/>
             <a:graphic>
               <a:graphicData uri="http://schemas.openxmlformats.org/drawingml/2006/picture">
                 <pic:pic>
                   <pic:nvPicPr>
-                    <pic:cNvPr id="0" name="image5.png"/>
+                    <pic:cNvPr id="0" name="image9.png"/>
                     <pic:cNvPicPr preferRelativeResize="0"/>
                   </pic:nvPicPr>
                   <pic:blipFill>
@@ -1686,12 +1686,12 @@
           <wp:inline distB="114300" distT="114300" distL="114300" distR="114300">
             <wp:extent cx="4619625" cy="1438275"/>
             <wp:effectExtent b="0" l="0" r="0" t="0"/>
-            <wp:docPr id="41" name="image34.png"/>
+            <wp:docPr id="48" name="image36.png"/>
             <a:graphic>
               <a:graphicData uri="http://schemas.openxmlformats.org/drawingml/2006/picture">
                 <pic:pic>
                   <pic:nvPicPr>
-                    <pic:cNvPr id="0" name="image34.png"/>
+                    <pic:cNvPr id="0" name="image36.png"/>
                     <pic:cNvPicPr preferRelativeResize="0"/>
                   </pic:nvPicPr>
                   <pic:blipFill>
@@ -1784,12 +1784,12 @@
           <wp:inline distB="114300" distT="114300" distL="114300" distR="114300">
             <wp:extent cx="5943600" cy="2641600"/>
             <wp:effectExtent b="0" l="0" r="0" t="0"/>
-            <wp:docPr id="45" name="image46.png"/>
+            <wp:docPr id="53" name="image55.png"/>
             <a:graphic>
               <a:graphicData uri="http://schemas.openxmlformats.org/drawingml/2006/picture">
                 <pic:pic>
                   <pic:nvPicPr>
-                    <pic:cNvPr id="0" name="image46.png"/>
+                    <pic:cNvPr id="0" name="image55.png"/>
                     <pic:cNvPicPr preferRelativeResize="0"/>
                   </pic:nvPicPr>
                   <pic:blipFill>
@@ -1873,12 +1873,12 @@
           <wp:inline distB="114300" distT="114300" distL="114300" distR="114300">
             <wp:extent cx="5943600" cy="2641600"/>
             <wp:effectExtent b="0" l="0" r="0" t="0"/>
-            <wp:docPr id="30" name="image44.png"/>
+            <wp:docPr id="36" name="image51.png"/>
             <a:graphic>
               <a:graphicData uri="http://schemas.openxmlformats.org/drawingml/2006/picture">
                 <pic:pic>
                   <pic:nvPicPr>
-                    <pic:cNvPr id="0" name="image44.png"/>
+                    <pic:cNvPr id="0" name="image51.png"/>
                     <pic:cNvPicPr preferRelativeResize="0"/>
                   </pic:nvPicPr>
                   <pic:blipFill>
@@ -1962,12 +1962,12 @@
           <wp:inline distB="114300" distT="114300" distL="114300" distR="114300">
             <wp:extent cx="4572000" cy="2571750"/>
             <wp:effectExtent b="0" l="0" r="0" t="0"/>
-            <wp:docPr id="3" name="image7.png"/>
+            <wp:docPr id="4" name="image6.png"/>
             <a:graphic>
               <a:graphicData uri="http://schemas.openxmlformats.org/drawingml/2006/picture">
                 <pic:pic>
                   <pic:nvPicPr>
-                    <pic:cNvPr id="0" name="image7.png"/>
+                    <pic:cNvPr id="0" name="image6.png"/>
                     <pic:cNvPicPr preferRelativeResize="0"/>
                   </pic:nvPicPr>
                   <pic:blipFill>
@@ -2060,12 +2060,12 @@
           <wp:inline distB="114300" distT="114300" distL="114300" distR="114300">
             <wp:extent cx="5943600" cy="3721100"/>
             <wp:effectExtent b="0" l="0" r="0" t="0"/>
-            <wp:docPr id="11" name="image2.png"/>
+            <wp:docPr id="14" name="image15.png"/>
             <a:graphic>
               <a:graphicData uri="http://schemas.openxmlformats.org/drawingml/2006/picture">
                 <pic:pic>
                   <pic:nvPicPr>
-                    <pic:cNvPr id="0" name="image2.png"/>
+                    <pic:cNvPr id="0" name="image15.png"/>
                     <pic:cNvPicPr preferRelativeResize="0"/>
                   </pic:nvPicPr>
                   <pic:blipFill>
@@ -2122,12 +2122,12 @@
           <wp:inline distB="114300" distT="114300" distL="114300" distR="114300">
             <wp:extent cx="5943600" cy="1549400"/>
             <wp:effectExtent b="0" l="0" r="0" t="0"/>
-            <wp:docPr id="7" name="image19.png"/>
+            <wp:docPr id="9" name="image20.png"/>
             <a:graphic>
               <a:graphicData uri="http://schemas.openxmlformats.org/drawingml/2006/picture">
                 <pic:pic>
                   <pic:nvPicPr>
-                    <pic:cNvPr id="0" name="image19.png"/>
+                    <pic:cNvPr id="0" name="image20.png"/>
                     <pic:cNvPicPr preferRelativeResize="0"/>
                   </pic:nvPicPr>
                   <pic:blipFill>
@@ -2197,12 +2197,12 @@
           <wp:inline distB="114300" distT="114300" distL="114300" distR="114300">
             <wp:extent cx="5943600" cy="3568700"/>
             <wp:effectExtent b="0" l="0" r="0" t="0"/>
-            <wp:docPr id="8" name="image18.png"/>
+            <wp:docPr id="10" name="image27.png"/>
             <a:graphic>
               <a:graphicData uri="http://schemas.openxmlformats.org/drawingml/2006/picture">
                 <pic:pic>
                   <pic:nvPicPr>
-                    <pic:cNvPr id="0" name="image18.png"/>
+                    <pic:cNvPr id="0" name="image27.png"/>
                     <pic:cNvPicPr preferRelativeResize="0"/>
                   </pic:nvPicPr>
                   <pic:blipFill>
@@ -2260,12 +2260,12 @@
           <wp:inline distB="114300" distT="114300" distL="114300" distR="114300">
             <wp:extent cx="5943600" cy="3568700"/>
             <wp:effectExtent b="0" l="0" r="0" t="0"/>
-            <wp:docPr id="10" name="image23.png"/>
+            <wp:docPr id="13" name="image49.png"/>
             <a:graphic>
               <a:graphicData uri="http://schemas.openxmlformats.org/drawingml/2006/picture">
                 <pic:pic>
                   <pic:nvPicPr>
-                    <pic:cNvPr id="0" name="image23.png"/>
+                    <pic:cNvPr id="0" name="image49.png"/>
                     <pic:cNvPicPr preferRelativeResize="0"/>
                   </pic:nvPicPr>
                   <pic:blipFill>
@@ -2337,12 +2337,12 @@
           <wp:inline distB="114300" distT="114300" distL="114300" distR="114300">
             <wp:extent cx="5943600" cy="1460500"/>
             <wp:effectExtent b="0" l="0" r="0" t="0"/>
-            <wp:docPr id="42" name="image43.png"/>
+            <wp:docPr id="50" name="image50.png"/>
             <a:graphic>
               <a:graphicData uri="http://schemas.openxmlformats.org/drawingml/2006/picture">
                 <pic:pic>
                   <pic:nvPicPr>
-                    <pic:cNvPr id="0" name="image43.png"/>
+                    <pic:cNvPr id="0" name="image50.png"/>
                     <pic:cNvPicPr preferRelativeResize="0"/>
                   </pic:nvPicPr>
                   <pic:blipFill>
@@ -2400,12 +2400,12 @@
           <wp:inline distB="114300" distT="114300" distL="114300" distR="114300">
             <wp:extent cx="5943600" cy="3175000"/>
             <wp:effectExtent b="0" l="0" r="0" t="0"/>
-            <wp:docPr id="16" name="image16.png"/>
+            <wp:docPr id="20" name="image17.png"/>
             <a:graphic>
               <a:graphicData uri="http://schemas.openxmlformats.org/drawingml/2006/picture">
                 <pic:pic>
                   <pic:nvPicPr>
-                    <pic:cNvPr id="0" name="image16.png"/>
+                    <pic:cNvPr id="0" name="image17.png"/>
                     <pic:cNvPicPr preferRelativeResize="0"/>
                   </pic:nvPicPr>
                   <pic:blipFill>
@@ -2475,12 +2475,12 @@
           <wp:inline distB="114300" distT="114300" distL="114300" distR="114300">
             <wp:extent cx="5943600" cy="3835400"/>
             <wp:effectExtent b="0" l="0" r="0" t="0"/>
-            <wp:docPr id="29" name="image39.png"/>
+            <wp:docPr id="35" name="image40.png"/>
             <a:graphic>
               <a:graphicData uri="http://schemas.openxmlformats.org/drawingml/2006/picture">
                 <pic:pic>
                   <pic:nvPicPr>
-                    <pic:cNvPr id="0" name="image39.png"/>
+                    <pic:cNvPr id="0" name="image40.png"/>
                     <pic:cNvPicPr preferRelativeResize="0"/>
                   </pic:nvPicPr>
                   <pic:blipFill>
@@ -2569,12 +2569,12 @@
           <wp:inline distB="114300" distT="114300" distL="114300" distR="114300">
             <wp:extent cx="5943600" cy="3492500"/>
             <wp:effectExtent b="0" l="0" r="0" t="0"/>
-            <wp:docPr id="23" name="image26.png"/>
+            <wp:docPr id="27" name="image31.png"/>
             <a:graphic>
               <a:graphicData uri="http://schemas.openxmlformats.org/drawingml/2006/picture">
                 <pic:pic>
                   <pic:nvPicPr>
-                    <pic:cNvPr id="0" name="image26.png"/>
+                    <pic:cNvPr id="0" name="image31.png"/>
                     <pic:cNvPicPr preferRelativeResize="0"/>
                   </pic:nvPicPr>
                   <pic:blipFill>
@@ -2644,12 +2644,12 @@
           <wp:inline distB="114300" distT="114300" distL="114300" distR="114300">
             <wp:extent cx="5943600" cy="3492500"/>
             <wp:effectExtent b="0" l="0" r="0" t="0"/>
-            <wp:docPr id="9" name="image20.png"/>
+            <wp:docPr id="11" name="image18.png"/>
             <a:graphic>
               <a:graphicData uri="http://schemas.openxmlformats.org/drawingml/2006/picture">
                 <pic:pic>
                   <pic:nvPicPr>
-                    <pic:cNvPr id="0" name="image20.png"/>
+                    <pic:cNvPr id="0" name="image18.png"/>
                     <pic:cNvPicPr preferRelativeResize="0"/>
                   </pic:nvPicPr>
                   <pic:blipFill>
@@ -2801,12 +2801,12 @@
           <wp:inline distB="114300" distT="114300" distL="114300" distR="114300">
             <wp:extent cx="4486275" cy="1600200"/>
             <wp:effectExtent b="0" l="0" r="0" t="0"/>
-            <wp:docPr id="13" name="image6.png"/>
+            <wp:docPr id="17" name="image4.png"/>
             <a:graphic>
               <a:graphicData uri="http://schemas.openxmlformats.org/drawingml/2006/picture">
                 <pic:pic>
                   <pic:nvPicPr>
-                    <pic:cNvPr id="0" name="image6.png"/>
+                    <pic:cNvPr id="0" name="image4.png"/>
                     <pic:cNvPicPr preferRelativeResize="0"/>
                   </pic:nvPicPr>
                   <pic:blipFill>
@@ -2862,12 +2862,12 @@
           <wp:inline distB="114300" distT="114300" distL="114300" distR="114300">
             <wp:extent cx="4333875" cy="971550"/>
             <wp:effectExtent b="0" l="0" r="0" t="0"/>
-            <wp:docPr id="34" name="image29.png"/>
+            <wp:docPr id="40" name="image28.png"/>
             <a:graphic>
               <a:graphicData uri="http://schemas.openxmlformats.org/drawingml/2006/picture">
                 <pic:pic>
                   <pic:nvPicPr>
-                    <pic:cNvPr id="0" name="image29.png"/>
+                    <pic:cNvPr id="0" name="image28.png"/>
                     <pic:cNvPicPr preferRelativeResize="0"/>
                   </pic:nvPicPr>
                   <pic:blipFill>
@@ -2924,7 +2924,7 @@
           <wp:inline distB="114300" distT="114300" distL="114300" distR="114300">
             <wp:extent cx="5424488" cy="1143000"/>
             <wp:effectExtent b="0" l="0" r="0" t="0"/>
-            <wp:docPr id="28" name="image25.png"/>
+            <wp:docPr id="34" name="image25.png"/>
             <a:graphic>
               <a:graphicData uri="http://schemas.openxmlformats.org/drawingml/2006/picture">
                 <pic:pic>
@@ -2986,12 +2986,12 @@
           <wp:inline distB="114300" distT="114300" distL="114300" distR="114300">
             <wp:extent cx="4914900" cy="1000125"/>
             <wp:effectExtent b="0" l="0" r="0" t="0"/>
-            <wp:docPr id="38" name="image30.png"/>
+            <wp:docPr id="44" name="image38.png"/>
             <a:graphic>
               <a:graphicData uri="http://schemas.openxmlformats.org/drawingml/2006/picture">
                 <pic:pic>
                   <pic:nvPicPr>
-                    <pic:cNvPr id="0" name="image30.png"/>
+                    <pic:cNvPr id="0" name="image38.png"/>
                     <pic:cNvPicPr preferRelativeResize="0"/>
                   </pic:nvPicPr>
                   <pic:blipFill>
@@ -3097,12 +3097,12 @@
           <wp:inline distB="114300" distT="114300" distL="114300" distR="114300">
             <wp:extent cx="4343400" cy="1066800"/>
             <wp:effectExtent b="0" l="0" r="0" t="0"/>
-            <wp:docPr id="26" name="image22.png"/>
+            <wp:docPr id="32" name="image32.png"/>
             <a:graphic>
               <a:graphicData uri="http://schemas.openxmlformats.org/drawingml/2006/picture">
                 <pic:pic>
                   <pic:nvPicPr>
-                    <pic:cNvPr id="0" name="image22.png"/>
+                    <pic:cNvPr id="0" name="image32.png"/>
                     <pic:cNvPicPr preferRelativeResize="0"/>
                   </pic:nvPicPr>
                   <pic:blipFill>
@@ -3158,12 +3158,12 @@
           <wp:inline distB="114300" distT="114300" distL="114300" distR="114300">
             <wp:extent cx="4981575" cy="1076325"/>
             <wp:effectExtent b="0" l="0" r="0" t="0"/>
-            <wp:docPr id="25" name="image24.png"/>
+            <wp:docPr id="30" name="image16.png"/>
             <a:graphic>
               <a:graphicData uri="http://schemas.openxmlformats.org/drawingml/2006/picture">
                 <pic:pic>
                   <pic:nvPicPr>
-                    <pic:cNvPr id="0" name="image24.png"/>
+                    <pic:cNvPr id="0" name="image16.png"/>
                     <pic:cNvPicPr preferRelativeResize="0"/>
                   </pic:nvPicPr>
                   <pic:blipFill>
@@ -3231,12 +3231,12 @@
           <wp:inline distB="114300" distT="114300" distL="114300" distR="114300">
             <wp:extent cx="2805113" cy="2577472"/>
             <wp:effectExtent b="0" l="0" r="0" t="0"/>
-            <wp:docPr id="37" name="image33.png"/>
+            <wp:docPr id="43" name="image34.png"/>
             <a:graphic>
               <a:graphicData uri="http://schemas.openxmlformats.org/drawingml/2006/picture">
                 <pic:pic>
                   <pic:nvPicPr>
-                    <pic:cNvPr id="0" name="image33.png"/>
+                    <pic:cNvPr id="0" name="image34.png"/>
                     <pic:cNvPicPr preferRelativeResize="0"/>
                   </pic:nvPicPr>
                   <pic:blipFill>
@@ -3291,12 +3291,12 @@
           <wp:inline distB="114300" distT="114300" distL="114300" distR="114300">
             <wp:extent cx="3162300" cy="1524000"/>
             <wp:effectExtent b="0" l="0" r="0" t="0"/>
-            <wp:docPr id="27" name="image12.png"/>
+            <wp:docPr id="33" name="image33.png"/>
             <a:graphic>
               <a:graphicData uri="http://schemas.openxmlformats.org/drawingml/2006/picture">
                 <pic:pic>
                   <pic:nvPicPr>
-                    <pic:cNvPr id="0" name="image12.png"/>
+                    <pic:cNvPr id="0" name="image33.png"/>
                     <pic:cNvPicPr preferRelativeResize="0"/>
                   </pic:nvPicPr>
                   <pic:blipFill>
@@ -3364,12 +3364,12 @@
           <wp:inline distB="114300" distT="114300" distL="114300" distR="114300">
             <wp:extent cx="4953000" cy="1143000"/>
             <wp:effectExtent b="0" l="0" r="0" t="0"/>
-            <wp:docPr id="22" name="image27.png"/>
+            <wp:docPr id="26" name="image11.png"/>
             <a:graphic>
               <a:graphicData uri="http://schemas.openxmlformats.org/drawingml/2006/picture">
                 <pic:pic>
                   <pic:nvPicPr>
-                    <pic:cNvPr id="0" name="image27.png"/>
+                    <pic:cNvPr id="0" name="image11.png"/>
                     <pic:cNvPicPr preferRelativeResize="0"/>
                   </pic:nvPicPr>
                   <pic:blipFill>
@@ -3439,12 +3439,12 @@
           <wp:inline distB="114300" distT="114300" distL="114300" distR="114300">
             <wp:extent cx="2733675" cy="1476375"/>
             <wp:effectExtent b="0" l="0" r="0" t="0"/>
-            <wp:docPr id="35" name="image31.png"/>
+            <wp:docPr id="41" name="image26.png"/>
             <a:graphic>
               <a:graphicData uri="http://schemas.openxmlformats.org/drawingml/2006/picture">
                 <pic:pic>
                   <pic:nvPicPr>
-                    <pic:cNvPr id="0" name="image31.png"/>
+                    <pic:cNvPr id="0" name="image26.png"/>
                     <pic:cNvPicPr preferRelativeResize="0"/>
                   </pic:nvPicPr>
                   <pic:blipFill>
@@ -3592,12 +3592,12 @@
           <wp:inline distB="114300" distT="114300" distL="114300" distR="114300">
             <wp:extent cx="5943600" cy="901700"/>
             <wp:effectExtent b="0" l="0" r="0" t="0"/>
-            <wp:docPr id="39" name="image35.png"/>
+            <wp:docPr id="46" name="image39.png"/>
             <a:graphic>
               <a:graphicData uri="http://schemas.openxmlformats.org/drawingml/2006/picture">
                 <pic:pic>
                   <pic:nvPicPr>
-                    <pic:cNvPr id="0" name="image35.png"/>
+                    <pic:cNvPr id="0" name="image39.png"/>
                     <pic:cNvPicPr preferRelativeResize="0"/>
                   </pic:nvPicPr>
                   <pic:blipFill>
@@ -3653,12 +3653,12 @@
           <wp:inline distB="114300" distT="114300" distL="114300" distR="114300">
             <wp:extent cx="5943600" cy="1968500"/>
             <wp:effectExtent b="0" l="0" r="0" t="0"/>
-            <wp:docPr id="32" name="image40.png"/>
+            <wp:docPr id="38" name="image42.png"/>
             <a:graphic>
               <a:graphicData uri="http://schemas.openxmlformats.org/drawingml/2006/picture">
                 <pic:pic>
                   <pic:nvPicPr>
-                    <pic:cNvPr id="0" name="image40.png"/>
+                    <pic:cNvPr id="0" name="image42.png"/>
                     <pic:cNvPicPr preferRelativeResize="0"/>
                   </pic:nvPicPr>
                   <pic:blipFill>
@@ -3741,12 +3741,12 @@
           <wp:inline distB="114300" distT="114300" distL="114300" distR="114300">
             <wp:extent cx="5943600" cy="2298700"/>
             <wp:effectExtent b="0" l="0" r="0" t="0"/>
-            <wp:docPr id="6" name="image32.png"/>
+            <wp:docPr id="7" name="image10.png"/>
             <a:graphic>
               <a:graphicData uri="http://schemas.openxmlformats.org/drawingml/2006/picture">
                 <pic:pic>
                   <pic:nvPicPr>
-                    <pic:cNvPr id="0" name="image32.png"/>
+                    <pic:cNvPr id="0" name="image10.png"/>
                     <pic:cNvPicPr preferRelativeResize="0"/>
                   </pic:nvPicPr>
                   <pic:blipFill>
@@ -3803,12 +3803,12 @@
           <wp:inline distB="114300" distT="114300" distL="114300" distR="114300">
             <wp:extent cx="5943600" cy="2552700"/>
             <wp:effectExtent b="0" l="0" r="0" t="0"/>
-            <wp:docPr id="43" name="image37.png"/>
+            <wp:docPr id="51" name="image48.png"/>
             <a:graphic>
               <a:graphicData uri="http://schemas.openxmlformats.org/drawingml/2006/picture">
                 <pic:pic>
                   <pic:nvPicPr>
-                    <pic:cNvPr id="0" name="image37.png"/>
+                    <pic:cNvPr id="0" name="image48.png"/>
                     <pic:cNvPicPr preferRelativeResize="0"/>
                   </pic:nvPicPr>
                   <pic:blipFill>
@@ -3869,12 +3869,12 @@
           <wp:inline distB="114300" distT="114300" distL="114300" distR="114300">
             <wp:extent cx="5943600" cy="4318000"/>
             <wp:effectExtent b="0" l="0" r="0" t="0"/>
-            <wp:docPr id="4" name="image14.png"/>
+            <wp:docPr id="5" name="image13.png"/>
             <a:graphic>
               <a:graphicData uri="http://schemas.openxmlformats.org/drawingml/2006/picture">
                 <pic:pic>
                   <pic:nvPicPr>
-                    <pic:cNvPr id="0" name="image14.png"/>
+                    <pic:cNvPr id="0" name="image13.png"/>
                     <pic:cNvPicPr preferRelativeResize="0"/>
                   </pic:nvPicPr>
                   <pic:blipFill>
@@ -4022,12 +4022,12 @@
           <wp:inline distB="114300" distT="114300" distL="114300" distR="114300">
             <wp:extent cx="5943600" cy="889000"/>
             <wp:effectExtent b="0" l="0" r="0" t="0"/>
-            <wp:docPr id="33" name="image36.png"/>
+            <wp:docPr id="39" name="image44.png"/>
             <a:graphic>
               <a:graphicData uri="http://schemas.openxmlformats.org/drawingml/2006/picture">
                 <pic:pic>
                   <pic:nvPicPr>
-                    <pic:cNvPr id="0" name="image36.png"/>
+                    <pic:cNvPr id="0" name="image44.png"/>
                     <pic:cNvPicPr preferRelativeResize="0"/>
                   </pic:nvPicPr>
                   <pic:blipFill>
@@ -4094,7 +4094,7 @@
         <w:rPr>
           <w:rtl w:val="0"/>
         </w:rPr>
-        <w:t xml:space="preserve">I know that since it is a NoSQL database, there is no fixed table schema and you can insert data with whatever fields you want. However, I applied a JSON Schema validator to the annotations collection to enforce some fields: country, year, metric and comment. There first three must be string and year is enforced to be an integer between 2023 and 2023. </w:t>
+        <w:t xml:space="preserve">I know that since it is a NoSQL database, there is no fixed table schema and you can insert data with whatever fields you want. However, I applied a JSON Schema validator to the annotations collection to enforce some fields: country, year, metric and comment. There first three must be string and year is enforced to be an integer between 2020 and 2023. </w:t>
       </w:r>
     </w:p>
     <w:p>
@@ -5599,12 +5599,12 @@
           <wp:inline distB="114300" distT="114300" distL="114300" distR="114300">
             <wp:extent cx="2543175" cy="4867275"/>
             <wp:effectExtent b="0" l="0" r="0" t="0"/>
-            <wp:docPr id="2" name="image13.png"/>
+            <wp:docPr id="3" name="image2.png"/>
             <a:graphic>
               <a:graphicData uri="http://schemas.openxmlformats.org/drawingml/2006/picture">
                 <pic:pic>
                   <pic:nvPicPr>
-                    <pic:cNvPr id="0" name="image13.png"/>
+                    <pic:cNvPr id="0" name="image2.png"/>
                     <pic:cNvPicPr preferRelativeResize="0"/>
                   </pic:nvPicPr>
                   <pic:blipFill>
@@ -5672,12 +5672,12 @@
           <wp:inline distB="114300" distT="114300" distL="114300" distR="114300">
             <wp:extent cx="3535159" cy="1471613"/>
             <wp:effectExtent b="0" l="0" r="0" t="0"/>
-            <wp:docPr id="46" name="image42.png"/>
+            <wp:docPr id="54" name="image52.png"/>
             <a:graphic>
               <a:graphicData uri="http://schemas.openxmlformats.org/drawingml/2006/picture">
                 <pic:pic>
                   <pic:nvPicPr>
-                    <pic:cNvPr id="0" name="image42.png"/>
+                    <pic:cNvPr id="0" name="image52.png"/>
                     <pic:cNvPicPr preferRelativeResize="0"/>
                   </pic:nvPicPr>
                   <pic:blipFill>
@@ -5792,7 +5792,7 @@
       <w:pPr>
         <w:numPr>
           <w:ilvl w:val="0"/>
-          <w:numId w:val="1"/>
+          <w:numId w:val="2"/>
         </w:numPr>
         <w:spacing w:after="0" w:afterAutospacing="0" w:line="276" w:lineRule="auto"/>
         <w:ind w:left="1440" w:hanging="360"/>
@@ -5811,7 +5811,7 @@
       <w:pPr>
         <w:numPr>
           <w:ilvl w:val="0"/>
-          <w:numId w:val="1"/>
+          <w:numId w:val="2"/>
         </w:numPr>
         <w:spacing w:after="0" w:afterAutospacing="0" w:line="276" w:lineRule="auto"/>
         <w:ind w:left="1440" w:hanging="360"/>
@@ -5830,7 +5830,7 @@
       <w:pPr>
         <w:numPr>
           <w:ilvl w:val="0"/>
-          <w:numId w:val="1"/>
+          <w:numId w:val="2"/>
         </w:numPr>
         <w:spacing w:after="0" w:afterAutospacing="0" w:line="276" w:lineRule="auto"/>
         <w:ind w:left="1440" w:hanging="360"/>
@@ -5849,7 +5849,7 @@
       <w:pPr>
         <w:numPr>
           <w:ilvl w:val="0"/>
-          <w:numId w:val="1"/>
+          <w:numId w:val="2"/>
         </w:numPr>
         <w:spacing w:after="140" w:line="276" w:lineRule="auto"/>
         <w:ind w:left="1440" w:hanging="360"/>
@@ -5887,12 +5887,12 @@
           <wp:inline distB="114300" distT="114300" distL="114300" distR="114300">
             <wp:extent cx="5943600" cy="1346200"/>
             <wp:effectExtent b="0" l="0" r="0" t="0"/>
-            <wp:docPr id="12" name="image15.png"/>
+            <wp:docPr id="15" name="image46.png"/>
             <a:graphic>
               <a:graphicData uri="http://schemas.openxmlformats.org/drawingml/2006/picture">
                 <pic:pic>
                   <pic:nvPicPr>
-                    <pic:cNvPr id="0" name="image15.png"/>
+                    <pic:cNvPr id="0" name="image46.png"/>
                     <pic:cNvPicPr preferRelativeResize="0"/>
                   </pic:nvPicPr>
                   <pic:blipFill>
@@ -5981,12 +5981,12 @@
           <wp:inline distB="114300" distT="114300" distL="114300" distR="114300">
             <wp:extent cx="5943600" cy="977900"/>
             <wp:effectExtent b="0" l="0" r="0" t="0"/>
-            <wp:docPr id="44" name="image38.png"/>
+            <wp:docPr id="52" name="image43.png"/>
             <a:graphic>
               <a:graphicData uri="http://schemas.openxmlformats.org/drawingml/2006/picture">
                 <pic:pic>
                   <pic:nvPicPr>
-                    <pic:cNvPr id="0" name="image38.png"/>
+                    <pic:cNvPr id="0" name="image43.png"/>
                     <pic:cNvPicPr preferRelativeResize="0"/>
                   </pic:nvPicPr>
                   <pic:blipFill>
@@ -6031,6 +6031,1715 @@
         <w:t xml:space="preserve">Picture 2.2.2 Indexes used in annotations collection</w:t>
       </w:r>
     </w:p>
+    <w:p>
+      <w:pPr>
+        <w:spacing w:after="140" w:line="276" w:lineRule="auto"/>
+        <w:rPr/>
+      </w:pPr>
+      <w:r>
+        <w:rPr>
+          <w:rtl w:val="0"/>
+        </w:rPr>
+      </w:r>
+    </w:p>
+    <w:p>
+      <w:pPr>
+        <w:spacing w:after="140" w:line="276" w:lineRule="auto"/>
+        <w:rPr/>
+      </w:pPr>
+      <w:r>
+        <w:rPr>
+          <w:rtl w:val="0"/>
+        </w:rPr>
+      </w:r>
+    </w:p>
+    <w:p>
+      <w:pPr>
+        <w:spacing w:after="140" w:line="276" w:lineRule="auto"/>
+        <w:rPr/>
+      </w:pPr>
+      <w:r>
+        <w:rPr>
+          <w:rtl w:val="0"/>
+        </w:rPr>
+      </w:r>
+    </w:p>
+    <w:p>
+      <w:pPr>
+        <w:spacing w:after="140" w:line="276" w:lineRule="auto"/>
+        <w:rPr/>
+      </w:pPr>
+      <w:r>
+        <w:rPr>
+          <w:rtl w:val="0"/>
+        </w:rPr>
+      </w:r>
+    </w:p>
+    <w:p>
+      <w:pPr>
+        <w:spacing w:after="140" w:line="276" w:lineRule="auto"/>
+        <w:rPr>
+          <w:sz w:val="32"/>
+          <w:szCs w:val="32"/>
+        </w:rPr>
+      </w:pPr>
+      <w:r>
+        <w:rPr>
+          <w:sz w:val="32"/>
+          <w:szCs w:val="32"/>
+          <w:rtl w:val="0"/>
+        </w:rPr>
+        <w:t xml:space="preserve">3. Building API</w:t>
+      </w:r>
+    </w:p>
+    <w:p>
+      <w:pPr>
+        <w:spacing w:after="140" w:line="276" w:lineRule="auto"/>
+        <w:rPr>
+          <w:sz w:val="28"/>
+          <w:szCs w:val="28"/>
+        </w:rPr>
+      </w:pPr>
+      <w:r>
+        <w:rPr>
+          <w:sz w:val="28"/>
+          <w:szCs w:val="28"/>
+          <w:rtl w:val="0"/>
+        </w:rPr>
+        <w:t xml:space="preserve">3.1 FastAPI setup and establishing SnowFlake connection</w:t>
+      </w:r>
+    </w:p>
+    <w:p>
+      <w:pPr>
+        <w:spacing w:after="140" w:line="276" w:lineRule="auto"/>
+        <w:rPr/>
+      </w:pPr>
+      <w:r>
+        <w:rPr>
+          <w:rtl w:val="0"/>
+        </w:rPr>
+        <w:t xml:space="preserve">For the purpose of developing an API I decided to use FastAPI since it is easy to use and automatically generates documentation that you can interact with. This API will serve us as an intermediate between user and Snowflake and MongoDB databases.</w:t>
+      </w:r>
+    </w:p>
+    <w:p>
+      <w:pPr>
+        <w:spacing w:after="140" w:line="276" w:lineRule="auto"/>
+        <w:rPr/>
+      </w:pPr>
+      <w:r>
+        <w:rPr>
+          <w:rtl w:val="0"/>
+        </w:rPr>
+        <w:t xml:space="preserve">To establish connection with Snowflake I used snowflake-connector-python package. All the credentials that I used for MongoDB and Snowflake are hidden in the .env file, so there won’t be any leakage when I push the code to github. So this API connects to the COVIID_ANALYTICS database inside of Snowflake and works with views stored on ANALYTICS schema.</w:t>
+      </w:r>
+    </w:p>
+    <w:p>
+      <w:pPr>
+        <w:spacing w:after="140" w:line="276" w:lineRule="auto"/>
+        <w:rPr/>
+      </w:pPr>
+      <w:r>
+        <w:rPr>
+          <w:rtl w:val="0"/>
+        </w:rPr>
+        <w:t xml:space="preserve">As the first endpoint that would allow me to know whether I successfully connected python to Snowflake is:</w:t>
+      </w:r>
+    </w:p>
+    <w:p>
+      <w:pPr>
+        <w:spacing w:after="140" w:line="276" w:lineRule="auto"/>
+        <w:ind w:left="2160" w:firstLine="720"/>
+        <w:rPr/>
+      </w:pPr>
+      <w:r>
+        <w:rPr>
+          <w:rtl w:val="0"/>
+        </w:rPr>
+        <w:t xml:space="preserve">GET  /covlid/{country}/{year}</w:t>
+      </w:r>
+    </w:p>
+    <w:p>
+      <w:pPr>
+        <w:spacing w:after="140" w:line="276" w:lineRule="auto"/>
+        <w:ind w:left="0" w:firstLine="0"/>
+        <w:rPr/>
+      </w:pPr>
+      <w:r>
+        <w:rPr>
+          <w:rtl w:val="0"/>
+        </w:rPr>
+        <w:t xml:space="preserve">It, basically speaking, returns a single country row with associated year from COVID_DEMOGRAPHICS_ANALYTICS view in a JSON format. On the picture 3.1.2 you can see the example of response from this endpoint.</w:t>
+      </w:r>
+    </w:p>
+    <w:p>
+      <w:pPr>
+        <w:spacing w:after="140" w:line="276" w:lineRule="auto"/>
+        <w:ind w:left="0" w:firstLine="0"/>
+        <w:rPr/>
+      </w:pPr>
+      <w:r>
+        <w:rPr>
+          <w:rtl w:val="0"/>
+        </w:rPr>
+      </w:r>
+    </w:p>
+    <w:p>
+      <w:pPr>
+        <w:spacing w:after="140" w:line="276" w:lineRule="auto"/>
+        <w:ind w:left="0" w:firstLine="0"/>
+        <w:rPr/>
+      </w:pPr>
+      <w:r>
+        <w:rPr/>
+        <w:drawing>
+          <wp:inline distB="114300" distT="114300" distL="114300" distR="114300">
+            <wp:extent cx="5943600" cy="2286000"/>
+            <wp:effectExtent b="0" l="0" r="0" t="0"/>
+            <wp:docPr id="49" name="image41.png"/>
+            <a:graphic>
+              <a:graphicData uri="http://schemas.openxmlformats.org/drawingml/2006/picture">
+                <pic:pic>
+                  <pic:nvPicPr>
+                    <pic:cNvPr id="0" name="image41.png"/>
+                    <pic:cNvPicPr preferRelativeResize="0"/>
+                  </pic:nvPicPr>
+                  <pic:blipFill>
+                    <a:blip r:embed="rId53"/>
+                    <a:srcRect b="0" l="0" r="0" t="0"/>
+                    <a:stretch>
+                      <a:fillRect/>
+                    </a:stretch>
+                  </pic:blipFill>
+                  <pic:spPr>
+                    <a:xfrm>
+                      <a:off x="0" y="0"/>
+                      <a:ext cx="5943600" cy="2286000"/>
+                    </a:xfrm>
+                    <a:prstGeom prst="rect"/>
+                    <a:ln/>
+                  </pic:spPr>
+                </pic:pic>
+              </a:graphicData>
+            </a:graphic>
+          </wp:inline>
+        </w:drawing>
+      </w:r>
+      <w:r>
+        <w:rPr>
+          <w:rtl w:val="0"/>
+        </w:rPr>
+      </w:r>
+    </w:p>
+    <w:p>
+      <w:pPr>
+        <w:spacing w:after="140" w:line="276" w:lineRule="auto"/>
+        <w:ind w:left="0" w:firstLine="0"/>
+        <w:rPr/>
+      </w:pPr>
+      <w:r>
+        <w:rPr>
+          <w:rtl w:val="0"/>
+        </w:rPr>
+        <w:tab/>
+        <w:tab/>
+        <w:t xml:space="preserve">Picture 3.1.1 Example of input to the mentioned Snowflake endpoint</w:t>
+      </w:r>
+    </w:p>
+    <w:p>
+      <w:pPr>
+        <w:spacing w:after="140" w:line="276" w:lineRule="auto"/>
+        <w:ind w:left="720" w:firstLine="720"/>
+        <w:rPr/>
+      </w:pPr>
+      <w:r>
+        <w:rPr/>
+        <w:drawing>
+          <wp:inline distB="114300" distT="114300" distL="114300" distR="114300">
+            <wp:extent cx="4333875" cy="3257550"/>
+            <wp:effectExtent b="0" l="0" r="0" t="0"/>
+            <wp:docPr id="31" name="image22.png"/>
+            <a:graphic>
+              <a:graphicData uri="http://schemas.openxmlformats.org/drawingml/2006/picture">
+                <pic:pic>
+                  <pic:nvPicPr>
+                    <pic:cNvPr id="0" name="image22.png"/>
+                    <pic:cNvPicPr preferRelativeResize="0"/>
+                  </pic:nvPicPr>
+                  <pic:blipFill>
+                    <a:blip r:embed="rId54"/>
+                    <a:srcRect b="0" l="0" r="0" t="0"/>
+                    <a:stretch>
+                      <a:fillRect/>
+                    </a:stretch>
+                  </pic:blipFill>
+                  <pic:spPr>
+                    <a:xfrm>
+                      <a:off x="0" y="0"/>
+                      <a:ext cx="4333875" cy="3257550"/>
+                    </a:xfrm>
+                    <a:prstGeom prst="rect"/>
+                    <a:ln/>
+                  </pic:spPr>
+                </pic:pic>
+              </a:graphicData>
+            </a:graphic>
+          </wp:inline>
+        </w:drawing>
+      </w:r>
+      <w:r>
+        <w:rPr>
+          <w:rtl w:val="0"/>
+        </w:rPr>
+      </w:r>
+    </w:p>
+    <w:p>
+      <w:pPr>
+        <w:spacing w:after="140" w:line="276" w:lineRule="auto"/>
+        <w:ind w:left="1440" w:firstLine="0"/>
+        <w:rPr/>
+      </w:pPr>
+      <w:r>
+        <w:rPr>
+          <w:rtl w:val="0"/>
+        </w:rPr>
+        <w:t xml:space="preserve">  Picture 3.1.2 COVID-19 analytical data returned from Snowflake via FastAPI</w:t>
+      </w:r>
+    </w:p>
+    <w:p>
+      <w:pPr>
+        <w:spacing w:after="140" w:line="276" w:lineRule="auto"/>
+        <w:ind w:left="1440" w:firstLine="0"/>
+        <w:rPr/>
+      </w:pPr>
+      <w:r>
+        <w:rPr>
+          <w:rtl w:val="0"/>
+        </w:rPr>
+      </w:r>
+    </w:p>
+    <w:p>
+      <w:pPr>
+        <w:spacing w:after="140" w:line="276" w:lineRule="auto"/>
+        <w:rPr/>
+      </w:pPr>
+      <w:r>
+        <w:rPr>
+          <w:sz w:val="28"/>
+          <w:szCs w:val="28"/>
+          <w:rtl w:val="0"/>
+        </w:rPr>
+        <w:t xml:space="preserve">3.2 MongoDB integration</w:t>
+      </w:r>
+      <w:r>
+        <w:rPr>
+          <w:rtl w:val="0"/>
+        </w:rPr>
+      </w:r>
+    </w:p>
+    <w:p>
+      <w:pPr>
+        <w:spacing w:after="140" w:line="276" w:lineRule="auto"/>
+        <w:ind w:left="0" w:firstLine="0"/>
+        <w:rPr/>
+      </w:pPr>
+      <w:r>
+        <w:rPr>
+          <w:rtl w:val="0"/>
+        </w:rPr>
+        <w:t xml:space="preserve">FastAPI was also connected to MongoDB annotations collection. API endpoints call recently created PyMongo CRUD functions. You can see all available endpoints for MongoDB on the Picture 3.2.1:</w:t>
+      </w:r>
+    </w:p>
+    <w:p>
+      <w:pPr>
+        <w:spacing w:after="140" w:line="276" w:lineRule="auto"/>
+        <w:ind w:left="0" w:firstLine="0"/>
+        <w:rPr/>
+      </w:pPr>
+      <w:r>
+        <w:rPr>
+          <w:rtl w:val="0"/>
+        </w:rPr>
+      </w:r>
+    </w:p>
+    <w:p>
+      <w:pPr>
+        <w:spacing w:after="140" w:line="276" w:lineRule="auto"/>
+        <w:ind w:left="0" w:firstLine="0"/>
+        <w:rPr/>
+      </w:pPr>
+      <w:r>
+        <w:rPr/>
+        <w:drawing>
+          <wp:inline distB="114300" distT="114300" distL="114300" distR="114300">
+            <wp:extent cx="5943600" cy="1625600"/>
+            <wp:effectExtent b="0" l="0" r="0" t="0"/>
+            <wp:docPr id="45" name="image47.png"/>
+            <a:graphic>
+              <a:graphicData uri="http://schemas.openxmlformats.org/drawingml/2006/picture">
+                <pic:pic>
+                  <pic:nvPicPr>
+                    <pic:cNvPr id="0" name="image47.png"/>
+                    <pic:cNvPicPr preferRelativeResize="0"/>
+                  </pic:nvPicPr>
+                  <pic:blipFill>
+                    <a:blip r:embed="rId55"/>
+                    <a:srcRect b="0" l="0" r="0" t="0"/>
+                    <a:stretch>
+                      <a:fillRect/>
+                    </a:stretch>
+                  </pic:blipFill>
+                  <pic:spPr>
+                    <a:xfrm>
+                      <a:off x="0" y="0"/>
+                      <a:ext cx="5943600" cy="1625600"/>
+                    </a:xfrm>
+                    <a:prstGeom prst="rect"/>
+                    <a:ln/>
+                  </pic:spPr>
+                </pic:pic>
+              </a:graphicData>
+            </a:graphic>
+          </wp:inline>
+        </w:drawing>
+      </w:r>
+      <w:r>
+        <w:rPr>
+          <w:rtl w:val="0"/>
+        </w:rPr>
+      </w:r>
+    </w:p>
+    <w:p>
+      <w:pPr>
+        <w:spacing w:after="140" w:line="276" w:lineRule="auto"/>
+        <w:ind w:left="0" w:firstLine="0"/>
+        <w:rPr/>
+      </w:pPr>
+      <w:r>
+        <w:rPr>
+          <w:rtl w:val="0"/>
+        </w:rPr>
+        <w:tab/>
+        <w:tab/>
+        <w:tab/>
+        <w:t xml:space="preserve">Picture 3.2.1 Annotation endpoints available via FastAPI</w:t>
+      </w:r>
+    </w:p>
+    <w:p>
+      <w:pPr>
+        <w:spacing w:after="140" w:line="276" w:lineRule="auto"/>
+        <w:ind w:left="0" w:firstLine="0"/>
+        <w:rPr/>
+      </w:pPr>
+      <w:r>
+        <w:rPr>
+          <w:rtl w:val="0"/>
+        </w:rPr>
+      </w:r>
+    </w:p>
+    <w:p>
+      <w:pPr>
+        <w:spacing w:after="140" w:line="276" w:lineRule="auto"/>
+        <w:ind w:left="0" w:firstLine="0"/>
+        <w:rPr/>
+      </w:pPr>
+      <w:r>
+        <w:rPr/>
+        <w:drawing>
+          <wp:inline distB="114300" distT="114300" distL="114300" distR="114300">
+            <wp:extent cx="5943600" cy="1333500"/>
+            <wp:effectExtent b="0" l="0" r="0" t="0"/>
+            <wp:docPr id="12" name="image12.png"/>
+            <a:graphic>
+              <a:graphicData uri="http://schemas.openxmlformats.org/drawingml/2006/picture">
+                <pic:pic>
+                  <pic:nvPicPr>
+                    <pic:cNvPr id="0" name="image12.png"/>
+                    <pic:cNvPicPr preferRelativeResize="0"/>
+                  </pic:nvPicPr>
+                  <pic:blipFill>
+                    <a:blip r:embed="rId56"/>
+                    <a:srcRect b="0" l="0" r="0" t="0"/>
+                    <a:stretch>
+                      <a:fillRect/>
+                    </a:stretch>
+                  </pic:blipFill>
+                  <pic:spPr>
+                    <a:xfrm>
+                      <a:off x="0" y="0"/>
+                      <a:ext cx="5943600" cy="1333500"/>
+                    </a:xfrm>
+                    <a:prstGeom prst="rect"/>
+                    <a:ln/>
+                  </pic:spPr>
+                </pic:pic>
+              </a:graphicData>
+            </a:graphic>
+          </wp:inline>
+        </w:drawing>
+      </w:r>
+      <w:r>
+        <w:rPr>
+          <w:rtl w:val="0"/>
+        </w:rPr>
+      </w:r>
+    </w:p>
+    <w:p>
+      <w:pPr>
+        <w:spacing w:after="140" w:line="276" w:lineRule="auto"/>
+        <w:ind w:left="0" w:firstLine="0"/>
+        <w:rPr/>
+      </w:pPr>
+      <w:r>
+        <w:rPr>
+          <w:rtl w:val="0"/>
+        </w:rPr>
+        <w:tab/>
+        <w:tab/>
+        <w:tab/>
+        <w:tab/>
+        <w:t xml:space="preserve">    Picture 3.2.2 Annotation was created via FastAPI</w:t>
+      </w:r>
+    </w:p>
+    <w:p>
+      <w:pPr>
+        <w:spacing w:after="140" w:line="276" w:lineRule="auto"/>
+        <w:ind w:left="0" w:firstLine="0"/>
+        <w:rPr/>
+      </w:pPr>
+      <w:r>
+        <w:rPr/>
+        <w:drawing>
+          <wp:inline distB="114300" distT="114300" distL="114300" distR="114300">
+            <wp:extent cx="5943600" cy="2413000"/>
+            <wp:effectExtent b="0" l="0" r="0" t="0"/>
+            <wp:docPr id="16" name="image7.png"/>
+            <a:graphic>
+              <a:graphicData uri="http://schemas.openxmlformats.org/drawingml/2006/picture">
+                <pic:pic>
+                  <pic:nvPicPr>
+                    <pic:cNvPr id="0" name="image7.png"/>
+                    <pic:cNvPicPr preferRelativeResize="0"/>
+                  </pic:nvPicPr>
+                  <pic:blipFill>
+                    <a:blip r:embed="rId57"/>
+                    <a:srcRect b="0" l="0" r="0" t="0"/>
+                    <a:stretch>
+                      <a:fillRect/>
+                    </a:stretch>
+                  </pic:blipFill>
+                  <pic:spPr>
+                    <a:xfrm>
+                      <a:off x="0" y="0"/>
+                      <a:ext cx="5943600" cy="2413000"/>
+                    </a:xfrm>
+                    <a:prstGeom prst="rect"/>
+                    <a:ln/>
+                  </pic:spPr>
+                </pic:pic>
+              </a:graphicData>
+            </a:graphic>
+          </wp:inline>
+        </w:drawing>
+      </w:r>
+      <w:r>
+        <w:rPr>
+          <w:rtl w:val="0"/>
+        </w:rPr>
+      </w:r>
+    </w:p>
+    <w:p>
+      <w:pPr>
+        <w:spacing w:after="140" w:line="276" w:lineRule="auto"/>
+        <w:ind w:left="0" w:firstLine="0"/>
+        <w:rPr/>
+      </w:pPr>
+      <w:r>
+        <w:rPr>
+          <w:rtl w:val="0"/>
+        </w:rPr>
+        <w:tab/>
+        <w:tab/>
+        <w:tab/>
+        <w:t xml:space="preserve">Picture 3.2.3 Example of annotation being retrieved via FastAPI</w:t>
+      </w:r>
+    </w:p>
+    <w:p>
+      <w:pPr>
+        <w:spacing w:after="140" w:line="276" w:lineRule="auto"/>
+        <w:ind w:left="0" w:firstLine="0"/>
+        <w:rPr/>
+      </w:pPr>
+      <w:r>
+        <w:rPr>
+          <w:rtl w:val="0"/>
+        </w:rPr>
+      </w:r>
+    </w:p>
+    <w:p>
+      <w:pPr>
+        <w:spacing w:after="140" w:line="276" w:lineRule="auto"/>
+        <w:rPr>
+          <w:sz w:val="28"/>
+          <w:szCs w:val="28"/>
+        </w:rPr>
+      </w:pPr>
+      <w:r>
+        <w:rPr>
+          <w:sz w:val="28"/>
+          <w:szCs w:val="28"/>
+          <w:rtl w:val="0"/>
+        </w:rPr>
+        <w:t xml:space="preserve">3.3 Additional analytical endpoints</w:t>
+      </w:r>
+    </w:p>
+    <w:p>
+      <w:pPr>
+        <w:spacing w:after="140" w:line="276" w:lineRule="auto"/>
+        <w:ind w:left="0" w:firstLine="0"/>
+        <w:rPr/>
+      </w:pPr>
+      <w:r>
+        <w:rPr>
+          <w:rtl w:val="0"/>
+        </w:rPr>
+        <w:t xml:space="preserve">After I managed to verify that the connection between FastAPI and Snowflake works, I decided to expand The API with some analytical endpoints. These endpoints present the main analytical results that have already been prepared beforehand COVID_DEMOGRAPHIC_ANALYSIS view and it would allow more interesting and interactive visualization.</w:t>
+      </w:r>
+    </w:p>
+    <w:p>
+      <w:pPr>
+        <w:spacing w:after="140" w:line="276" w:lineRule="auto"/>
+        <w:ind w:left="0" w:firstLine="0"/>
+        <w:rPr/>
+      </w:pPr>
+      <w:r>
+        <w:rPr>
+          <w:rtl w:val="0"/>
+        </w:rPr>
+      </w:r>
+    </w:p>
+    <w:tbl>
+      <w:tblPr>
+        <w:tblStyle w:val="Table2"/>
+        <w:tblW w:w="9360.0" w:type="dxa"/>
+        <w:jc w:val="left"/>
+        <w:tblBorders>
+          <w:top w:color="000000" w:space="0" w:sz="8" w:val="single"/>
+          <w:left w:color="000000" w:space="0" w:sz="8" w:val="single"/>
+          <w:bottom w:color="000000" w:space="0" w:sz="8" w:val="single"/>
+          <w:right w:color="000000" w:space="0" w:sz="8" w:val="single"/>
+          <w:insideH w:color="000000" w:space="0" w:sz="8" w:val="single"/>
+          <w:insideV w:color="000000" w:space="0" w:sz="8" w:val="single"/>
+        </w:tblBorders>
+        <w:tblLayout w:type="fixed"/>
+        <w:tblLook w:val="0600"/>
+      </w:tblPr>
+      <w:tblGrid>
+        <w:gridCol w:w="4680"/>
+        <w:gridCol w:w="4680"/>
+        <w:tblGridChange w:id="0">
+          <w:tblGrid>
+            <w:gridCol w:w="4680"/>
+            <w:gridCol w:w="4680"/>
+          </w:tblGrid>
+        </w:tblGridChange>
+      </w:tblGrid>
+      <w:tr>
+        <w:trPr>
+          <w:cantSplit w:val="0"/>
+          <w:tblHeader w:val="0"/>
+        </w:trPr>
+        <w:tc>
+          <w:tcPr>
+            <w:shd w:fill="auto" w:val="clear"/>
+            <w:tcMar>
+              <w:top w:w="100.0" w:type="dxa"/>
+              <w:left w:w="100.0" w:type="dxa"/>
+              <w:bottom w:w="100.0" w:type="dxa"/>
+              <w:right w:w="100.0" w:type="dxa"/>
+            </w:tcMar>
+            <w:vAlign w:val="top"/>
+          </w:tcPr>
+          <w:p>
+            <w:pPr>
+              <w:keepNext w:val="0"/>
+              <w:keepLines w:val="0"/>
+              <w:pageBreakBefore w:val="0"/>
+              <w:widowControl w:val="0"/>
+              <w:pBdr>
+                <w:top w:space="0" w:sz="0" w:val="nil"/>
+                <w:left w:space="0" w:sz="0" w:val="nil"/>
+                <w:bottom w:space="0" w:sz="0" w:val="nil"/>
+                <w:right w:space="0" w:sz="0" w:val="nil"/>
+                <w:between w:space="0" w:sz="0" w:val="nil"/>
+              </w:pBdr>
+              <w:shd w:fill="auto" w:val="clear"/>
+              <w:spacing w:after="0" w:before="0" w:line="240" w:lineRule="auto"/>
+              <w:ind w:left="0" w:right="0" w:firstLine="0"/>
+              <w:jc w:val="left"/>
+              <w:rPr/>
+            </w:pPr>
+            <w:r>
+              <w:rPr>
+                <w:rtl w:val="0"/>
+              </w:rPr>
+              <w:t xml:space="preserve">Endpoint</w:t>
+            </w:r>
+          </w:p>
+        </w:tc>
+        <w:tc>
+          <w:tcPr>
+            <w:shd w:fill="auto" w:val="clear"/>
+            <w:tcMar>
+              <w:top w:w="100.0" w:type="dxa"/>
+              <w:left w:w="100.0" w:type="dxa"/>
+              <w:bottom w:w="100.0" w:type="dxa"/>
+              <w:right w:w="100.0" w:type="dxa"/>
+            </w:tcMar>
+            <w:vAlign w:val="top"/>
+          </w:tcPr>
+          <w:p>
+            <w:pPr>
+              <w:keepNext w:val="0"/>
+              <w:keepLines w:val="0"/>
+              <w:pageBreakBefore w:val="0"/>
+              <w:widowControl w:val="0"/>
+              <w:pBdr>
+                <w:top w:space="0" w:sz="0" w:val="nil"/>
+                <w:left w:space="0" w:sz="0" w:val="nil"/>
+                <w:bottom w:space="0" w:sz="0" w:val="nil"/>
+                <w:right w:space="0" w:sz="0" w:val="nil"/>
+                <w:between w:space="0" w:sz="0" w:val="nil"/>
+              </w:pBdr>
+              <w:shd w:fill="auto" w:val="clear"/>
+              <w:spacing w:after="0" w:before="0" w:line="240" w:lineRule="auto"/>
+              <w:ind w:left="0" w:right="0" w:firstLine="0"/>
+              <w:jc w:val="left"/>
+              <w:rPr/>
+            </w:pPr>
+            <w:r>
+              <w:rPr>
+                <w:rtl w:val="0"/>
+              </w:rPr>
+              <w:t xml:space="preserve">What it returns</w:t>
+            </w:r>
+          </w:p>
+        </w:tc>
+      </w:tr>
+      <w:tr>
+        <w:trPr>
+          <w:cantSplit w:val="0"/>
+          <w:tblHeader w:val="0"/>
+        </w:trPr>
+        <w:tc>
+          <w:tcPr>
+            <w:shd w:fill="auto" w:val="clear"/>
+            <w:tcMar>
+              <w:top w:w="100.0" w:type="dxa"/>
+              <w:left w:w="100.0" w:type="dxa"/>
+              <w:bottom w:w="100.0" w:type="dxa"/>
+              <w:right w:w="100.0" w:type="dxa"/>
+            </w:tcMar>
+            <w:vAlign w:val="top"/>
+          </w:tcPr>
+          <w:p>
+            <w:pPr>
+              <w:keepNext w:val="0"/>
+              <w:keepLines w:val="0"/>
+              <w:pageBreakBefore w:val="0"/>
+              <w:widowControl w:val="0"/>
+              <w:pBdr>
+                <w:top w:space="0" w:sz="0" w:val="nil"/>
+                <w:left w:space="0" w:sz="0" w:val="nil"/>
+                <w:bottom w:space="0" w:sz="0" w:val="nil"/>
+                <w:right w:space="0" w:sz="0" w:val="nil"/>
+                <w:between w:space="0" w:sz="0" w:val="nil"/>
+              </w:pBdr>
+              <w:shd w:fill="auto" w:val="clear"/>
+              <w:spacing w:after="0" w:before="0" w:line="240" w:lineRule="auto"/>
+              <w:ind w:left="0" w:right="0" w:firstLine="0"/>
+              <w:jc w:val="left"/>
+              <w:rPr/>
+            </w:pPr>
+            <w:r>
+              <w:rPr>
+                <w:rtl w:val="0"/>
+              </w:rPr>
+              <w:t xml:space="preserve">GET /covid/{country}</w:t>
+            </w:r>
+          </w:p>
+        </w:tc>
+        <w:tc>
+          <w:tcPr>
+            <w:shd w:fill="auto" w:val="clear"/>
+            <w:tcMar>
+              <w:top w:w="100.0" w:type="dxa"/>
+              <w:left w:w="100.0" w:type="dxa"/>
+              <w:bottom w:w="100.0" w:type="dxa"/>
+              <w:right w:w="100.0" w:type="dxa"/>
+            </w:tcMar>
+            <w:vAlign w:val="top"/>
+          </w:tcPr>
+          <w:p>
+            <w:pPr>
+              <w:keepNext w:val="0"/>
+              <w:keepLines w:val="0"/>
+              <w:pageBreakBefore w:val="0"/>
+              <w:widowControl w:val="0"/>
+              <w:pBdr>
+                <w:top w:space="0" w:sz="0" w:val="nil"/>
+                <w:left w:space="0" w:sz="0" w:val="nil"/>
+                <w:bottom w:space="0" w:sz="0" w:val="nil"/>
+                <w:right w:space="0" w:sz="0" w:val="nil"/>
+                <w:between w:space="0" w:sz="0" w:val="nil"/>
+              </w:pBdr>
+              <w:shd w:fill="auto" w:val="clear"/>
+              <w:spacing w:after="0" w:before="0" w:line="240" w:lineRule="auto"/>
+              <w:ind w:left="0" w:right="0" w:firstLine="0"/>
+              <w:jc w:val="left"/>
+              <w:rPr/>
+            </w:pPr>
+            <w:r>
+              <w:rPr>
+                <w:rtl w:val="0"/>
+              </w:rPr>
+              <w:t xml:space="preserve">Returns all yearly records related to country</w:t>
+            </w:r>
+          </w:p>
+        </w:tc>
+      </w:tr>
+      <w:tr>
+        <w:trPr>
+          <w:cantSplit w:val="0"/>
+          <w:tblHeader w:val="0"/>
+        </w:trPr>
+        <w:tc>
+          <w:tcPr>
+            <w:shd w:fill="auto" w:val="clear"/>
+            <w:tcMar>
+              <w:top w:w="100.0" w:type="dxa"/>
+              <w:left w:w="100.0" w:type="dxa"/>
+              <w:bottom w:w="100.0" w:type="dxa"/>
+              <w:right w:w="100.0" w:type="dxa"/>
+            </w:tcMar>
+            <w:vAlign w:val="top"/>
+          </w:tcPr>
+          <w:p>
+            <w:pPr>
+              <w:keepNext w:val="0"/>
+              <w:keepLines w:val="0"/>
+              <w:pageBreakBefore w:val="0"/>
+              <w:widowControl w:val="0"/>
+              <w:pBdr>
+                <w:top w:space="0" w:sz="0" w:val="nil"/>
+                <w:left w:space="0" w:sz="0" w:val="nil"/>
+                <w:bottom w:space="0" w:sz="0" w:val="nil"/>
+                <w:right w:space="0" w:sz="0" w:val="nil"/>
+                <w:between w:space="0" w:sz="0" w:val="nil"/>
+              </w:pBdr>
+              <w:shd w:fill="auto" w:val="clear"/>
+              <w:spacing w:after="0" w:before="0" w:line="240" w:lineRule="auto"/>
+              <w:ind w:left="0" w:right="0" w:firstLine="0"/>
+              <w:jc w:val="left"/>
+              <w:rPr/>
+            </w:pPr>
+            <w:r>
+              <w:rPr>
+                <w:rtl w:val="0"/>
+              </w:rPr>
+              <w:t xml:space="preserve">GET /covid/{country}/{year} </w:t>
+            </w:r>
+          </w:p>
+        </w:tc>
+        <w:tc>
+          <w:tcPr>
+            <w:shd w:fill="auto" w:val="clear"/>
+            <w:tcMar>
+              <w:top w:w="100.0" w:type="dxa"/>
+              <w:left w:w="100.0" w:type="dxa"/>
+              <w:bottom w:w="100.0" w:type="dxa"/>
+              <w:right w:w="100.0" w:type="dxa"/>
+            </w:tcMar>
+            <w:vAlign w:val="top"/>
+          </w:tcPr>
+          <w:p>
+            <w:pPr>
+              <w:keepNext w:val="0"/>
+              <w:keepLines w:val="0"/>
+              <w:pageBreakBefore w:val="0"/>
+              <w:widowControl w:val="0"/>
+              <w:pBdr>
+                <w:top w:space="0" w:sz="0" w:val="nil"/>
+                <w:left w:space="0" w:sz="0" w:val="nil"/>
+                <w:bottom w:space="0" w:sz="0" w:val="nil"/>
+                <w:right w:space="0" w:sz="0" w:val="nil"/>
+                <w:between w:space="0" w:sz="0" w:val="nil"/>
+              </w:pBdr>
+              <w:shd w:fill="auto" w:val="clear"/>
+              <w:spacing w:after="0" w:before="0" w:line="240" w:lineRule="auto"/>
+              <w:ind w:left="0" w:right="0" w:firstLine="0"/>
+              <w:jc w:val="left"/>
+              <w:rPr/>
+            </w:pPr>
+            <w:r>
+              <w:rPr>
+                <w:rtl w:val="0"/>
+              </w:rPr>
+              <w:t xml:space="preserve">Returns COIVD-19 and demographics data for a specific country and year</w:t>
+            </w:r>
+          </w:p>
+        </w:tc>
+      </w:tr>
+      <w:tr>
+        <w:trPr>
+          <w:cantSplit w:val="0"/>
+          <w:tblHeader w:val="0"/>
+        </w:trPr>
+        <w:tc>
+          <w:tcPr>
+            <w:shd w:fill="auto" w:val="clear"/>
+            <w:tcMar>
+              <w:top w:w="100.0" w:type="dxa"/>
+              <w:left w:w="100.0" w:type="dxa"/>
+              <w:bottom w:w="100.0" w:type="dxa"/>
+              <w:right w:w="100.0" w:type="dxa"/>
+            </w:tcMar>
+            <w:vAlign w:val="top"/>
+          </w:tcPr>
+          <w:p>
+            <w:pPr>
+              <w:keepNext w:val="0"/>
+              <w:keepLines w:val="0"/>
+              <w:pageBreakBefore w:val="0"/>
+              <w:widowControl w:val="0"/>
+              <w:pBdr>
+                <w:top w:space="0" w:sz="0" w:val="nil"/>
+                <w:left w:space="0" w:sz="0" w:val="nil"/>
+                <w:bottom w:space="0" w:sz="0" w:val="nil"/>
+                <w:right w:space="0" w:sz="0" w:val="nil"/>
+                <w:between w:space="0" w:sz="0" w:val="nil"/>
+              </w:pBdr>
+              <w:shd w:fill="auto" w:val="clear"/>
+              <w:spacing w:after="0" w:before="0" w:line="240" w:lineRule="auto"/>
+              <w:ind w:left="0" w:right="0" w:firstLine="0"/>
+              <w:jc w:val="left"/>
+              <w:rPr/>
+            </w:pPr>
+            <w:r>
+              <w:rPr>
+                <w:rtl w:val="0"/>
+              </w:rPr>
+              <w:t xml:space="preserve">GET /covid/top/cases/{year}</w:t>
+            </w:r>
+          </w:p>
+        </w:tc>
+        <w:tc>
+          <w:tcPr>
+            <w:shd w:fill="auto" w:val="clear"/>
+            <w:tcMar>
+              <w:top w:w="100.0" w:type="dxa"/>
+              <w:left w:w="100.0" w:type="dxa"/>
+              <w:bottom w:w="100.0" w:type="dxa"/>
+              <w:right w:w="100.0" w:type="dxa"/>
+            </w:tcMar>
+            <w:vAlign w:val="top"/>
+          </w:tcPr>
+          <w:p>
+            <w:pPr>
+              <w:keepNext w:val="0"/>
+              <w:keepLines w:val="0"/>
+              <w:pageBreakBefore w:val="0"/>
+              <w:widowControl w:val="0"/>
+              <w:pBdr>
+                <w:top w:space="0" w:sz="0" w:val="nil"/>
+                <w:left w:space="0" w:sz="0" w:val="nil"/>
+                <w:bottom w:space="0" w:sz="0" w:val="nil"/>
+                <w:right w:space="0" w:sz="0" w:val="nil"/>
+                <w:between w:space="0" w:sz="0" w:val="nil"/>
+              </w:pBdr>
+              <w:shd w:fill="auto" w:val="clear"/>
+              <w:spacing w:after="0" w:before="0" w:line="240" w:lineRule="auto"/>
+              <w:ind w:left="0" w:right="0" w:firstLine="0"/>
+              <w:jc w:val="left"/>
+              <w:rPr/>
+            </w:pPr>
+            <w:r>
+              <w:rPr>
+                <w:rtl w:val="0"/>
+              </w:rPr>
+              <w:t xml:space="preserve">Returns countries with the highest cases per 100000 people</w:t>
+            </w:r>
+          </w:p>
+        </w:tc>
+      </w:tr>
+      <w:tr>
+        <w:trPr>
+          <w:cantSplit w:val="0"/>
+          <w:tblHeader w:val="0"/>
+        </w:trPr>
+        <w:tc>
+          <w:tcPr>
+            <w:shd w:fill="auto" w:val="clear"/>
+            <w:tcMar>
+              <w:top w:w="100.0" w:type="dxa"/>
+              <w:left w:w="100.0" w:type="dxa"/>
+              <w:bottom w:w="100.0" w:type="dxa"/>
+              <w:right w:w="100.0" w:type="dxa"/>
+            </w:tcMar>
+            <w:vAlign w:val="top"/>
+          </w:tcPr>
+          <w:p>
+            <w:pPr>
+              <w:keepNext w:val="0"/>
+              <w:keepLines w:val="0"/>
+              <w:pageBreakBefore w:val="0"/>
+              <w:widowControl w:val="0"/>
+              <w:pBdr>
+                <w:top w:space="0" w:sz="0" w:val="nil"/>
+                <w:left w:space="0" w:sz="0" w:val="nil"/>
+                <w:bottom w:space="0" w:sz="0" w:val="nil"/>
+                <w:right w:space="0" w:sz="0" w:val="nil"/>
+                <w:between w:space="0" w:sz="0" w:val="nil"/>
+              </w:pBdr>
+              <w:shd w:fill="auto" w:val="clear"/>
+              <w:spacing w:after="0" w:before="0" w:line="240" w:lineRule="auto"/>
+              <w:ind w:left="0" w:right="0" w:firstLine="0"/>
+              <w:jc w:val="left"/>
+              <w:rPr/>
+            </w:pPr>
+            <w:r>
+              <w:rPr>
+                <w:rtl w:val="0"/>
+              </w:rPr>
+              <w:t xml:space="preserve">GET /covid/top/deaths/{year}</w:t>
+            </w:r>
+          </w:p>
+        </w:tc>
+        <w:tc>
+          <w:tcPr>
+            <w:shd w:fill="auto" w:val="clear"/>
+            <w:tcMar>
+              <w:top w:w="100.0" w:type="dxa"/>
+              <w:left w:w="100.0" w:type="dxa"/>
+              <w:bottom w:w="100.0" w:type="dxa"/>
+              <w:right w:w="100.0" w:type="dxa"/>
+            </w:tcMar>
+            <w:vAlign w:val="top"/>
+          </w:tcPr>
+          <w:p>
+            <w:pPr>
+              <w:keepNext w:val="0"/>
+              <w:keepLines w:val="0"/>
+              <w:pageBreakBefore w:val="0"/>
+              <w:widowControl w:val="0"/>
+              <w:pBdr>
+                <w:top w:space="0" w:sz="0" w:val="nil"/>
+                <w:left w:space="0" w:sz="0" w:val="nil"/>
+                <w:bottom w:space="0" w:sz="0" w:val="nil"/>
+                <w:right w:space="0" w:sz="0" w:val="nil"/>
+                <w:between w:space="0" w:sz="0" w:val="nil"/>
+              </w:pBdr>
+              <w:shd w:fill="auto" w:val="clear"/>
+              <w:spacing w:after="0" w:before="0" w:line="240" w:lineRule="auto"/>
+              <w:ind w:left="0" w:right="0" w:firstLine="0"/>
+              <w:jc w:val="left"/>
+              <w:rPr/>
+            </w:pPr>
+            <w:r>
+              <w:rPr>
+                <w:rtl w:val="0"/>
+              </w:rPr>
+              <w:t xml:space="preserve">Returns countries with highest deaths per 100000 people</w:t>
+            </w:r>
+          </w:p>
+        </w:tc>
+      </w:tr>
+      <w:tr>
+        <w:trPr>
+          <w:cantSplit w:val="0"/>
+          <w:tblHeader w:val="0"/>
+        </w:trPr>
+        <w:tc>
+          <w:tcPr>
+            <w:shd w:fill="auto" w:val="clear"/>
+            <w:tcMar>
+              <w:top w:w="100.0" w:type="dxa"/>
+              <w:left w:w="100.0" w:type="dxa"/>
+              <w:bottom w:w="100.0" w:type="dxa"/>
+              <w:right w:w="100.0" w:type="dxa"/>
+            </w:tcMar>
+            <w:vAlign w:val="top"/>
+          </w:tcPr>
+          <w:p>
+            <w:pPr>
+              <w:keepNext w:val="0"/>
+              <w:keepLines w:val="0"/>
+              <w:pageBreakBefore w:val="0"/>
+              <w:widowControl w:val="0"/>
+              <w:pBdr>
+                <w:top w:space="0" w:sz="0" w:val="nil"/>
+                <w:left w:space="0" w:sz="0" w:val="nil"/>
+                <w:bottom w:space="0" w:sz="0" w:val="nil"/>
+                <w:right w:space="0" w:sz="0" w:val="nil"/>
+                <w:between w:space="0" w:sz="0" w:val="nil"/>
+              </w:pBdr>
+              <w:shd w:fill="auto" w:val="clear"/>
+              <w:spacing w:after="0" w:before="0" w:line="240" w:lineRule="auto"/>
+              <w:ind w:left="0" w:right="0" w:firstLine="0"/>
+              <w:jc w:val="left"/>
+              <w:rPr/>
+            </w:pPr>
+            <w:r>
+              <w:rPr>
+                <w:rtl w:val="0"/>
+              </w:rPr>
+              <w:t xml:space="preserve">GET /analytics/countries</w:t>
+            </w:r>
+          </w:p>
+        </w:tc>
+        <w:tc>
+          <w:tcPr>
+            <w:shd w:fill="auto" w:val="clear"/>
+            <w:tcMar>
+              <w:top w:w="100.0" w:type="dxa"/>
+              <w:left w:w="100.0" w:type="dxa"/>
+              <w:bottom w:w="100.0" w:type="dxa"/>
+              <w:right w:w="100.0" w:type="dxa"/>
+            </w:tcMar>
+            <w:vAlign w:val="top"/>
+          </w:tcPr>
+          <w:p>
+            <w:pPr>
+              <w:keepNext w:val="0"/>
+              <w:keepLines w:val="0"/>
+              <w:pageBreakBefore w:val="0"/>
+              <w:widowControl w:val="0"/>
+              <w:pBdr>
+                <w:top w:space="0" w:sz="0" w:val="nil"/>
+                <w:left w:space="0" w:sz="0" w:val="nil"/>
+                <w:bottom w:space="0" w:sz="0" w:val="nil"/>
+                <w:right w:space="0" w:sz="0" w:val="nil"/>
+                <w:between w:space="0" w:sz="0" w:val="nil"/>
+              </w:pBdr>
+              <w:shd w:fill="auto" w:val="clear"/>
+              <w:spacing w:after="0" w:before="0" w:line="240" w:lineRule="auto"/>
+              <w:ind w:left="0" w:right="0" w:firstLine="0"/>
+              <w:jc w:val="left"/>
+              <w:rPr/>
+            </w:pPr>
+            <w:r>
+              <w:rPr>
+                <w:rtl w:val="0"/>
+              </w:rPr>
+              <w:t xml:space="preserve">Returns list of all countries available</w:t>
+            </w:r>
+          </w:p>
+        </w:tc>
+      </w:tr>
+      <w:tr>
+        <w:trPr>
+          <w:cantSplit w:val="0"/>
+          <w:tblHeader w:val="0"/>
+        </w:trPr>
+        <w:tc>
+          <w:tcPr>
+            <w:shd w:fill="auto" w:val="clear"/>
+            <w:tcMar>
+              <w:top w:w="100.0" w:type="dxa"/>
+              <w:left w:w="100.0" w:type="dxa"/>
+              <w:bottom w:w="100.0" w:type="dxa"/>
+              <w:right w:w="100.0" w:type="dxa"/>
+            </w:tcMar>
+            <w:vAlign w:val="top"/>
+          </w:tcPr>
+          <w:p>
+            <w:pPr>
+              <w:keepNext w:val="0"/>
+              <w:keepLines w:val="0"/>
+              <w:pageBreakBefore w:val="0"/>
+              <w:widowControl w:val="0"/>
+              <w:pBdr>
+                <w:top w:space="0" w:sz="0" w:val="nil"/>
+                <w:left w:space="0" w:sz="0" w:val="nil"/>
+                <w:bottom w:space="0" w:sz="0" w:val="nil"/>
+                <w:right w:space="0" w:sz="0" w:val="nil"/>
+                <w:between w:space="0" w:sz="0" w:val="nil"/>
+              </w:pBdr>
+              <w:shd w:fill="auto" w:val="clear"/>
+              <w:spacing w:after="0" w:before="0" w:line="240" w:lineRule="auto"/>
+              <w:ind w:left="0" w:right="0" w:firstLine="0"/>
+              <w:jc w:val="left"/>
+              <w:rPr/>
+            </w:pPr>
+            <w:r>
+              <w:rPr>
+                <w:rtl w:val="0"/>
+              </w:rPr>
+              <w:t xml:space="preserve">GET /analytics/density/{year}</w:t>
+            </w:r>
+          </w:p>
+        </w:tc>
+        <w:tc>
+          <w:tcPr>
+            <w:shd w:fill="auto" w:val="clear"/>
+            <w:tcMar>
+              <w:top w:w="100.0" w:type="dxa"/>
+              <w:left w:w="100.0" w:type="dxa"/>
+              <w:bottom w:w="100.0" w:type="dxa"/>
+              <w:right w:w="100.0" w:type="dxa"/>
+            </w:tcMar>
+            <w:vAlign w:val="top"/>
+          </w:tcPr>
+          <w:p>
+            <w:pPr>
+              <w:keepNext w:val="0"/>
+              <w:keepLines w:val="0"/>
+              <w:pageBreakBefore w:val="0"/>
+              <w:widowControl w:val="0"/>
+              <w:pBdr>
+                <w:top w:space="0" w:sz="0" w:val="nil"/>
+                <w:left w:space="0" w:sz="0" w:val="nil"/>
+                <w:bottom w:space="0" w:sz="0" w:val="nil"/>
+                <w:right w:space="0" w:sz="0" w:val="nil"/>
+                <w:between w:space="0" w:sz="0" w:val="nil"/>
+              </w:pBdr>
+              <w:shd w:fill="auto" w:val="clear"/>
+              <w:spacing w:after="0" w:before="0" w:line="240" w:lineRule="auto"/>
+              <w:ind w:left="0" w:right="0" w:firstLine="0"/>
+              <w:jc w:val="left"/>
+              <w:rPr/>
+            </w:pPr>
+            <w:r>
+              <w:rPr>
+                <w:rtl w:val="0"/>
+              </w:rPr>
+              <w:t xml:space="preserve">Returns averaged outcomes between population density quartiles</w:t>
+            </w:r>
+          </w:p>
+        </w:tc>
+      </w:tr>
+      <w:tr>
+        <w:trPr>
+          <w:cantSplit w:val="0"/>
+          <w:tblHeader w:val="0"/>
+        </w:trPr>
+        <w:tc>
+          <w:tcPr>
+            <w:shd w:fill="auto" w:val="clear"/>
+            <w:tcMar>
+              <w:top w:w="100.0" w:type="dxa"/>
+              <w:left w:w="100.0" w:type="dxa"/>
+              <w:bottom w:w="100.0" w:type="dxa"/>
+              <w:right w:w="100.0" w:type="dxa"/>
+            </w:tcMar>
+            <w:vAlign w:val="top"/>
+          </w:tcPr>
+          <w:p>
+            <w:pPr>
+              <w:keepNext w:val="0"/>
+              <w:keepLines w:val="0"/>
+              <w:pageBreakBefore w:val="0"/>
+              <w:widowControl w:val="0"/>
+              <w:pBdr>
+                <w:top w:space="0" w:sz="0" w:val="nil"/>
+                <w:left w:space="0" w:sz="0" w:val="nil"/>
+                <w:bottom w:space="0" w:sz="0" w:val="nil"/>
+                <w:right w:space="0" w:sz="0" w:val="nil"/>
+                <w:between w:space="0" w:sz="0" w:val="nil"/>
+              </w:pBdr>
+              <w:shd w:fill="auto" w:val="clear"/>
+              <w:spacing w:after="0" w:before="0" w:line="240" w:lineRule="auto"/>
+              <w:ind w:left="0" w:right="0" w:firstLine="0"/>
+              <w:jc w:val="left"/>
+              <w:rPr/>
+            </w:pPr>
+            <w:r>
+              <w:rPr>
+                <w:rtl w:val="0"/>
+              </w:rPr>
+              <w:t xml:space="preserve">GET /analytics/gdp/{year}</w:t>
+            </w:r>
+          </w:p>
+        </w:tc>
+        <w:tc>
+          <w:tcPr>
+            <w:shd w:fill="auto" w:val="clear"/>
+            <w:tcMar>
+              <w:top w:w="100.0" w:type="dxa"/>
+              <w:left w:w="100.0" w:type="dxa"/>
+              <w:bottom w:w="100.0" w:type="dxa"/>
+              <w:right w:w="100.0" w:type="dxa"/>
+            </w:tcMar>
+            <w:vAlign w:val="top"/>
+          </w:tcPr>
+          <w:p>
+            <w:pPr>
+              <w:keepNext w:val="0"/>
+              <w:keepLines w:val="0"/>
+              <w:pageBreakBefore w:val="0"/>
+              <w:widowControl w:val="0"/>
+              <w:pBdr>
+                <w:top w:space="0" w:sz="0" w:val="nil"/>
+                <w:left w:space="0" w:sz="0" w:val="nil"/>
+                <w:bottom w:space="0" w:sz="0" w:val="nil"/>
+                <w:right w:space="0" w:sz="0" w:val="nil"/>
+                <w:between w:space="0" w:sz="0" w:val="nil"/>
+              </w:pBdr>
+              <w:shd w:fill="auto" w:val="clear"/>
+              <w:spacing w:after="0" w:before="0" w:line="240" w:lineRule="auto"/>
+              <w:ind w:left="0" w:right="0" w:firstLine="0"/>
+              <w:jc w:val="left"/>
+              <w:rPr/>
+            </w:pPr>
+            <w:r>
+              <w:rPr>
+                <w:rtl w:val="0"/>
+              </w:rPr>
+              <w:t xml:space="preserve">Returns averaged outcomes between GDP quartiles</w:t>
+            </w:r>
+          </w:p>
+        </w:tc>
+      </w:tr>
+      <w:tr>
+        <w:trPr>
+          <w:cantSplit w:val="0"/>
+          <w:tblHeader w:val="0"/>
+        </w:trPr>
+        <w:tc>
+          <w:tcPr>
+            <w:shd w:fill="auto" w:val="clear"/>
+            <w:tcMar>
+              <w:top w:w="100.0" w:type="dxa"/>
+              <w:left w:w="100.0" w:type="dxa"/>
+              <w:bottom w:w="100.0" w:type="dxa"/>
+              <w:right w:w="100.0" w:type="dxa"/>
+            </w:tcMar>
+            <w:vAlign w:val="top"/>
+          </w:tcPr>
+          <w:p>
+            <w:pPr>
+              <w:keepNext w:val="0"/>
+              <w:keepLines w:val="0"/>
+              <w:pageBreakBefore w:val="0"/>
+              <w:widowControl w:val="0"/>
+              <w:pBdr>
+                <w:top w:space="0" w:sz="0" w:val="nil"/>
+                <w:left w:space="0" w:sz="0" w:val="nil"/>
+                <w:bottom w:space="0" w:sz="0" w:val="nil"/>
+                <w:right w:space="0" w:sz="0" w:val="nil"/>
+                <w:between w:space="0" w:sz="0" w:val="nil"/>
+              </w:pBdr>
+              <w:shd w:fill="auto" w:val="clear"/>
+              <w:spacing w:after="0" w:before="0" w:line="240" w:lineRule="auto"/>
+              <w:ind w:left="0" w:right="0" w:firstLine="0"/>
+              <w:jc w:val="left"/>
+              <w:rPr/>
+            </w:pPr>
+            <w:r>
+              <w:rPr>
+                <w:rtl w:val="0"/>
+              </w:rPr>
+              <w:t xml:space="preserve">GET /analytics/comparison/{year}</w:t>
+            </w:r>
+          </w:p>
+        </w:tc>
+        <w:tc>
+          <w:tcPr>
+            <w:shd w:fill="auto" w:val="clear"/>
+            <w:tcMar>
+              <w:top w:w="100.0" w:type="dxa"/>
+              <w:left w:w="100.0" w:type="dxa"/>
+              <w:bottom w:w="100.0" w:type="dxa"/>
+              <w:right w:w="100.0" w:type="dxa"/>
+            </w:tcMar>
+            <w:vAlign w:val="top"/>
+          </w:tcPr>
+          <w:p>
+            <w:pPr>
+              <w:keepNext w:val="0"/>
+              <w:keepLines w:val="0"/>
+              <w:pageBreakBefore w:val="0"/>
+              <w:widowControl w:val="0"/>
+              <w:pBdr>
+                <w:top w:space="0" w:sz="0" w:val="nil"/>
+                <w:left w:space="0" w:sz="0" w:val="nil"/>
+                <w:bottom w:space="0" w:sz="0" w:val="nil"/>
+                <w:right w:space="0" w:sz="0" w:val="nil"/>
+                <w:between w:space="0" w:sz="0" w:val="nil"/>
+              </w:pBdr>
+              <w:shd w:fill="auto" w:val="clear"/>
+              <w:spacing w:after="0" w:before="0" w:line="240" w:lineRule="auto"/>
+              <w:ind w:left="0" w:right="0" w:firstLine="0"/>
+              <w:jc w:val="left"/>
+              <w:rPr/>
+            </w:pPr>
+            <w:r>
+              <w:rPr>
+                <w:rtl w:val="0"/>
+              </w:rPr>
+              <w:t xml:space="preserve">Returns country level data for a specified year</w:t>
+            </w:r>
+          </w:p>
+        </w:tc>
+      </w:tr>
+    </w:tbl>
+    <w:p>
+      <w:pPr>
+        <w:spacing w:after="140" w:line="276" w:lineRule="auto"/>
+        <w:ind w:left="0" w:firstLine="0"/>
+        <w:rPr/>
+      </w:pPr>
+      <w:r>
+        <w:rPr>
+          <w:rtl w:val="0"/>
+        </w:rPr>
+      </w:r>
+    </w:p>
+    <w:p>
+      <w:pPr>
+        <w:spacing w:after="140" w:line="276" w:lineRule="auto"/>
+        <w:ind w:left="0" w:firstLine="0"/>
+        <w:rPr/>
+      </w:pPr>
+      <w:r>
+        <w:rPr>
+          <w:rtl w:val="0"/>
+        </w:rPr>
+        <w:t xml:space="preserve">I would like to explain these endpoints briefly:</w:t>
+      </w:r>
+    </w:p>
+    <w:p>
+      <w:pPr>
+        <w:numPr>
+          <w:ilvl w:val="0"/>
+          <w:numId w:val="1"/>
+        </w:numPr>
+        <w:spacing w:after="0" w:afterAutospacing="0" w:line="276" w:lineRule="auto"/>
+        <w:ind w:left="720" w:hanging="360"/>
+        <w:rPr>
+          <w:u w:val="none"/>
+        </w:rPr>
+      </w:pPr>
+      <w:r>
+        <w:rPr>
+          <w:rtl w:val="0"/>
+        </w:rPr>
+        <w:t xml:space="preserve">The country history endpoint was added because it is essential for future visualization and it will need yearly data for the same country.</w:t>
+      </w:r>
+    </w:p>
+    <w:p>
+      <w:pPr>
+        <w:numPr>
+          <w:ilvl w:val="0"/>
+          <w:numId w:val="1"/>
+        </w:numPr>
+        <w:spacing w:after="0" w:afterAutospacing="0" w:line="276" w:lineRule="auto"/>
+        <w:ind w:left="720" w:hanging="360"/>
+        <w:rPr>
+          <w:u w:val="none"/>
+        </w:rPr>
+      </w:pPr>
+      <w:r>
+        <w:rPr>
+          <w:rtl w:val="0"/>
+        </w:rPr>
+        <w:t xml:space="preserve">The data returned from countries endpoint is going to be used for dropdowns in the dashboard.</w:t>
+      </w:r>
+    </w:p>
+    <w:p>
+      <w:pPr>
+        <w:numPr>
+          <w:ilvl w:val="0"/>
+          <w:numId w:val="1"/>
+        </w:numPr>
+        <w:spacing w:after="0" w:afterAutospacing="0" w:line="276" w:lineRule="auto"/>
+        <w:ind w:left="720" w:hanging="360"/>
+        <w:rPr>
+          <w:u w:val="none"/>
+        </w:rPr>
+      </w:pPr>
+      <w:r>
+        <w:rPr>
+          <w:rtl w:val="0"/>
+        </w:rPr>
+        <w:t xml:space="preserve">Endpoints that return ranking by deaths/cases provide country comparisons.</w:t>
+      </w:r>
+    </w:p>
+    <w:p>
+      <w:pPr>
+        <w:numPr>
+          <w:ilvl w:val="0"/>
+          <w:numId w:val="1"/>
+        </w:numPr>
+        <w:spacing w:after="0" w:afterAutospacing="0" w:line="276" w:lineRule="auto"/>
+        <w:ind w:left="720" w:hanging="360"/>
+        <w:rPr>
+          <w:u w:val="none"/>
+        </w:rPr>
+      </w:pPr>
+      <w:r>
+        <w:rPr>
+          <w:rtl w:val="0"/>
+        </w:rPr>
+        <w:t xml:space="preserve">Density and GDP endpoints return aggregated results based on quartile columns that were created previously in Snowflake.</w:t>
+      </w:r>
+    </w:p>
+    <w:p>
+      <w:pPr>
+        <w:numPr>
+          <w:ilvl w:val="0"/>
+          <w:numId w:val="1"/>
+        </w:numPr>
+        <w:spacing w:after="140" w:line="276" w:lineRule="auto"/>
+        <w:ind w:left="720" w:hanging="360"/>
+        <w:rPr>
+          <w:u w:val="none"/>
+        </w:rPr>
+      </w:pPr>
+      <w:r>
+        <w:rPr>
+          <w:rtl w:val="0"/>
+        </w:rPr>
+        <w:t xml:space="preserve">Comparison endpoint was created to support the visualization  by allowing to create scatter plots and observe the relationships between economic and demographic data in dashboard</w:t>
+      </w:r>
+    </w:p>
+    <w:p>
+      <w:pPr>
+        <w:spacing w:after="140" w:line="276" w:lineRule="auto"/>
+        <w:ind w:left="0" w:firstLine="0"/>
+        <w:rPr/>
+      </w:pPr>
+      <w:r>
+        <w:rPr>
+          <w:rtl w:val="0"/>
+        </w:rPr>
+      </w:r>
+    </w:p>
+    <w:p>
+      <w:pPr>
+        <w:spacing w:after="140" w:line="276" w:lineRule="auto"/>
+        <w:ind w:left="0" w:firstLine="0"/>
+        <w:rPr/>
+      </w:pPr>
+      <w:r>
+        <w:rPr/>
+        <w:drawing>
+          <wp:inline distB="114300" distT="114300" distL="114300" distR="114300">
+            <wp:extent cx="5943600" cy="3289300"/>
+            <wp:effectExtent b="0" l="0" r="0" t="0"/>
+            <wp:docPr id="8" name="image30.png"/>
+            <a:graphic>
+              <a:graphicData uri="http://schemas.openxmlformats.org/drawingml/2006/picture">
+                <pic:pic>
+                  <pic:nvPicPr>
+                    <pic:cNvPr id="0" name="image30.png"/>
+                    <pic:cNvPicPr preferRelativeResize="0"/>
+                  </pic:nvPicPr>
+                  <pic:blipFill>
+                    <a:blip r:embed="rId58"/>
+                    <a:srcRect b="0" l="0" r="0" t="0"/>
+                    <a:stretch>
+                      <a:fillRect/>
+                    </a:stretch>
+                  </pic:blipFill>
+                  <pic:spPr>
+                    <a:xfrm>
+                      <a:off x="0" y="0"/>
+                      <a:ext cx="5943600" cy="3289300"/>
+                    </a:xfrm>
+                    <a:prstGeom prst="rect"/>
+                    <a:ln/>
+                  </pic:spPr>
+                </pic:pic>
+              </a:graphicData>
+            </a:graphic>
+          </wp:inline>
+        </w:drawing>
+      </w:r>
+      <w:r>
+        <w:rPr>
+          <w:rtl w:val="0"/>
+        </w:rPr>
+      </w:r>
+    </w:p>
+    <w:p>
+      <w:pPr>
+        <w:spacing w:after="140" w:line="276" w:lineRule="auto"/>
+        <w:ind w:left="0" w:firstLine="0"/>
+        <w:rPr/>
+      </w:pPr>
+      <w:r>
+        <w:rPr>
+          <w:rtl w:val="0"/>
+        </w:rPr>
+        <w:tab/>
+        <w:tab/>
+        <w:tab/>
+        <w:t xml:space="preserve">Picture 3.3.1 Analytical endpoints available via FastAPI</w:t>
+      </w:r>
+    </w:p>
+    <w:p>
+      <w:pPr>
+        <w:spacing w:after="140" w:line="276" w:lineRule="auto"/>
+        <w:ind w:left="1440" w:firstLine="720"/>
+        <w:rPr/>
+      </w:pPr>
+      <w:r>
+        <w:rPr/>
+        <w:drawing>
+          <wp:inline distB="114300" distT="114300" distL="114300" distR="114300">
+            <wp:extent cx="2481263" cy="3369497"/>
+            <wp:effectExtent b="0" l="0" r="0" t="0"/>
+            <wp:docPr id="2" name="image3.png"/>
+            <a:graphic>
+              <a:graphicData uri="http://schemas.openxmlformats.org/drawingml/2006/picture">
+                <pic:pic>
+                  <pic:nvPicPr>
+                    <pic:cNvPr id="0" name="image3.png"/>
+                    <pic:cNvPicPr preferRelativeResize="0"/>
+                  </pic:nvPicPr>
+                  <pic:blipFill>
+                    <a:blip r:embed="rId59"/>
+                    <a:srcRect b="0" l="0" r="0" t="0"/>
+                    <a:stretch>
+                      <a:fillRect/>
+                    </a:stretch>
+                  </pic:blipFill>
+                  <pic:spPr>
+                    <a:xfrm>
+                      <a:off x="0" y="0"/>
+                      <a:ext cx="2481263" cy="3369497"/>
+                    </a:xfrm>
+                    <a:prstGeom prst="rect"/>
+                    <a:ln/>
+                  </pic:spPr>
+                </pic:pic>
+              </a:graphicData>
+            </a:graphic>
+          </wp:inline>
+        </w:drawing>
+      </w:r>
+      <w:r>
+        <w:rPr>
+          <w:rtl w:val="0"/>
+        </w:rPr>
+      </w:r>
+    </w:p>
+    <w:p>
+      <w:pPr>
+        <w:spacing w:after="140" w:line="276" w:lineRule="auto"/>
+        <w:ind w:left="1440" w:firstLine="0"/>
+        <w:rPr/>
+      </w:pPr>
+      <w:r>
+        <w:rPr>
+          <w:rtl w:val="0"/>
+        </w:rPr>
+        <w:t xml:space="preserve"> Picture 3.3.2 Historical data for Lithuania returned via FastAPI</w:t>
+      </w:r>
+    </w:p>
+    <w:p>
+      <w:pPr>
+        <w:spacing w:after="140" w:line="276" w:lineRule="auto"/>
+        <w:ind w:left="1440" w:firstLine="720"/>
+        <w:rPr/>
+      </w:pPr>
+      <w:r>
+        <w:rPr/>
+        <w:drawing>
+          <wp:inline distB="114300" distT="114300" distL="114300" distR="114300">
+            <wp:extent cx="2443163" cy="3502337"/>
+            <wp:effectExtent b="0" l="0" r="0" t="0"/>
+            <wp:docPr id="28" name="image24.png"/>
+            <a:graphic>
+              <a:graphicData uri="http://schemas.openxmlformats.org/drawingml/2006/picture">
+                <pic:pic>
+                  <pic:nvPicPr>
+                    <pic:cNvPr id="0" name="image24.png"/>
+                    <pic:cNvPicPr preferRelativeResize="0"/>
+                  </pic:nvPicPr>
+                  <pic:blipFill>
+                    <a:blip r:embed="rId60"/>
+                    <a:srcRect b="0" l="0" r="0" t="0"/>
+                    <a:stretch>
+                      <a:fillRect/>
+                    </a:stretch>
+                  </pic:blipFill>
+                  <pic:spPr>
+                    <a:xfrm>
+                      <a:off x="0" y="0"/>
+                      <a:ext cx="2443163" cy="3502337"/>
+                    </a:xfrm>
+                    <a:prstGeom prst="rect"/>
+                    <a:ln/>
+                  </pic:spPr>
+                </pic:pic>
+              </a:graphicData>
+            </a:graphic>
+          </wp:inline>
+        </w:drawing>
+      </w:r>
+      <w:r>
+        <w:rPr>
+          <w:rtl w:val="0"/>
+        </w:rPr>
+      </w:r>
+    </w:p>
+    <w:p>
+      <w:pPr>
+        <w:spacing w:after="140" w:line="276" w:lineRule="auto"/>
+        <w:ind w:left="1440" w:firstLine="0"/>
+        <w:rPr/>
+      </w:pPr>
+      <w:r>
+        <w:rPr>
+          <w:rtl w:val="0"/>
+        </w:rPr>
+        <w:t xml:space="preserve">Picture 3.3.3 Top countries by deaths per 100000 people in 2021</w:t>
+      </w:r>
+    </w:p>
+    <w:p>
+      <w:pPr>
+        <w:spacing w:after="140" w:line="276" w:lineRule="auto"/>
+        <w:ind w:left="0" w:firstLine="0"/>
+        <w:rPr/>
+      </w:pPr>
+      <w:r>
+        <w:rPr>
+          <w:rtl w:val="0"/>
+        </w:rPr>
+      </w:r>
+    </w:p>
+    <w:p>
+      <w:pPr>
+        <w:spacing w:after="140" w:line="276" w:lineRule="auto"/>
+        <w:rPr/>
+      </w:pPr>
+      <w:r>
+        <w:rPr>
+          <w:sz w:val="32"/>
+          <w:szCs w:val="32"/>
+          <w:rtl w:val="0"/>
+        </w:rPr>
+        <w:t xml:space="preserve">4. Interactive visualization and dashboard</w:t>
+      </w:r>
+      <w:r>
+        <w:rPr>
+          <w:rtl w:val="0"/>
+        </w:rPr>
+      </w:r>
+    </w:p>
+    <w:p>
+      <w:pPr>
+        <w:spacing w:after="140" w:line="276" w:lineRule="auto"/>
+        <w:ind w:left="0" w:firstLine="0"/>
+        <w:rPr/>
+      </w:pPr>
+      <w:r>
+        <w:rPr>
+          <w:rtl w:val="0"/>
+        </w:rPr>
+      </w:r>
+    </w:p>
     <w:sectPr>
       <w:pgSz w:h="15840" w:w="12240" w:orient="portrait"/>
       <w:pgMar w:bottom="1440" w:top="1440" w:left="1440" w:right="1440" w:header="0" w:footer="0"/>
@@ -6049,7 +7758,7 @@
       <w:lvlText w:val="%1."/>
       <w:lvlJc w:val="left"/>
       <w:pPr>
-        <w:ind w:left="1440" w:hanging="360"/>
+        <w:ind w:left="720" w:hanging="360"/>
       </w:pPr>
       <w:rPr>
         <w:u w:val="none"/>
@@ -6061,7 +7770,7 @@
       <w:lvlText w:val="%2."/>
       <w:lvlJc w:val="left"/>
       <w:pPr>
-        <w:ind w:left="2160" w:hanging="360"/>
+        <w:ind w:left="1440" w:hanging="360"/>
       </w:pPr>
       <w:rPr>
         <w:u w:val="none"/>
@@ -6073,7 +7782,7 @@
       <w:lvlText w:val="%3."/>
       <w:lvlJc w:val="right"/>
       <w:pPr>
-        <w:ind w:left="2880" w:hanging="360"/>
+        <w:ind w:left="2160" w:hanging="360"/>
       </w:pPr>
       <w:rPr>
         <w:u w:val="none"/>
@@ -6085,7 +7794,7 @@
       <w:lvlText w:val="%4."/>
       <w:lvlJc w:val="left"/>
       <w:pPr>
-        <w:ind w:left="3600" w:hanging="360"/>
+        <w:ind w:left="2880" w:hanging="360"/>
       </w:pPr>
       <w:rPr>
         <w:u w:val="none"/>
@@ -6097,7 +7806,7 @@
       <w:lvlText w:val="%5."/>
       <w:lvlJc w:val="left"/>
       <w:pPr>
-        <w:ind w:left="4320" w:hanging="360"/>
+        <w:ind w:left="3600" w:hanging="360"/>
       </w:pPr>
       <w:rPr>
         <w:u w:val="none"/>
@@ -6109,7 +7818,7 @@
       <w:lvlText w:val="%6."/>
       <w:lvlJc w:val="right"/>
       <w:pPr>
-        <w:ind w:left="5040" w:hanging="360"/>
+        <w:ind w:left="4320" w:hanging="360"/>
       </w:pPr>
       <w:rPr>
         <w:u w:val="none"/>
@@ -6121,7 +7830,7 @@
       <w:lvlText w:val="%7."/>
       <w:lvlJc w:val="left"/>
       <w:pPr>
-        <w:ind w:left="5760" w:hanging="360"/>
+        <w:ind w:left="5040" w:hanging="360"/>
       </w:pPr>
       <w:rPr>
         <w:u w:val="none"/>
@@ -6133,7 +7842,7 @@
       <w:lvlText w:val="%8."/>
       <w:lvlJc w:val="left"/>
       <w:pPr>
-        <w:ind w:left="6480" w:hanging="360"/>
+        <w:ind w:left="5760" w:hanging="360"/>
       </w:pPr>
       <w:rPr>
         <w:u w:val="none"/>
@@ -6145,6 +7854,116 @@
       <w:lvlText w:val="%9."/>
       <w:lvlJc w:val="right"/>
       <w:pPr>
+        <w:ind w:left="6480" w:hanging="360"/>
+      </w:pPr>
+      <w:rPr>
+        <w:u w:val="none"/>
+      </w:rPr>
+    </w:lvl>
+  </w:abstractNum>
+  <w:abstractNum w:abstractNumId="2">
+    <w:lvl w:ilvl="0">
+      <w:start w:val="1"/>
+      <w:numFmt w:val="decimal"/>
+      <w:lvlText w:val="%1."/>
+      <w:lvlJc w:val="left"/>
+      <w:pPr>
+        <w:ind w:left="1440" w:hanging="360"/>
+      </w:pPr>
+      <w:rPr>
+        <w:u w:val="none"/>
+      </w:rPr>
+    </w:lvl>
+    <w:lvl w:ilvl="1">
+      <w:start w:val="1"/>
+      <w:numFmt w:val="lowerLetter"/>
+      <w:lvlText w:val="%2."/>
+      <w:lvlJc w:val="left"/>
+      <w:pPr>
+        <w:ind w:left="2160" w:hanging="360"/>
+      </w:pPr>
+      <w:rPr>
+        <w:u w:val="none"/>
+      </w:rPr>
+    </w:lvl>
+    <w:lvl w:ilvl="2">
+      <w:start w:val="1"/>
+      <w:numFmt w:val="lowerRoman"/>
+      <w:lvlText w:val="%3."/>
+      <w:lvlJc w:val="right"/>
+      <w:pPr>
+        <w:ind w:left="2880" w:hanging="360"/>
+      </w:pPr>
+      <w:rPr>
+        <w:u w:val="none"/>
+      </w:rPr>
+    </w:lvl>
+    <w:lvl w:ilvl="3">
+      <w:start w:val="1"/>
+      <w:numFmt w:val="decimal"/>
+      <w:lvlText w:val="%4."/>
+      <w:lvlJc w:val="left"/>
+      <w:pPr>
+        <w:ind w:left="3600" w:hanging="360"/>
+      </w:pPr>
+      <w:rPr>
+        <w:u w:val="none"/>
+      </w:rPr>
+    </w:lvl>
+    <w:lvl w:ilvl="4">
+      <w:start w:val="1"/>
+      <w:numFmt w:val="lowerLetter"/>
+      <w:lvlText w:val="%5."/>
+      <w:lvlJc w:val="left"/>
+      <w:pPr>
+        <w:ind w:left="4320" w:hanging="360"/>
+      </w:pPr>
+      <w:rPr>
+        <w:u w:val="none"/>
+      </w:rPr>
+    </w:lvl>
+    <w:lvl w:ilvl="5">
+      <w:start w:val="1"/>
+      <w:numFmt w:val="lowerRoman"/>
+      <w:lvlText w:val="%6."/>
+      <w:lvlJc w:val="right"/>
+      <w:pPr>
+        <w:ind w:left="5040" w:hanging="360"/>
+      </w:pPr>
+      <w:rPr>
+        <w:u w:val="none"/>
+      </w:rPr>
+    </w:lvl>
+    <w:lvl w:ilvl="6">
+      <w:start w:val="1"/>
+      <w:numFmt w:val="decimal"/>
+      <w:lvlText w:val="%7."/>
+      <w:lvlJc w:val="left"/>
+      <w:pPr>
+        <w:ind w:left="5760" w:hanging="360"/>
+      </w:pPr>
+      <w:rPr>
+        <w:u w:val="none"/>
+      </w:rPr>
+    </w:lvl>
+    <w:lvl w:ilvl="7">
+      <w:start w:val="1"/>
+      <w:numFmt w:val="lowerLetter"/>
+      <w:lvlText w:val="%8."/>
+      <w:lvlJc w:val="left"/>
+      <w:pPr>
+        <w:ind w:left="6480" w:hanging="360"/>
+      </w:pPr>
+      <w:rPr>
+        <w:u w:val="none"/>
+      </w:rPr>
+    </w:lvl>
+    <w:lvl w:ilvl="8">
+      <w:start w:val="1"/>
+      <w:numFmt w:val="lowerRoman"/>
+      <w:lvlText w:val="%9."/>
+      <w:lvlJc w:val="right"/>
+      <w:pPr>
         <w:ind w:left="7200" w:hanging="360"/>
       </w:pPr>
       <w:rPr>
@@ -6154,6 +7973,9 @@
   </w:abstractNum>
   <w:num w:numId="1">
     <w:abstractNumId w:val="1"/>
+  </w:num>
+  <w:num w:numId="2">
+    <w:abstractNumId w:val="2"/>
   </w:num>
 </w:numbering>
 </file>
@@ -6326,6 +8148,13 @@
     </w:rPr>
   </w:style>
   <w:style w:type="table" w:styleId="Table1">
+    <w:basedOn w:val="TableNormal"/>
+    <w:tblPr>
+      <w:tblStyleRowBandSize w:val="1"/>
+      <w:tblStyleColBandSize w:val="1"/>
+    </w:tblPr>
+  </w:style>
+  <w:style w:type="table" w:styleId="Table2">
     <w:basedOn w:val="TableNormal"/>
     <w:tblPr>
       <w:tblStyleRowBandSize w:val="1"/>

</xml_diff>

<commit_message>
Add forecasting of 7 day averaged rolling daily cases & Update report
</commit_message>
<xml_diff>
--- a/Report_Kirill_Postrehan_2026.docx
+++ b/Report_Kirill_Postrehan_2026.docx
@@ -122,12 +122,12 @@
             <wp:extent cx="5943600" cy="3022600"/>
             <wp:effectExtent b="0" l="0" r="0" t="0"/>
             <wp:wrapSquare wrapText="bothSides" distB="0" distT="0" distL="0" distR="0"/>
-            <wp:docPr id="43" name="image36.png"/>
+            <wp:docPr id="46" name="image37.png"/>
             <a:graphic>
               <a:graphicData uri="http://schemas.openxmlformats.org/drawingml/2006/picture">
                 <pic:pic>
                   <pic:nvPicPr>
-                    <pic:cNvPr id="0" name="image36.png"/>
+                    <pic:cNvPr id="0" name="image37.png"/>
                     <pic:cNvPicPr preferRelativeResize="0"/>
                   </pic:nvPicPr>
                   <pic:blipFill>
@@ -177,12 +177,12 @@
             <wp:extent cx="6332220" cy="2113915"/>
             <wp:effectExtent b="0" l="0" r="0" t="0"/>
             <wp:wrapSquare wrapText="bothSides" distB="0" distT="0" distL="0" distR="0"/>
-            <wp:docPr id="23" name="image5.png"/>
+            <wp:docPr id="24" name="image12.png"/>
             <a:graphic>
               <a:graphicData uri="http://schemas.openxmlformats.org/drawingml/2006/picture">
                 <pic:pic>
                   <pic:nvPicPr>
-                    <pic:cNvPr id="0" name="image5.png"/>
+                    <pic:cNvPr id="0" name="image12.png"/>
                     <pic:cNvPicPr preferRelativeResize="0"/>
                   </pic:nvPicPr>
                   <pic:blipFill>
@@ -420,12 +420,12 @@
             <wp:extent cx="5943600" cy="2152015"/>
             <wp:effectExtent b="0" l="0" r="0" t="0"/>
             <wp:wrapSquare wrapText="bothSides" distB="0" distT="0" distL="0" distR="0"/>
-            <wp:docPr id="34" name="image20.png"/>
+            <wp:docPr id="36" name="image29.png"/>
             <a:graphic>
               <a:graphicData uri="http://schemas.openxmlformats.org/drawingml/2006/picture">
                 <pic:pic>
                   <pic:nvPicPr>
-                    <pic:cNvPr id="0" name="image20.png"/>
+                    <pic:cNvPr id="0" name="image29.png"/>
                     <pic:cNvPicPr preferRelativeResize="0"/>
                   </pic:nvPicPr>
                   <pic:blipFill>
@@ -475,12 +475,12 @@
           <wp:inline distB="114300" distT="114300" distL="114300" distR="114300">
             <wp:extent cx="5943600" cy="1638300"/>
             <wp:effectExtent b="0" l="0" r="0" t="0"/>
-            <wp:docPr id="65" name="image65.png"/>
+            <wp:docPr id="69" name="image66.png"/>
             <a:graphic>
               <a:graphicData uri="http://schemas.openxmlformats.org/drawingml/2006/picture">
                 <pic:pic>
                   <pic:nvPicPr>
-                    <pic:cNvPr id="0" name="image65.png"/>
+                    <pic:cNvPr id="0" name="image66.png"/>
                     <pic:cNvPicPr preferRelativeResize="0"/>
                   </pic:nvPicPr>
                   <pic:blipFill>
@@ -541,12 +541,12 @@
           <wp:inline distB="114300" distT="114300" distL="114300" distR="114300">
             <wp:extent cx="3833813" cy="2746337"/>
             <wp:effectExtent b="0" l="0" r="0" t="0"/>
-            <wp:docPr id="6" name="image33.png"/>
+            <wp:docPr id="6" name="image7.png"/>
             <a:graphic>
               <a:graphicData uri="http://schemas.openxmlformats.org/drawingml/2006/picture">
                 <pic:pic>
                   <pic:nvPicPr>
-                    <pic:cNvPr id="0" name="image33.png"/>
+                    <pic:cNvPr id="0" name="image7.png"/>
                     <pic:cNvPicPr preferRelativeResize="0"/>
                   </pic:nvPicPr>
                   <pic:blipFill>
@@ -719,12 +719,12 @@
           <wp:inline distB="114300" distT="114300" distL="114300" distR="114300">
             <wp:extent cx="3490913" cy="1149272"/>
             <wp:effectExtent b="0" l="0" r="0" t="0"/>
-            <wp:docPr id="30" name="image28.png"/>
+            <wp:docPr id="32" name="image25.png"/>
             <a:graphic>
               <a:graphicData uri="http://schemas.openxmlformats.org/drawingml/2006/picture">
                 <pic:pic>
                   <pic:nvPicPr>
-                    <pic:cNvPr id="0" name="image28.png"/>
+                    <pic:cNvPr id="0" name="image25.png"/>
                     <pic:cNvPicPr preferRelativeResize="0"/>
                   </pic:nvPicPr>
                   <pic:blipFill>
@@ -805,12 +805,12 @@
           <wp:inline distB="114300" distT="114300" distL="114300" distR="114300">
             <wp:extent cx="5943600" cy="863600"/>
             <wp:effectExtent b="0" l="0" r="0" t="0"/>
-            <wp:docPr id="27" name="image31.png"/>
+            <wp:docPr id="28" name="image43.png"/>
             <a:graphic>
               <a:graphicData uri="http://schemas.openxmlformats.org/drawingml/2006/picture">
                 <pic:pic>
                   <pic:nvPicPr>
-                    <pic:cNvPr id="0" name="image31.png"/>
+                    <pic:cNvPr id="0" name="image43.png"/>
                     <pic:cNvPicPr preferRelativeResize="0"/>
                   </pic:nvPicPr>
                   <pic:blipFill>
@@ -901,12 +901,12 @@
           <wp:inline distB="114300" distT="114300" distL="114300" distR="114300">
             <wp:extent cx="5943600" cy="2463800"/>
             <wp:effectExtent b="0" l="0" r="0" t="0"/>
-            <wp:docPr id="22" name="image15.png"/>
+            <wp:docPr id="23" name="image27.png"/>
             <a:graphic>
               <a:graphicData uri="http://schemas.openxmlformats.org/drawingml/2006/picture">
                 <pic:pic>
                   <pic:nvPicPr>
-                    <pic:cNvPr id="0" name="image15.png"/>
+                    <pic:cNvPr id="0" name="image27.png"/>
                     <pic:cNvPicPr preferRelativeResize="0"/>
                   </pic:nvPicPr>
                   <pic:blipFill>
@@ -1042,12 +1042,12 @@
           <wp:inline distB="114300" distT="114300" distL="114300" distR="114300">
             <wp:extent cx="3190875" cy="952500"/>
             <wp:effectExtent b="0" l="0" r="0" t="0"/>
-            <wp:docPr id="55" name="image45.png"/>
+            <wp:docPr id="59" name="image51.png"/>
             <a:graphic>
               <a:graphicData uri="http://schemas.openxmlformats.org/drawingml/2006/picture">
                 <pic:pic>
                   <pic:nvPicPr>
-                    <pic:cNvPr id="0" name="image45.png"/>
+                    <pic:cNvPr id="0" name="image51.png"/>
                     <pic:cNvPicPr preferRelativeResize="0"/>
                   </pic:nvPicPr>
                   <pic:blipFill>
@@ -1157,12 +1157,12 @@
           <wp:inline distB="114300" distT="114300" distL="114300" distR="114300">
             <wp:extent cx="5943600" cy="2527300"/>
             <wp:effectExtent b="0" l="0" r="0" t="0"/>
-            <wp:docPr id="1" name="image17.png"/>
+            <wp:docPr id="1" name="image24.png"/>
             <a:graphic>
               <a:graphicData uri="http://schemas.openxmlformats.org/drawingml/2006/picture">
                 <pic:pic>
                   <pic:nvPicPr>
-                    <pic:cNvPr id="0" name="image17.png"/>
+                    <pic:cNvPr id="0" name="image24.png"/>
                     <pic:cNvPicPr preferRelativeResize="0"/>
                   </pic:nvPicPr>
                   <pic:blipFill>
@@ -1246,12 +1246,12 @@
           <wp:inline distB="114300" distT="114300" distL="114300" distR="114300">
             <wp:extent cx="5943600" cy="3098800"/>
             <wp:effectExtent b="0" l="0" r="0" t="0"/>
-            <wp:docPr id="49" name="image59.png"/>
+            <wp:docPr id="53" name="image63.png"/>
             <a:graphic>
               <a:graphicData uri="http://schemas.openxmlformats.org/drawingml/2006/picture">
                 <pic:pic>
                   <pic:nvPicPr>
-                    <pic:cNvPr id="0" name="image59.png"/>
+                    <pic:cNvPr id="0" name="image63.png"/>
                     <pic:cNvPicPr preferRelativeResize="0"/>
                   </pic:nvPicPr>
                   <pic:blipFill>
@@ -1358,12 +1358,12 @@
           <wp:inline distB="114300" distT="114300" distL="114300" distR="114300">
             <wp:extent cx="5591175" cy="790575"/>
             <wp:effectExtent b="0" l="0" r="0" t="0"/>
-            <wp:docPr id="26" name="image11.png"/>
+            <wp:docPr id="27" name="image42.png"/>
             <a:graphic>
               <a:graphicData uri="http://schemas.openxmlformats.org/drawingml/2006/picture">
                 <pic:pic>
                   <pic:nvPicPr>
-                    <pic:cNvPr id="0" name="image11.png"/>
+                    <pic:cNvPr id="0" name="image42.png"/>
                     <pic:cNvPicPr preferRelativeResize="0"/>
                   </pic:nvPicPr>
                   <pic:blipFill>
@@ -1523,12 +1523,12 @@
           <wp:inline distB="114300" distT="114300" distL="114300" distR="114300">
             <wp:extent cx="5943600" cy="711200"/>
             <wp:effectExtent b="0" l="0" r="0" t="0"/>
-            <wp:docPr id="28" name="image21.png"/>
+            <wp:docPr id="30" name="image39.png"/>
             <a:graphic>
               <a:graphicData uri="http://schemas.openxmlformats.org/drawingml/2006/picture">
                 <pic:pic>
                   <pic:nvPicPr>
-                    <pic:cNvPr id="0" name="image21.png"/>
+                    <pic:cNvPr id="0" name="image39.png"/>
                     <pic:cNvPicPr preferRelativeResize="0"/>
                   </pic:nvPicPr>
                   <pic:blipFill>
@@ -1612,12 +1612,12 @@
           <wp:inline distB="114300" distT="114300" distL="114300" distR="114300">
             <wp:extent cx="5943600" cy="711200"/>
             <wp:effectExtent b="0" l="0" r="0" t="0"/>
-            <wp:docPr id="25" name="image12.png"/>
+            <wp:docPr id="26" name="image20.png"/>
             <a:graphic>
               <a:graphicData uri="http://schemas.openxmlformats.org/drawingml/2006/picture">
                 <pic:pic>
                   <pic:nvPicPr>
-                    <pic:cNvPr id="0" name="image12.png"/>
+                    <pic:cNvPr id="0" name="image20.png"/>
                     <pic:cNvPicPr preferRelativeResize="0"/>
                   </pic:nvPicPr>
                   <pic:blipFill>
@@ -1686,12 +1686,12 @@
           <wp:inline distB="114300" distT="114300" distL="114300" distR="114300">
             <wp:extent cx="4619625" cy="1438275"/>
             <wp:effectExtent b="0" l="0" r="0" t="0"/>
-            <wp:docPr id="56" name="image41.png"/>
+            <wp:docPr id="60" name="image50.png"/>
             <a:graphic>
               <a:graphicData uri="http://schemas.openxmlformats.org/drawingml/2006/picture">
                 <pic:pic>
                   <pic:nvPicPr>
-                    <pic:cNvPr id="0" name="image41.png"/>
+                    <pic:cNvPr id="0" name="image50.png"/>
                     <pic:cNvPicPr preferRelativeResize="0"/>
                   </pic:nvPicPr>
                   <pic:blipFill>
@@ -1784,12 +1784,12 @@
           <wp:inline distB="114300" distT="114300" distL="114300" distR="114300">
             <wp:extent cx="5943600" cy="2641600"/>
             <wp:effectExtent b="0" l="0" r="0" t="0"/>
-            <wp:docPr id="62" name="image60.png"/>
+            <wp:docPr id="66" name="image65.png"/>
             <a:graphic>
               <a:graphicData uri="http://schemas.openxmlformats.org/drawingml/2006/picture">
                 <pic:pic>
                   <pic:nvPicPr>
-                    <pic:cNvPr id="0" name="image60.png"/>
+                    <pic:cNvPr id="0" name="image65.png"/>
                     <pic:cNvPicPr preferRelativeResize="0"/>
                   </pic:nvPicPr>
                   <pic:blipFill>
@@ -1873,12 +1873,12 @@
           <wp:inline distB="114300" distT="114300" distL="114300" distR="114300">
             <wp:extent cx="5943600" cy="2641600"/>
             <wp:effectExtent b="0" l="0" r="0" t="0"/>
-            <wp:docPr id="42" name="image61.png"/>
+            <wp:docPr id="44" name="image57.png"/>
             <a:graphic>
               <a:graphicData uri="http://schemas.openxmlformats.org/drawingml/2006/picture">
                 <pic:pic>
                   <pic:nvPicPr>
-                    <pic:cNvPr id="0" name="image61.png"/>
+                    <pic:cNvPr id="0" name="image57.png"/>
                     <pic:cNvPicPr preferRelativeResize="0"/>
                   </pic:nvPicPr>
                   <pic:blipFill>
@@ -1962,12 +1962,12 @@
           <wp:inline distB="114300" distT="114300" distL="114300" distR="114300">
             <wp:extent cx="4572000" cy="2571750"/>
             <wp:effectExtent b="0" l="0" r="0" t="0"/>
-            <wp:docPr id="4" name="image7.png"/>
+            <wp:docPr id="4" name="image5.png"/>
             <a:graphic>
               <a:graphicData uri="http://schemas.openxmlformats.org/drawingml/2006/picture">
                 <pic:pic>
                   <pic:nvPicPr>
-                    <pic:cNvPr id="0" name="image7.png"/>
+                    <pic:cNvPr id="0" name="image5.png"/>
                     <pic:cNvPicPr preferRelativeResize="0"/>
                   </pic:nvPicPr>
                   <pic:blipFill>
@@ -2060,12 +2060,12 @@
           <wp:inline distB="114300" distT="114300" distL="114300" distR="114300">
             <wp:extent cx="5943600" cy="3721100"/>
             <wp:effectExtent b="0" l="0" r="0" t="0"/>
-            <wp:docPr id="18" name="image6.png"/>
+            <wp:docPr id="19" name="image9.png"/>
             <a:graphic>
               <a:graphicData uri="http://schemas.openxmlformats.org/drawingml/2006/picture">
                 <pic:pic>
                   <pic:nvPicPr>
-                    <pic:cNvPr id="0" name="image6.png"/>
+                    <pic:cNvPr id="0" name="image9.png"/>
                     <pic:cNvPicPr preferRelativeResize="0"/>
                   </pic:nvPicPr>
                   <pic:blipFill>
@@ -2122,12 +2122,12 @@
           <wp:inline distB="114300" distT="114300" distL="114300" distR="114300">
             <wp:extent cx="5943600" cy="1549400"/>
             <wp:effectExtent b="0" l="0" r="0" t="0"/>
-            <wp:docPr id="11" name="image10.png"/>
+            <wp:docPr id="12" name="image16.png"/>
             <a:graphic>
               <a:graphicData uri="http://schemas.openxmlformats.org/drawingml/2006/picture">
                 <pic:pic>
                   <pic:nvPicPr>
-                    <pic:cNvPr id="0" name="image10.png"/>
+                    <pic:cNvPr id="0" name="image16.png"/>
                     <pic:cNvPicPr preferRelativeResize="0"/>
                   </pic:nvPicPr>
                   <pic:blipFill>
@@ -2197,12 +2197,12 @@
           <wp:inline distB="114300" distT="114300" distL="114300" distR="114300">
             <wp:extent cx="5943600" cy="3568700"/>
             <wp:effectExtent b="0" l="0" r="0" t="0"/>
-            <wp:docPr id="12" name="image39.png"/>
+            <wp:docPr id="13" name="image13.png"/>
             <a:graphic>
               <a:graphicData uri="http://schemas.openxmlformats.org/drawingml/2006/picture">
                 <pic:pic>
                   <pic:nvPicPr>
-                    <pic:cNvPr id="0" name="image39.png"/>
+                    <pic:cNvPr id="0" name="image13.png"/>
                     <pic:cNvPicPr preferRelativeResize="0"/>
                   </pic:nvPicPr>
                   <pic:blipFill>
@@ -2260,12 +2260,12 @@
           <wp:inline distB="114300" distT="114300" distL="114300" distR="114300">
             <wp:extent cx="5943600" cy="3568700"/>
             <wp:effectExtent b="0" l="0" r="0" t="0"/>
-            <wp:docPr id="17" name="image53.png"/>
+            <wp:docPr id="18" name="image22.png"/>
             <a:graphic>
               <a:graphicData uri="http://schemas.openxmlformats.org/drawingml/2006/picture">
                 <pic:pic>
                   <pic:nvPicPr>
-                    <pic:cNvPr id="0" name="image53.png"/>
+                    <pic:cNvPr id="0" name="image22.png"/>
                     <pic:cNvPicPr preferRelativeResize="0"/>
                   </pic:nvPicPr>
                   <pic:blipFill>
@@ -2337,12 +2337,12 @@
           <wp:inline distB="114300" distT="114300" distL="114300" distR="114300">
             <wp:extent cx="5943600" cy="1460500"/>
             <wp:effectExtent b="0" l="0" r="0" t="0"/>
-            <wp:docPr id="59" name="image62.png"/>
+            <wp:docPr id="63" name="image64.png"/>
             <a:graphic>
               <a:graphicData uri="http://schemas.openxmlformats.org/drawingml/2006/picture">
                 <pic:pic>
                   <pic:nvPicPr>
-                    <pic:cNvPr id="0" name="image62.png"/>
+                    <pic:cNvPr id="0" name="image64.png"/>
                     <pic:cNvPicPr preferRelativeResize="0"/>
                   </pic:nvPicPr>
                   <pic:blipFill>
@@ -2400,12 +2400,12 @@
           <wp:inline distB="114300" distT="114300" distL="114300" distR="114300">
             <wp:extent cx="5943600" cy="3175000"/>
             <wp:effectExtent b="0" l="0" r="0" t="0"/>
-            <wp:docPr id="24" name="image13.png"/>
+            <wp:docPr id="25" name="image30.png"/>
             <a:graphic>
               <a:graphicData uri="http://schemas.openxmlformats.org/drawingml/2006/picture">
                 <pic:pic>
                   <pic:nvPicPr>
-                    <pic:cNvPr id="0" name="image13.png"/>
+                    <pic:cNvPr id="0" name="image30.png"/>
                     <pic:cNvPicPr preferRelativeResize="0"/>
                   </pic:nvPicPr>
                   <pic:blipFill>
@@ -2475,12 +2475,12 @@
           <wp:inline distB="114300" distT="114300" distL="114300" distR="114300">
             <wp:extent cx="5943600" cy="3835400"/>
             <wp:effectExtent b="0" l="0" r="0" t="0"/>
-            <wp:docPr id="41" name="image51.png"/>
+            <wp:docPr id="43" name="image49.png"/>
             <a:graphic>
               <a:graphicData uri="http://schemas.openxmlformats.org/drawingml/2006/picture">
                 <pic:pic>
                   <pic:nvPicPr>
-                    <pic:cNvPr id="0" name="image51.png"/>
+                    <pic:cNvPr id="0" name="image49.png"/>
                     <pic:cNvPicPr preferRelativeResize="0"/>
                   </pic:nvPicPr>
                   <pic:blipFill>
@@ -2569,12 +2569,12 @@
           <wp:inline distB="114300" distT="114300" distL="114300" distR="114300">
             <wp:extent cx="5943600" cy="3492500"/>
             <wp:effectExtent b="0" l="0" r="0" t="0"/>
-            <wp:docPr id="32" name="image30.png"/>
+            <wp:docPr id="34" name="image36.png"/>
             <a:graphic>
               <a:graphicData uri="http://schemas.openxmlformats.org/drawingml/2006/picture">
                 <pic:pic>
                   <pic:nvPicPr>
-                    <pic:cNvPr id="0" name="image30.png"/>
+                    <pic:cNvPr id="0" name="image36.png"/>
                     <pic:cNvPicPr preferRelativeResize="0"/>
                   </pic:nvPicPr>
                   <pic:blipFill>
@@ -2644,12 +2644,12 @@
           <wp:inline distB="114300" distT="114300" distL="114300" distR="114300">
             <wp:extent cx="5943600" cy="3492500"/>
             <wp:effectExtent b="0" l="0" r="0" t="0"/>
-            <wp:docPr id="13" name="image19.png"/>
+            <wp:docPr id="14" name="image21.png"/>
             <a:graphic>
               <a:graphicData uri="http://schemas.openxmlformats.org/drawingml/2006/picture">
                 <pic:pic>
                   <pic:nvPicPr>
-                    <pic:cNvPr id="0" name="image19.png"/>
+                    <pic:cNvPr id="0" name="image21.png"/>
                     <pic:cNvPicPr preferRelativeResize="0"/>
                   </pic:nvPicPr>
                   <pic:blipFill>
@@ -2801,12 +2801,12 @@
           <wp:inline distB="114300" distT="114300" distL="114300" distR="114300">
             <wp:extent cx="4486275" cy="1600200"/>
             <wp:effectExtent b="0" l="0" r="0" t="0"/>
-            <wp:docPr id="21" name="image8.png"/>
+            <wp:docPr id="22" name="image15.png"/>
             <a:graphic>
               <a:graphicData uri="http://schemas.openxmlformats.org/drawingml/2006/picture">
                 <pic:pic>
                   <pic:nvPicPr>
-                    <pic:cNvPr id="0" name="image8.png"/>
+                    <pic:cNvPr id="0" name="image15.png"/>
                     <pic:cNvPicPr preferRelativeResize="0"/>
                   </pic:nvPicPr>
                   <pic:blipFill>
@@ -2862,12 +2862,12 @@
           <wp:inline distB="114300" distT="114300" distL="114300" distR="114300">
             <wp:extent cx="4333875" cy="971550"/>
             <wp:effectExtent b="0" l="0" r="0" t="0"/>
-            <wp:docPr id="47" name="image47.png"/>
+            <wp:docPr id="51" name="image48.png"/>
             <a:graphic>
               <a:graphicData uri="http://schemas.openxmlformats.org/drawingml/2006/picture">
                 <pic:pic>
                   <pic:nvPicPr>
-                    <pic:cNvPr id="0" name="image47.png"/>
+                    <pic:cNvPr id="0" name="image48.png"/>
                     <pic:cNvPicPr preferRelativeResize="0"/>
                   </pic:nvPicPr>
                   <pic:blipFill>
@@ -2924,12 +2924,12 @@
           <wp:inline distB="114300" distT="114300" distL="114300" distR="114300">
             <wp:extent cx="5424488" cy="1143000"/>
             <wp:effectExtent b="0" l="0" r="0" t="0"/>
-            <wp:docPr id="39" name="image23.png"/>
+            <wp:docPr id="41" name="image34.png"/>
             <a:graphic>
               <a:graphicData uri="http://schemas.openxmlformats.org/drawingml/2006/picture">
                 <pic:pic>
                   <pic:nvPicPr>
-                    <pic:cNvPr id="0" name="image23.png"/>
+                    <pic:cNvPr id="0" name="image34.png"/>
                     <pic:cNvPicPr preferRelativeResize="0"/>
                   </pic:nvPicPr>
                   <pic:blipFill>
@@ -2986,12 +2986,12 @@
           <wp:inline distB="114300" distT="114300" distL="114300" distR="114300">
             <wp:extent cx="4914900" cy="1000125"/>
             <wp:effectExtent b="0" l="0" r="0" t="0"/>
-            <wp:docPr id="51" name="image46.png"/>
+            <wp:docPr id="55" name="image41.png"/>
             <a:graphic>
               <a:graphicData uri="http://schemas.openxmlformats.org/drawingml/2006/picture">
                 <pic:pic>
                   <pic:nvPicPr>
-                    <pic:cNvPr id="0" name="image46.png"/>
+                    <pic:cNvPr id="0" name="image41.png"/>
                     <pic:cNvPicPr preferRelativeResize="0"/>
                   </pic:nvPicPr>
                   <pic:blipFill>
@@ -3097,12 +3097,12 @@
           <wp:inline distB="114300" distT="114300" distL="114300" distR="114300">
             <wp:extent cx="4343400" cy="1066800"/>
             <wp:effectExtent b="0" l="0" r="0" t="0"/>
-            <wp:docPr id="37" name="image25.png"/>
+            <wp:docPr id="39" name="image26.png"/>
             <a:graphic>
               <a:graphicData uri="http://schemas.openxmlformats.org/drawingml/2006/picture">
                 <pic:pic>
                   <pic:nvPicPr>
-                    <pic:cNvPr id="0" name="image25.png"/>
+                    <pic:cNvPr id="0" name="image26.png"/>
                     <pic:cNvPicPr preferRelativeResize="0"/>
                   </pic:nvPicPr>
                   <pic:blipFill>
@@ -3158,12 +3158,12 @@
           <wp:inline distB="114300" distT="114300" distL="114300" distR="114300">
             <wp:extent cx="4981575" cy="1076325"/>
             <wp:effectExtent b="0" l="0" r="0" t="0"/>
-            <wp:docPr id="35" name="image22.png"/>
+            <wp:docPr id="37" name="image31.png"/>
             <a:graphic>
               <a:graphicData uri="http://schemas.openxmlformats.org/drawingml/2006/picture">
                 <pic:pic>
                   <pic:nvPicPr>
-                    <pic:cNvPr id="0" name="image22.png"/>
+                    <pic:cNvPr id="0" name="image31.png"/>
                     <pic:cNvPicPr preferRelativeResize="0"/>
                   </pic:nvPicPr>
                   <pic:blipFill>
@@ -3231,7 +3231,7 @@
           <wp:inline distB="114300" distT="114300" distL="114300" distR="114300">
             <wp:extent cx="2805113" cy="2577472"/>
             <wp:effectExtent b="0" l="0" r="0" t="0"/>
-            <wp:docPr id="50" name="image44.png"/>
+            <wp:docPr id="54" name="image44.png"/>
             <a:graphic>
               <a:graphicData uri="http://schemas.openxmlformats.org/drawingml/2006/picture">
                 <pic:pic>
@@ -3291,12 +3291,12 @@
           <wp:inline distB="114300" distT="114300" distL="114300" distR="114300">
             <wp:extent cx="3162300" cy="1524000"/>
             <wp:effectExtent b="0" l="0" r="0" t="0"/>
-            <wp:docPr id="38" name="image24.png"/>
+            <wp:docPr id="40" name="image33.png"/>
             <a:graphic>
               <a:graphicData uri="http://schemas.openxmlformats.org/drawingml/2006/picture">
                 <pic:pic>
                   <pic:nvPicPr>
-                    <pic:cNvPr id="0" name="image24.png"/>
+                    <pic:cNvPr id="0" name="image33.png"/>
                     <pic:cNvPicPr preferRelativeResize="0"/>
                   </pic:nvPicPr>
                   <pic:blipFill>
@@ -3364,12 +3364,12 @@
           <wp:inline distB="114300" distT="114300" distL="114300" distR="114300">
             <wp:extent cx="4953000" cy="1143000"/>
             <wp:effectExtent b="0" l="0" r="0" t="0"/>
-            <wp:docPr id="31" name="image26.png"/>
+            <wp:docPr id="33" name="image23.png"/>
             <a:graphic>
               <a:graphicData uri="http://schemas.openxmlformats.org/drawingml/2006/picture">
                 <pic:pic>
                   <pic:nvPicPr>
-                    <pic:cNvPr id="0" name="image26.png"/>
+                    <pic:cNvPr id="0" name="image23.png"/>
                     <pic:cNvPicPr preferRelativeResize="0"/>
                   </pic:nvPicPr>
                   <pic:blipFill>
@@ -3439,12 +3439,12 @@
           <wp:inline distB="114300" distT="114300" distL="114300" distR="114300">
             <wp:extent cx="2733675" cy="1476375"/>
             <wp:effectExtent b="0" l="0" r="0" t="0"/>
-            <wp:docPr id="48" name="image43.png"/>
+            <wp:docPr id="52" name="image54.png"/>
             <a:graphic>
               <a:graphicData uri="http://schemas.openxmlformats.org/drawingml/2006/picture">
                 <pic:pic>
                   <pic:nvPicPr>
-                    <pic:cNvPr id="0" name="image43.png"/>
+                    <pic:cNvPr id="0" name="image54.png"/>
                     <pic:cNvPicPr preferRelativeResize="0"/>
                   </pic:nvPicPr>
                   <pic:blipFill>
@@ -3592,12 +3592,12 @@
           <wp:inline distB="114300" distT="114300" distL="114300" distR="114300">
             <wp:extent cx="5943600" cy="901700"/>
             <wp:effectExtent b="0" l="0" r="0" t="0"/>
-            <wp:docPr id="53" name="image42.png"/>
+            <wp:docPr id="57" name="image53.png"/>
             <a:graphic>
               <a:graphicData uri="http://schemas.openxmlformats.org/drawingml/2006/picture">
                 <pic:pic>
                   <pic:nvPicPr>
-                    <pic:cNvPr id="0" name="image42.png"/>
+                    <pic:cNvPr id="0" name="image53.png"/>
                     <pic:cNvPicPr preferRelativeResize="0"/>
                   </pic:nvPicPr>
                   <pic:blipFill>
@@ -3653,12 +3653,12 @@
           <wp:inline distB="114300" distT="114300" distL="114300" distR="114300">
             <wp:extent cx="5943600" cy="1968500"/>
             <wp:effectExtent b="0" l="0" r="0" t="0"/>
-            <wp:docPr id="45" name="image58.png"/>
+            <wp:docPr id="48" name="image46.png"/>
             <a:graphic>
               <a:graphicData uri="http://schemas.openxmlformats.org/drawingml/2006/picture">
                 <pic:pic>
                   <pic:nvPicPr>
-                    <pic:cNvPr id="0" name="image58.png"/>
+                    <pic:cNvPr id="0" name="image46.png"/>
                     <pic:cNvPicPr preferRelativeResize="0"/>
                   </pic:nvPicPr>
                   <pic:blipFill>
@@ -3741,12 +3741,12 @@
           <wp:inline distB="114300" distT="114300" distL="114300" distR="114300">
             <wp:extent cx="5943600" cy="2298700"/>
             <wp:effectExtent b="0" l="0" r="0" t="0"/>
-            <wp:docPr id="7" name="image27.png"/>
+            <wp:docPr id="7" name="image14.png"/>
             <a:graphic>
               <a:graphicData uri="http://schemas.openxmlformats.org/drawingml/2006/picture">
                 <pic:pic>
                   <pic:nvPicPr>
-                    <pic:cNvPr id="0" name="image27.png"/>
+                    <pic:cNvPr id="0" name="image14.png"/>
                     <pic:cNvPicPr preferRelativeResize="0"/>
                   </pic:nvPicPr>
                   <pic:blipFill>
@@ -3803,7 +3803,7 @@
           <wp:inline distB="114300" distT="114300" distL="114300" distR="114300">
             <wp:extent cx="5943600" cy="2552700"/>
             <wp:effectExtent b="0" l="0" r="0" t="0"/>
-            <wp:docPr id="60" name="image56.png"/>
+            <wp:docPr id="64" name="image56.png"/>
             <a:graphic>
               <a:graphicData uri="http://schemas.openxmlformats.org/drawingml/2006/picture">
                 <pic:pic>
@@ -3869,12 +3869,12 @@
           <wp:inline distB="114300" distT="114300" distL="114300" distR="114300">
             <wp:extent cx="5943600" cy="4318000"/>
             <wp:effectExtent b="0" l="0" r="0" t="0"/>
-            <wp:docPr id="5" name="image2.png"/>
+            <wp:docPr id="5" name="image6.png"/>
             <a:graphic>
               <a:graphicData uri="http://schemas.openxmlformats.org/drawingml/2006/picture">
                 <pic:pic>
                   <pic:nvPicPr>
-                    <pic:cNvPr id="0" name="image2.png"/>
+                    <pic:cNvPr id="0" name="image6.png"/>
                     <pic:cNvPicPr preferRelativeResize="0"/>
                   </pic:nvPicPr>
                   <pic:blipFill>
@@ -4022,12 +4022,12 @@
           <wp:inline distB="114300" distT="114300" distL="114300" distR="114300">
             <wp:extent cx="5943600" cy="889000"/>
             <wp:effectExtent b="0" l="0" r="0" t="0"/>
-            <wp:docPr id="46" name="image40.png"/>
+            <wp:docPr id="50" name="image45.png"/>
             <a:graphic>
               <a:graphicData uri="http://schemas.openxmlformats.org/drawingml/2006/picture">
                 <pic:pic>
                   <pic:nvPicPr>
-                    <pic:cNvPr id="0" name="image40.png"/>
+                    <pic:cNvPr id="0" name="image45.png"/>
                     <pic:cNvPicPr preferRelativeResize="0"/>
                   </pic:nvPicPr>
                   <pic:blipFill>
@@ -5672,12 +5672,12 @@
           <wp:inline distB="114300" distT="114300" distL="114300" distR="114300">
             <wp:extent cx="3535159" cy="1471613"/>
             <wp:effectExtent b="0" l="0" r="0" t="0"/>
-            <wp:docPr id="64" name="image52.png"/>
+            <wp:docPr id="68" name="image69.png"/>
             <a:graphic>
               <a:graphicData uri="http://schemas.openxmlformats.org/drawingml/2006/picture">
                 <pic:pic>
                   <pic:nvPicPr>
-                    <pic:cNvPr id="0" name="image52.png"/>
+                    <pic:cNvPr id="0" name="image69.png"/>
                     <pic:cNvPicPr preferRelativeResize="0"/>
                   </pic:nvPicPr>
                   <pic:blipFill>
@@ -5792,7 +5792,7 @@
       <w:pPr>
         <w:numPr>
           <w:ilvl w:val="0"/>
-          <w:numId w:val="2"/>
+          <w:numId w:val="3"/>
         </w:numPr>
         <w:spacing w:after="0" w:afterAutospacing="0" w:line="276" w:lineRule="auto"/>
         <w:ind w:left="1440" w:hanging="360"/>
@@ -5811,7 +5811,7 @@
       <w:pPr>
         <w:numPr>
           <w:ilvl w:val="0"/>
-          <w:numId w:val="2"/>
+          <w:numId w:val="3"/>
         </w:numPr>
         <w:spacing w:after="0" w:afterAutospacing="0" w:line="276" w:lineRule="auto"/>
         <w:ind w:left="1440" w:hanging="360"/>
@@ -5830,7 +5830,7 @@
       <w:pPr>
         <w:numPr>
           <w:ilvl w:val="0"/>
-          <w:numId w:val="2"/>
+          <w:numId w:val="3"/>
         </w:numPr>
         <w:spacing w:after="0" w:afterAutospacing="0" w:line="276" w:lineRule="auto"/>
         <w:ind w:left="1440" w:hanging="360"/>
@@ -5849,7 +5849,7 @@
       <w:pPr>
         <w:numPr>
           <w:ilvl w:val="0"/>
-          <w:numId w:val="2"/>
+          <w:numId w:val="3"/>
         </w:numPr>
         <w:spacing w:after="140" w:line="276" w:lineRule="auto"/>
         <w:ind w:left="1440" w:hanging="360"/>
@@ -5887,12 +5887,12 @@
           <wp:inline distB="114300" distT="114300" distL="114300" distR="114300">
             <wp:extent cx="5943600" cy="1346200"/>
             <wp:effectExtent b="0" l="0" r="0" t="0"/>
-            <wp:docPr id="19" name="image34.png"/>
+            <wp:docPr id="20" name="image8.png"/>
             <a:graphic>
               <a:graphicData uri="http://schemas.openxmlformats.org/drawingml/2006/picture">
                 <pic:pic>
                   <pic:nvPicPr>
-                    <pic:cNvPr id="0" name="image34.png"/>
+                    <pic:cNvPr id="0" name="image8.png"/>
                     <pic:cNvPicPr preferRelativeResize="0"/>
                   </pic:nvPicPr>
                   <pic:blipFill>
@@ -5981,12 +5981,12 @@
           <wp:inline distB="114300" distT="114300" distL="114300" distR="114300">
             <wp:extent cx="5943600" cy="977900"/>
             <wp:effectExtent b="0" l="0" r="0" t="0"/>
-            <wp:docPr id="61" name="image55.png"/>
+            <wp:docPr id="65" name="image58.png"/>
             <a:graphic>
               <a:graphicData uri="http://schemas.openxmlformats.org/drawingml/2006/picture">
                 <pic:pic>
                   <pic:nvPicPr>
-                    <pic:cNvPr id="0" name="image55.png"/>
+                    <pic:cNvPr id="0" name="image58.png"/>
                     <pic:cNvPicPr preferRelativeResize="0"/>
                   </pic:nvPicPr>
                   <pic:blipFill>
@@ -6195,12 +6195,12 @@
           <wp:inline distB="114300" distT="114300" distL="114300" distR="114300">
             <wp:extent cx="5943600" cy="2286000"/>
             <wp:effectExtent b="0" l="0" r="0" t="0"/>
-            <wp:docPr id="58" name="image49.png"/>
+            <wp:docPr id="62" name="image59.png"/>
             <a:graphic>
               <a:graphicData uri="http://schemas.openxmlformats.org/drawingml/2006/picture">
                 <pic:pic>
                   <pic:nvPicPr>
-                    <pic:cNvPr id="0" name="image49.png"/>
+                    <pic:cNvPr id="0" name="image59.png"/>
                     <pic:cNvPicPr preferRelativeResize="0"/>
                   </pic:nvPicPr>
                   <pic:blipFill>
@@ -6257,12 +6257,12 @@
           <wp:inline distB="114300" distT="114300" distL="114300" distR="114300">
             <wp:extent cx="4333875" cy="3257550"/>
             <wp:effectExtent b="0" l="0" r="0" t="0"/>
-            <wp:docPr id="36" name="image38.png"/>
+            <wp:docPr id="38" name="image28.png"/>
             <a:graphic>
               <a:graphicData uri="http://schemas.openxmlformats.org/drawingml/2006/picture">
                 <pic:pic>
                   <pic:nvPicPr>
-                    <pic:cNvPr id="0" name="image38.png"/>
+                    <pic:cNvPr id="0" name="image28.png"/>
                     <pic:cNvPicPr preferRelativeResize="0"/>
                   </pic:nvPicPr>
                   <pic:blipFill>
@@ -6373,12 +6373,12 @@
           <wp:inline distB="114300" distT="114300" distL="114300" distR="114300">
             <wp:extent cx="5943600" cy="1625600"/>
             <wp:effectExtent b="0" l="0" r="0" t="0"/>
-            <wp:docPr id="52" name="image50.png"/>
+            <wp:docPr id="56" name="image55.png"/>
             <a:graphic>
               <a:graphicData uri="http://schemas.openxmlformats.org/drawingml/2006/picture">
                 <pic:pic>
                   <pic:nvPicPr>
-                    <pic:cNvPr id="0" name="image50.png"/>
+                    <pic:cNvPr id="0" name="image55.png"/>
                     <pic:cNvPicPr preferRelativeResize="0"/>
                   </pic:nvPicPr>
                   <pic:blipFill>
@@ -6448,12 +6448,12 @@
           <wp:inline distB="114300" distT="114300" distL="114300" distR="114300">
             <wp:extent cx="5943600" cy="1333500"/>
             <wp:effectExtent b="0" l="0" r="0" t="0"/>
-            <wp:docPr id="16" name="image4.png"/>
+            <wp:docPr id="17" name="image11.png"/>
             <a:graphic>
               <a:graphicData uri="http://schemas.openxmlformats.org/drawingml/2006/picture">
                 <pic:pic>
                   <pic:nvPicPr>
-                    <pic:cNvPr id="0" name="image4.png"/>
+                    <pic:cNvPr id="0" name="image11.png"/>
                     <pic:cNvPicPr preferRelativeResize="0"/>
                   </pic:nvPicPr>
                   <pic:blipFill>
@@ -6512,12 +6512,12 @@
           <wp:inline distB="114300" distT="114300" distL="114300" distR="114300">
             <wp:extent cx="5943600" cy="2413000"/>
             <wp:effectExtent b="0" l="0" r="0" t="0"/>
-            <wp:docPr id="20" name="image18.png"/>
+            <wp:docPr id="21" name="image10.png"/>
             <a:graphic>
               <a:graphicData uri="http://schemas.openxmlformats.org/drawingml/2006/picture">
                 <pic:pic>
                   <pic:nvPicPr>
-                    <pic:cNvPr id="0" name="image18.png"/>
+                    <pic:cNvPr id="0" name="image10.png"/>
                     <pic:cNvPicPr preferRelativeResize="0"/>
                   </pic:nvPicPr>
                   <pic:blipFill>
@@ -7526,12 +7526,12 @@
           <wp:inline distB="114300" distT="114300" distL="114300" distR="114300">
             <wp:extent cx="5943600" cy="3289300"/>
             <wp:effectExtent b="0" l="0" r="0" t="0"/>
-            <wp:docPr id="8" name="image14.png"/>
+            <wp:docPr id="8" name="image19.png"/>
             <a:graphic>
               <a:graphicData uri="http://schemas.openxmlformats.org/drawingml/2006/picture">
                 <pic:pic>
                   <pic:nvPicPr>
-                    <pic:cNvPr id="0" name="image14.png"/>
+                    <pic:cNvPr id="0" name="image19.png"/>
                     <pic:cNvPicPr preferRelativeResize="0"/>
                   </pic:nvPicPr>
                   <pic:blipFill>
@@ -7589,12 +7589,12 @@
           <wp:inline distB="114300" distT="114300" distL="114300" distR="114300">
             <wp:extent cx="2481263" cy="3369497"/>
             <wp:effectExtent b="0" l="0" r="0" t="0"/>
-            <wp:docPr id="2" name="image1.png"/>
+            <wp:docPr id="2" name="image2.png"/>
             <a:graphic>
               <a:graphicData uri="http://schemas.openxmlformats.org/drawingml/2006/picture">
                 <pic:pic>
                   <pic:nvPicPr>
-                    <pic:cNvPr id="0" name="image1.png"/>
+                    <pic:cNvPr id="0" name="image2.png"/>
                     <pic:cNvPicPr preferRelativeResize="0"/>
                   </pic:nvPicPr>
                   <pic:blipFill>
@@ -7649,12 +7649,12 @@
           <wp:inline distB="114300" distT="114300" distL="114300" distR="114300">
             <wp:extent cx="2443163" cy="3502337"/>
             <wp:effectExtent b="0" l="0" r="0" t="0"/>
-            <wp:docPr id="33" name="image29.png"/>
+            <wp:docPr id="35" name="image35.png"/>
             <a:graphic>
               <a:graphicData uri="http://schemas.openxmlformats.org/drawingml/2006/picture">
                 <pic:pic>
                   <pic:nvPicPr>
-                    <pic:cNvPr id="0" name="image29.png"/>
+                    <pic:cNvPr id="0" name="image35.png"/>
                     <pic:cNvPicPr preferRelativeResize="0"/>
                   </pic:nvPicPr>
                   <pic:blipFill>
@@ -7787,12 +7787,12 @@
           <wp:inline distB="114300" distT="114300" distL="114300" distR="114300">
             <wp:extent cx="5943600" cy="2247900"/>
             <wp:effectExtent b="0" l="0" r="0" t="0"/>
-            <wp:docPr id="9" name="image35.png"/>
+            <wp:docPr id="9" name="image52.png"/>
             <a:graphic>
               <a:graphicData uri="http://schemas.openxmlformats.org/drawingml/2006/picture">
                 <pic:pic>
                   <pic:nvPicPr>
-                    <pic:cNvPr id="0" name="image35.png"/>
+                    <pic:cNvPr id="0" name="image52.png"/>
                     <pic:cNvPicPr preferRelativeResize="0"/>
                   </pic:nvPicPr>
                   <pic:blipFill>
@@ -7917,12 +7917,12 @@
           <wp:inline distB="114300" distT="114300" distL="114300" distR="114300">
             <wp:extent cx="5943600" cy="1993900"/>
             <wp:effectExtent b="0" l="0" r="0" t="0"/>
-            <wp:docPr id="14" name="image32.png"/>
+            <wp:docPr id="15" name="image17.png"/>
             <a:graphic>
               <a:graphicData uri="http://schemas.openxmlformats.org/drawingml/2006/picture">
                 <pic:pic>
                   <pic:nvPicPr>
-                    <pic:cNvPr id="0" name="image32.png"/>
+                    <pic:cNvPr id="0" name="image17.png"/>
                     <pic:cNvPicPr preferRelativeResize="0"/>
                   </pic:nvPicPr>
                   <pic:blipFill>
@@ -7979,12 +7979,12 @@
           <wp:inline distB="114300" distT="114300" distL="114300" distR="114300">
             <wp:extent cx="5943600" cy="1993900"/>
             <wp:effectExtent b="0" l="0" r="0" t="0"/>
-            <wp:docPr id="54" name="image54.png"/>
+            <wp:docPr id="58" name="image61.png"/>
             <a:graphic>
               <a:graphicData uri="http://schemas.openxmlformats.org/drawingml/2006/picture">
                 <pic:pic>
                   <pic:nvPicPr>
-                    <pic:cNvPr id="0" name="image54.png"/>
+                    <pic:cNvPr id="0" name="image61.png"/>
                     <pic:cNvPicPr preferRelativeResize="0"/>
                   </pic:nvPicPr>
                   <pic:blipFill>
@@ -8085,12 +8085,12 @@
           <wp:inline distB="114300" distT="114300" distL="114300" distR="114300">
             <wp:extent cx="5943600" cy="1993900"/>
             <wp:effectExtent b="0" l="0" r="0" t="0"/>
-            <wp:docPr id="29" name="image37.png"/>
+            <wp:docPr id="31" name="image40.png"/>
             <a:graphic>
               <a:graphicData uri="http://schemas.openxmlformats.org/drawingml/2006/picture">
                 <pic:pic>
                   <pic:nvPicPr>
-                    <pic:cNvPr id="0" name="image37.png"/>
+                    <pic:cNvPr id="0" name="image40.png"/>
                     <pic:cNvPicPr preferRelativeResize="0"/>
                   </pic:nvPicPr>
                   <pic:blipFill>
@@ -8192,12 +8192,12 @@
           <wp:inline distB="114300" distT="114300" distL="114300" distR="114300">
             <wp:extent cx="5943600" cy="3149600"/>
             <wp:effectExtent b="0" l="0" r="0" t="0"/>
-            <wp:docPr id="40" name="image64.png"/>
+            <wp:docPr id="42" name="image68.png"/>
             <a:graphic>
               <a:graphicData uri="http://schemas.openxmlformats.org/drawingml/2006/picture">
                 <pic:pic>
                   <pic:nvPicPr>
-                    <pic:cNvPr id="0" name="image64.png"/>
+                    <pic:cNvPr id="0" name="image68.png"/>
                     <pic:cNvPicPr preferRelativeResize="0"/>
                   </pic:nvPicPr>
                   <pic:blipFill>
@@ -8321,12 +8321,12 @@
           <wp:inline distB="114300" distT="114300" distL="114300" distR="114300">
             <wp:extent cx="5943600" cy="2044700"/>
             <wp:effectExtent b="0" l="0" r="0" t="0"/>
-            <wp:docPr id="63" name="image57.png"/>
+            <wp:docPr id="67" name="image67.png"/>
             <a:graphic>
               <a:graphicData uri="http://schemas.openxmlformats.org/drawingml/2006/picture">
                 <pic:pic>
                   <pic:nvPicPr>
-                    <pic:cNvPr id="0" name="image57.png"/>
+                    <pic:cNvPr id="0" name="image67.png"/>
                     <pic:cNvPicPr preferRelativeResize="0"/>
                   </pic:nvPicPr>
                   <pic:blipFill>
@@ -8427,12 +8427,12 @@
           <wp:inline distB="114300" distT="114300" distL="114300" distR="114300">
             <wp:extent cx="5943600" cy="2070100"/>
             <wp:effectExtent b="0" l="0" r="0" t="0"/>
-            <wp:docPr id="15" name="image9.png"/>
+            <wp:docPr id="16" name="image18.png"/>
             <a:graphic>
               <a:graphicData uri="http://schemas.openxmlformats.org/drawingml/2006/picture">
                 <pic:pic>
                   <pic:nvPicPr>
-                    <pic:cNvPr id="0" name="image9.png"/>
+                    <pic:cNvPr id="0" name="image18.png"/>
                     <pic:cNvPicPr preferRelativeResize="0"/>
                   </pic:nvPicPr>
                   <pic:blipFill>
@@ -8520,12 +8520,12 @@
           <wp:inline distB="114300" distT="114300" distL="114300" distR="114300">
             <wp:extent cx="5943600" cy="3708400"/>
             <wp:effectExtent b="0" l="0" r="0" t="0"/>
-            <wp:docPr id="44" name="image48.png"/>
+            <wp:docPr id="47" name="image47.png"/>
             <a:graphic>
               <a:graphicData uri="http://schemas.openxmlformats.org/drawingml/2006/picture">
                 <pic:pic>
                   <pic:nvPicPr>
-                    <pic:cNvPr id="0" name="image48.png"/>
+                    <pic:cNvPr id="0" name="image47.png"/>
                     <pic:cNvPicPr preferRelativeResize="0"/>
                   </pic:nvPicPr>
                   <pic:blipFill>
@@ -8625,12 +8625,12 @@
           <wp:inline distB="114300" distT="114300" distL="114300" distR="114300">
             <wp:extent cx="5943600" cy="2641600"/>
             <wp:effectExtent b="0" l="0" r="0" t="0"/>
-            <wp:docPr id="57" name="image63.png"/>
+            <wp:docPr id="61" name="image62.png"/>
             <a:graphic>
               <a:graphicData uri="http://schemas.openxmlformats.org/drawingml/2006/picture">
                 <pic:pic>
                   <pic:nvPicPr>
-                    <pic:cNvPr id="0" name="image63.png"/>
+                    <pic:cNvPr id="0" name="image62.png"/>
                     <pic:cNvPicPr preferRelativeResize="0"/>
                   </pic:nvPicPr>
                   <pic:blipFill>
@@ -8697,12 +8697,12 @@
           <wp:inline distB="114300" distT="114300" distL="114300" distR="114300">
             <wp:extent cx="5943600" cy="2641600"/>
             <wp:effectExtent b="0" l="0" r="0" t="0"/>
-            <wp:docPr id="10" name="image16.png"/>
+            <wp:docPr id="10" name="image4.png"/>
             <a:graphic>
               <a:graphicData uri="http://schemas.openxmlformats.org/drawingml/2006/picture">
                 <pic:pic>
                   <pic:nvPicPr>
-                    <pic:cNvPr id="0" name="image16.png"/>
+                    <pic:cNvPr id="0" name="image4.png"/>
                     <pic:cNvPicPr preferRelativeResize="0"/>
                   </pic:nvPicPr>
                   <pic:blipFill>
@@ -8764,33 +8764,2246 @@
     <w:p>
       <w:pPr>
         <w:spacing w:after="140" w:line="276" w:lineRule="auto"/>
-        <w:ind w:left="0" w:firstLine="0"/>
-        <w:rPr/>
-      </w:pPr>
-      <w:r>
-        <w:rPr>
-          <w:rtl w:val="0"/>
-        </w:rPr>
-      </w:r>
-    </w:p>
-    <w:p>
-      <w:pPr>
-        <w:spacing w:after="140" w:line="276" w:lineRule="auto"/>
-        <w:ind w:left="0" w:firstLine="0"/>
-        <w:rPr/>
-      </w:pPr>
-      <w:r>
-        <w:rPr>
-          <w:rtl w:val="0"/>
-        </w:rPr>
-      </w:r>
-    </w:p>
-    <w:p>
-      <w:pPr>
-        <w:spacing w:after="140" w:line="276" w:lineRule="auto"/>
-        <w:ind w:left="0" w:firstLine="0"/>
-        <w:rPr/>
-      </w:pPr>
+        <w:rPr>
+          <w:sz w:val="26"/>
+          <w:szCs w:val="26"/>
+        </w:rPr>
+      </w:pPr>
+      <w:r>
+        <w:rPr>
+          <w:sz w:val="32"/>
+          <w:szCs w:val="32"/>
+          <w:rtl w:val="0"/>
+        </w:rPr>
+        <w:t xml:space="preserve">5. Time-Series Forecasting</w:t>
+      </w:r>
+      <w:r>
+        <w:rPr>
+          <w:rtl w:val="0"/>
+        </w:rPr>
+      </w:r>
+    </w:p>
+    <w:p>
+      <w:pPr>
+        <w:spacing w:after="140" w:line="276" w:lineRule="auto"/>
+        <w:ind w:left="0" w:firstLine="0"/>
+        <w:rPr/>
+      </w:pPr>
+      <w:r>
+        <w:rPr>
+          <w:rtl w:val="0"/>
+        </w:rPr>
+        <w:t xml:space="preserve">I used daily confirmed cases in Lithuania from JHU_COVID_19 for this task. I decided to use a calculated 7 day rolling average as a forecasting target and the reason I did that is that data here fluctuates a lot, so we need to make it more smooth.</w:t>
+      </w:r>
+    </w:p>
+    <w:p>
+      <w:pPr>
+        <w:spacing w:after="140" w:line="276" w:lineRule="auto"/>
+        <w:ind w:left="0" w:firstLine="0"/>
+        <w:rPr/>
+      </w:pPr>
+      <w:r>
+        <w:rPr>
+          <w:rtl w:val="0"/>
+        </w:rPr>
+      </w:r>
+    </w:p>
+    <w:p>
+      <w:pPr>
+        <w:spacing w:after="140" w:line="276" w:lineRule="auto"/>
+        <w:rPr>
+          <w:sz w:val="18"/>
+          <w:szCs w:val="18"/>
+        </w:rPr>
+      </w:pPr>
+      <w:r>
+        <w:rPr>
+          <w:sz w:val="28"/>
+          <w:szCs w:val="28"/>
+          <w:rtl w:val="0"/>
+        </w:rPr>
+        <w:t xml:space="preserve">5.1 Data Preparation</w:t>
+      </w:r>
+      <w:r>
+        <w:rPr>
+          <w:rtl w:val="0"/>
+        </w:rPr>
+      </w:r>
+    </w:p>
+    <w:p>
+      <w:pPr>
+        <w:spacing w:after="140" w:line="276" w:lineRule="auto"/>
+        <w:ind w:left="0" w:firstLine="0"/>
+        <w:rPr/>
+      </w:pPr>
+      <w:r>
+        <w:rPr>
+          <w:rtl w:val="0"/>
+        </w:rPr>
+        <w:t xml:space="preserve">As I mentioned back in the EDA section, the difference is exactly representing daily confirmed cases. During the preparation stage I made sure that every value is numeric, missing values and negative values were set to zero, since as I said before negative difference basically means that some reporting correction was done. After that dataset was converted to continuous daily frequency and a 7 day rolling average was calculated to serve as the target.</w:t>
+      </w:r>
+    </w:p>
+    <w:p>
+      <w:pPr>
+        <w:spacing w:after="140" w:line="276" w:lineRule="auto"/>
+        <w:ind w:left="0" w:firstLine="720"/>
+        <w:rPr/>
+      </w:pPr>
+      <w:r>
+        <w:rPr/>
+        <w:drawing>
+          <wp:inline distB="114300" distT="114300" distL="114300" distR="114300">
+            <wp:extent cx="4486275" cy="1724025"/>
+            <wp:effectExtent b="0" l="0" r="0" t="0"/>
+            <wp:docPr id="45" name="image60.png"/>
+            <a:graphic>
+              <a:graphicData uri="http://schemas.openxmlformats.org/drawingml/2006/picture">
+                <pic:pic>
+                  <pic:nvPicPr>
+                    <pic:cNvPr id="0" name="image60.png"/>
+                    <pic:cNvPicPr preferRelativeResize="0"/>
+                  </pic:nvPicPr>
+                  <pic:blipFill>
+                    <a:blip r:embed="rId71"/>
+                    <a:srcRect b="0" l="0" r="0" t="0"/>
+                    <a:stretch>
+                      <a:fillRect/>
+                    </a:stretch>
+                  </pic:blipFill>
+                  <pic:spPr>
+                    <a:xfrm>
+                      <a:off x="0" y="0"/>
+                      <a:ext cx="4486275" cy="1724025"/>
+                    </a:xfrm>
+                    <a:prstGeom prst="rect"/>
+                    <a:ln/>
+                  </pic:spPr>
+                </pic:pic>
+              </a:graphicData>
+            </a:graphic>
+          </wp:inline>
+        </w:drawing>
+      </w:r>
+      <w:r>
+        <w:rPr>
+          <w:rtl w:val="0"/>
+        </w:rPr>
+      </w:r>
+    </w:p>
+    <w:p>
+      <w:pPr>
+        <w:spacing w:after="140" w:line="276" w:lineRule="auto"/>
+        <w:ind w:left="0" w:firstLine="720"/>
+        <w:rPr/>
+      </w:pPr>
+      <w:r>
+        <w:rPr>
+          <w:rtl w:val="0"/>
+        </w:rPr>
+        <w:tab/>
+        <w:t xml:space="preserve">Picture 5.1.1 Prepared daily COVID-1 time series for Lithuania</w:t>
+      </w:r>
+    </w:p>
+    <w:p>
+      <w:pPr>
+        <w:spacing w:after="140" w:line="276" w:lineRule="auto"/>
+        <w:rPr/>
+      </w:pPr>
+      <w:r>
+        <w:rPr>
+          <w:sz w:val="28"/>
+          <w:szCs w:val="28"/>
+          <w:rtl w:val="0"/>
+        </w:rPr>
+        <w:t xml:space="preserve">5.2 XGBoost Feature Engineering</w:t>
+      </w:r>
+      <w:r>
+        <w:rPr>
+          <w:rtl w:val="0"/>
+        </w:rPr>
+      </w:r>
+    </w:p>
+    <w:p>
+      <w:pPr>
+        <w:spacing w:after="140" w:line="276" w:lineRule="auto"/>
+        <w:ind w:left="0" w:firstLine="0"/>
+        <w:rPr/>
+      </w:pPr>
+      <w:r>
+        <w:rPr>
+          <w:rtl w:val="0"/>
+        </w:rPr>
+        <w:t xml:space="preserve">I understand that XGBoost is not designed to work with time-series data directly and does not understand temporal order. Therefore, I transformed the time-series into a supervised-learning dataset using lag, rolling and calendar features.</w:t>
+      </w:r>
+    </w:p>
+    <w:p>
+      <w:pPr>
+        <w:spacing w:after="140" w:line="276" w:lineRule="auto"/>
+        <w:ind w:left="0" w:firstLine="0"/>
+        <w:rPr/>
+      </w:pPr>
+      <w:r>
+        <w:rPr>
+          <w:rtl w:val="0"/>
+        </w:rPr>
+      </w:r>
+    </w:p>
+    <w:tbl>
+      <w:tblPr>
+        <w:tblStyle w:val="Table3"/>
+        <w:tblW w:w="9360.0" w:type="dxa"/>
+        <w:jc w:val="left"/>
+        <w:tblBorders>
+          <w:top w:color="000000" w:space="0" w:sz="8" w:val="single"/>
+          <w:left w:color="000000" w:space="0" w:sz="8" w:val="single"/>
+          <w:bottom w:color="000000" w:space="0" w:sz="8" w:val="single"/>
+          <w:right w:color="000000" w:space="0" w:sz="8" w:val="single"/>
+          <w:insideH w:color="000000" w:space="0" w:sz="8" w:val="single"/>
+          <w:insideV w:color="000000" w:space="0" w:sz="8" w:val="single"/>
+        </w:tblBorders>
+        <w:tblLayout w:type="fixed"/>
+        <w:tblLook w:val="0600"/>
+      </w:tblPr>
+      <w:tblGrid>
+        <w:gridCol w:w="3120"/>
+        <w:gridCol w:w="3120"/>
+        <w:gridCol w:w="3120"/>
+        <w:tblGridChange w:id="0">
+          <w:tblGrid>
+            <w:gridCol w:w="3120"/>
+            <w:gridCol w:w="3120"/>
+            <w:gridCol w:w="3120"/>
+          </w:tblGrid>
+        </w:tblGridChange>
+      </w:tblGrid>
+      <w:tr>
+        <w:trPr>
+          <w:cantSplit w:val="0"/>
+          <w:tblHeader w:val="0"/>
+        </w:trPr>
+        <w:tc>
+          <w:tcPr>
+            <w:shd w:fill="auto" w:val="clear"/>
+            <w:tcMar>
+              <w:top w:w="100.0" w:type="dxa"/>
+              <w:left w:w="100.0" w:type="dxa"/>
+              <w:bottom w:w="100.0" w:type="dxa"/>
+              <w:right w:w="100.0" w:type="dxa"/>
+            </w:tcMar>
+            <w:vAlign w:val="top"/>
+          </w:tcPr>
+          <w:p>
+            <w:pPr>
+              <w:keepNext w:val="0"/>
+              <w:keepLines w:val="0"/>
+              <w:pageBreakBefore w:val="0"/>
+              <w:widowControl w:val="0"/>
+              <w:pBdr>
+                <w:top w:space="0" w:sz="0" w:val="nil"/>
+                <w:left w:space="0" w:sz="0" w:val="nil"/>
+                <w:bottom w:space="0" w:sz="0" w:val="nil"/>
+                <w:right w:space="0" w:sz="0" w:val="nil"/>
+                <w:between w:space="0" w:sz="0" w:val="nil"/>
+              </w:pBdr>
+              <w:shd w:fill="auto" w:val="clear"/>
+              <w:spacing w:after="0" w:before="0" w:line="240" w:lineRule="auto"/>
+              <w:ind w:left="0" w:right="0" w:firstLine="0"/>
+              <w:jc w:val="left"/>
+              <w:rPr/>
+            </w:pPr>
+            <w:r>
+              <w:rPr>
+                <w:rtl w:val="0"/>
+              </w:rPr>
+              <w:t xml:space="preserve">Feature group</w:t>
+            </w:r>
+          </w:p>
+        </w:tc>
+        <w:tc>
+          <w:tcPr>
+            <w:shd w:fill="auto" w:val="clear"/>
+            <w:tcMar>
+              <w:top w:w="100.0" w:type="dxa"/>
+              <w:left w:w="100.0" w:type="dxa"/>
+              <w:bottom w:w="100.0" w:type="dxa"/>
+              <w:right w:w="100.0" w:type="dxa"/>
+            </w:tcMar>
+            <w:vAlign w:val="top"/>
+          </w:tcPr>
+          <w:p>
+            <w:pPr>
+              <w:keepNext w:val="0"/>
+              <w:keepLines w:val="0"/>
+              <w:pageBreakBefore w:val="0"/>
+              <w:widowControl w:val="0"/>
+              <w:pBdr>
+                <w:top w:space="0" w:sz="0" w:val="nil"/>
+                <w:left w:space="0" w:sz="0" w:val="nil"/>
+                <w:bottom w:space="0" w:sz="0" w:val="nil"/>
+                <w:right w:space="0" w:sz="0" w:val="nil"/>
+                <w:between w:space="0" w:sz="0" w:val="nil"/>
+              </w:pBdr>
+              <w:shd w:fill="auto" w:val="clear"/>
+              <w:spacing w:after="0" w:before="0" w:line="240" w:lineRule="auto"/>
+              <w:ind w:left="0" w:right="0" w:firstLine="0"/>
+              <w:jc w:val="left"/>
+              <w:rPr/>
+            </w:pPr>
+            <w:r>
+              <w:rPr>
+                <w:rtl w:val="0"/>
+              </w:rPr>
+              <w:t xml:space="preserve">Examples</w:t>
+            </w:r>
+          </w:p>
+        </w:tc>
+        <w:tc>
+          <w:tcPr>
+            <w:shd w:fill="auto" w:val="clear"/>
+            <w:tcMar>
+              <w:top w:w="100.0" w:type="dxa"/>
+              <w:left w:w="100.0" w:type="dxa"/>
+              <w:bottom w:w="100.0" w:type="dxa"/>
+              <w:right w:w="100.0" w:type="dxa"/>
+            </w:tcMar>
+            <w:vAlign w:val="top"/>
+          </w:tcPr>
+          <w:p>
+            <w:pPr>
+              <w:keepNext w:val="0"/>
+              <w:keepLines w:val="0"/>
+              <w:pageBreakBefore w:val="0"/>
+              <w:widowControl w:val="0"/>
+              <w:pBdr>
+                <w:top w:space="0" w:sz="0" w:val="nil"/>
+                <w:left w:space="0" w:sz="0" w:val="nil"/>
+                <w:bottom w:space="0" w:sz="0" w:val="nil"/>
+                <w:right w:space="0" w:sz="0" w:val="nil"/>
+                <w:between w:space="0" w:sz="0" w:val="nil"/>
+              </w:pBdr>
+              <w:shd w:fill="auto" w:val="clear"/>
+              <w:spacing w:after="0" w:before="0" w:line="240" w:lineRule="auto"/>
+              <w:ind w:left="0" w:right="0" w:firstLine="0"/>
+              <w:jc w:val="left"/>
+              <w:rPr/>
+            </w:pPr>
+            <w:r>
+              <w:rPr>
+                <w:rtl w:val="0"/>
+              </w:rPr>
+              <w:t xml:space="preserve">Purpose</w:t>
+            </w:r>
+          </w:p>
+        </w:tc>
+      </w:tr>
+      <w:tr>
+        <w:trPr>
+          <w:cantSplit w:val="0"/>
+          <w:tblHeader w:val="0"/>
+        </w:trPr>
+        <w:tc>
+          <w:tcPr>
+            <w:shd w:fill="auto" w:val="clear"/>
+            <w:tcMar>
+              <w:top w:w="100.0" w:type="dxa"/>
+              <w:left w:w="100.0" w:type="dxa"/>
+              <w:bottom w:w="100.0" w:type="dxa"/>
+              <w:right w:w="100.0" w:type="dxa"/>
+            </w:tcMar>
+            <w:vAlign w:val="top"/>
+          </w:tcPr>
+          <w:p>
+            <w:pPr>
+              <w:keepNext w:val="0"/>
+              <w:keepLines w:val="0"/>
+              <w:pageBreakBefore w:val="0"/>
+              <w:widowControl w:val="0"/>
+              <w:pBdr>
+                <w:top w:space="0" w:sz="0" w:val="nil"/>
+                <w:left w:space="0" w:sz="0" w:val="nil"/>
+                <w:bottom w:space="0" w:sz="0" w:val="nil"/>
+                <w:right w:space="0" w:sz="0" w:val="nil"/>
+                <w:between w:space="0" w:sz="0" w:val="nil"/>
+              </w:pBdr>
+              <w:shd w:fill="auto" w:val="clear"/>
+              <w:spacing w:after="0" w:before="0" w:line="240" w:lineRule="auto"/>
+              <w:ind w:left="0" w:right="0" w:firstLine="0"/>
+              <w:jc w:val="left"/>
+              <w:rPr/>
+            </w:pPr>
+            <w:r>
+              <w:rPr>
+                <w:rtl w:val="0"/>
+              </w:rPr>
+              <w:t xml:space="preserve">Lag features</w:t>
+            </w:r>
+          </w:p>
+        </w:tc>
+        <w:tc>
+          <w:tcPr>
+            <w:shd w:fill="auto" w:val="clear"/>
+            <w:tcMar>
+              <w:top w:w="100.0" w:type="dxa"/>
+              <w:left w:w="100.0" w:type="dxa"/>
+              <w:bottom w:w="100.0" w:type="dxa"/>
+              <w:right w:w="100.0" w:type="dxa"/>
+            </w:tcMar>
+            <w:vAlign w:val="top"/>
+          </w:tcPr>
+          <w:p>
+            <w:pPr>
+              <w:keepNext w:val="0"/>
+              <w:keepLines w:val="0"/>
+              <w:pageBreakBefore w:val="0"/>
+              <w:widowControl w:val="0"/>
+              <w:pBdr>
+                <w:top w:space="0" w:sz="0" w:val="nil"/>
+                <w:left w:space="0" w:sz="0" w:val="nil"/>
+                <w:bottom w:space="0" w:sz="0" w:val="nil"/>
+                <w:right w:space="0" w:sz="0" w:val="nil"/>
+                <w:between w:space="0" w:sz="0" w:val="nil"/>
+              </w:pBdr>
+              <w:shd w:fill="auto" w:val="clear"/>
+              <w:spacing w:after="0" w:before="0" w:line="240" w:lineRule="auto"/>
+              <w:ind w:left="0" w:right="0" w:firstLine="0"/>
+              <w:jc w:val="left"/>
+              <w:rPr/>
+            </w:pPr>
+            <w:r>
+              <w:rPr>
+                <w:rtl w:val="0"/>
+              </w:rPr>
+              <w:t xml:space="preserve">Lag_1, lag_2, lag_14</w:t>
+            </w:r>
+          </w:p>
+        </w:tc>
+        <w:tc>
+          <w:tcPr>
+            <w:shd w:fill="auto" w:val="clear"/>
+            <w:tcMar>
+              <w:top w:w="100.0" w:type="dxa"/>
+              <w:left w:w="100.0" w:type="dxa"/>
+              <w:bottom w:w="100.0" w:type="dxa"/>
+              <w:right w:w="100.0" w:type="dxa"/>
+            </w:tcMar>
+            <w:vAlign w:val="top"/>
+          </w:tcPr>
+          <w:p>
+            <w:pPr>
+              <w:keepNext w:val="0"/>
+              <w:keepLines w:val="0"/>
+              <w:pageBreakBefore w:val="0"/>
+              <w:widowControl w:val="0"/>
+              <w:pBdr>
+                <w:top w:space="0" w:sz="0" w:val="nil"/>
+                <w:left w:space="0" w:sz="0" w:val="nil"/>
+                <w:bottom w:space="0" w:sz="0" w:val="nil"/>
+                <w:right w:space="0" w:sz="0" w:val="nil"/>
+                <w:between w:space="0" w:sz="0" w:val="nil"/>
+              </w:pBdr>
+              <w:shd w:fill="auto" w:val="clear"/>
+              <w:spacing w:after="0" w:before="0" w:line="240" w:lineRule="auto"/>
+              <w:ind w:left="0" w:right="0" w:firstLine="0"/>
+              <w:jc w:val="left"/>
+              <w:rPr/>
+            </w:pPr>
+            <w:r>
+              <w:rPr>
+                <w:rtl w:val="0"/>
+              </w:rPr>
+              <w:t xml:space="preserve">Represent previous target values</w:t>
+            </w:r>
+          </w:p>
+        </w:tc>
+      </w:tr>
+      <w:tr>
+        <w:trPr>
+          <w:cantSplit w:val="0"/>
+          <w:tblHeader w:val="0"/>
+        </w:trPr>
+        <w:tc>
+          <w:tcPr>
+            <w:shd w:fill="auto" w:val="clear"/>
+            <w:tcMar>
+              <w:top w:w="100.0" w:type="dxa"/>
+              <w:left w:w="100.0" w:type="dxa"/>
+              <w:bottom w:w="100.0" w:type="dxa"/>
+              <w:right w:w="100.0" w:type="dxa"/>
+            </w:tcMar>
+            <w:vAlign w:val="top"/>
+          </w:tcPr>
+          <w:p>
+            <w:pPr>
+              <w:keepNext w:val="0"/>
+              <w:keepLines w:val="0"/>
+              <w:pageBreakBefore w:val="0"/>
+              <w:widowControl w:val="0"/>
+              <w:pBdr>
+                <w:top w:space="0" w:sz="0" w:val="nil"/>
+                <w:left w:space="0" w:sz="0" w:val="nil"/>
+                <w:bottom w:space="0" w:sz="0" w:val="nil"/>
+                <w:right w:space="0" w:sz="0" w:val="nil"/>
+                <w:between w:space="0" w:sz="0" w:val="nil"/>
+              </w:pBdr>
+              <w:shd w:fill="auto" w:val="clear"/>
+              <w:spacing w:after="0" w:before="0" w:line="240" w:lineRule="auto"/>
+              <w:ind w:left="0" w:right="0" w:firstLine="0"/>
+              <w:jc w:val="left"/>
+              <w:rPr/>
+            </w:pPr>
+            <w:r>
+              <w:rPr>
+                <w:rtl w:val="0"/>
+              </w:rPr>
+              <w:t xml:space="preserve">Rolling features</w:t>
+            </w:r>
+          </w:p>
+        </w:tc>
+        <w:tc>
+          <w:tcPr>
+            <w:shd w:fill="auto" w:val="clear"/>
+            <w:tcMar>
+              <w:top w:w="100.0" w:type="dxa"/>
+              <w:left w:w="100.0" w:type="dxa"/>
+              <w:bottom w:w="100.0" w:type="dxa"/>
+              <w:right w:w="100.0" w:type="dxa"/>
+            </w:tcMar>
+            <w:vAlign w:val="top"/>
+          </w:tcPr>
+          <w:p>
+            <w:pPr>
+              <w:keepNext w:val="0"/>
+              <w:keepLines w:val="0"/>
+              <w:pageBreakBefore w:val="0"/>
+              <w:widowControl w:val="0"/>
+              <w:pBdr>
+                <w:top w:space="0" w:sz="0" w:val="nil"/>
+                <w:left w:space="0" w:sz="0" w:val="nil"/>
+                <w:bottom w:space="0" w:sz="0" w:val="nil"/>
+                <w:right w:space="0" w:sz="0" w:val="nil"/>
+                <w:between w:space="0" w:sz="0" w:val="nil"/>
+              </w:pBdr>
+              <w:shd w:fill="auto" w:val="clear"/>
+              <w:spacing w:after="0" w:before="0" w:line="240" w:lineRule="auto"/>
+              <w:ind w:left="0" w:right="0" w:firstLine="0"/>
+              <w:jc w:val="left"/>
+              <w:rPr/>
+            </w:pPr>
+            <w:r>
+              <w:rPr>
+                <w:rtl w:val="0"/>
+              </w:rPr>
+              <w:t xml:space="preserve">Rolling_7, rolling_14</w:t>
+            </w:r>
+          </w:p>
+        </w:tc>
+        <w:tc>
+          <w:tcPr>
+            <w:shd w:fill="auto" w:val="clear"/>
+            <w:tcMar>
+              <w:top w:w="100.0" w:type="dxa"/>
+              <w:left w:w="100.0" w:type="dxa"/>
+              <w:bottom w:w="100.0" w:type="dxa"/>
+              <w:right w:w="100.0" w:type="dxa"/>
+            </w:tcMar>
+            <w:vAlign w:val="top"/>
+          </w:tcPr>
+          <w:p>
+            <w:pPr>
+              <w:keepNext w:val="0"/>
+              <w:keepLines w:val="0"/>
+              <w:pageBreakBefore w:val="0"/>
+              <w:widowControl w:val="0"/>
+              <w:pBdr>
+                <w:top w:space="0" w:sz="0" w:val="nil"/>
+                <w:left w:space="0" w:sz="0" w:val="nil"/>
+                <w:bottom w:space="0" w:sz="0" w:val="nil"/>
+                <w:right w:space="0" w:sz="0" w:val="nil"/>
+                <w:between w:space="0" w:sz="0" w:val="nil"/>
+              </w:pBdr>
+              <w:shd w:fill="auto" w:val="clear"/>
+              <w:spacing w:after="0" w:before="0" w:line="240" w:lineRule="auto"/>
+              <w:ind w:left="0" w:right="0" w:firstLine="0"/>
+              <w:jc w:val="left"/>
+              <w:rPr/>
+            </w:pPr>
+            <w:r>
+              <w:rPr>
+                <w:rtl w:val="0"/>
+              </w:rPr>
+              <w:t xml:space="preserve">Represent short-term trends</w:t>
+            </w:r>
+          </w:p>
+        </w:tc>
+      </w:tr>
+      <w:tr>
+        <w:trPr>
+          <w:cantSplit w:val="0"/>
+          <w:tblHeader w:val="0"/>
+        </w:trPr>
+        <w:tc>
+          <w:tcPr>
+            <w:shd w:fill="auto" w:val="clear"/>
+            <w:tcMar>
+              <w:top w:w="100.0" w:type="dxa"/>
+              <w:left w:w="100.0" w:type="dxa"/>
+              <w:bottom w:w="100.0" w:type="dxa"/>
+              <w:right w:w="100.0" w:type="dxa"/>
+            </w:tcMar>
+            <w:vAlign w:val="top"/>
+          </w:tcPr>
+          <w:p>
+            <w:pPr>
+              <w:keepNext w:val="0"/>
+              <w:keepLines w:val="0"/>
+              <w:pageBreakBefore w:val="0"/>
+              <w:widowControl w:val="0"/>
+              <w:pBdr>
+                <w:top w:space="0" w:sz="0" w:val="nil"/>
+                <w:left w:space="0" w:sz="0" w:val="nil"/>
+                <w:bottom w:space="0" w:sz="0" w:val="nil"/>
+                <w:right w:space="0" w:sz="0" w:val="nil"/>
+                <w:between w:space="0" w:sz="0" w:val="nil"/>
+              </w:pBdr>
+              <w:shd w:fill="auto" w:val="clear"/>
+              <w:spacing w:after="0" w:before="0" w:line="240" w:lineRule="auto"/>
+              <w:ind w:left="0" w:right="0" w:firstLine="0"/>
+              <w:jc w:val="left"/>
+              <w:rPr/>
+            </w:pPr>
+            <w:r>
+              <w:rPr>
+                <w:rtl w:val="0"/>
+              </w:rPr>
+              <w:t xml:space="preserve">Calendar features</w:t>
+            </w:r>
+          </w:p>
+        </w:tc>
+        <w:tc>
+          <w:tcPr>
+            <w:shd w:fill="auto" w:val="clear"/>
+            <w:tcMar>
+              <w:top w:w="100.0" w:type="dxa"/>
+              <w:left w:w="100.0" w:type="dxa"/>
+              <w:bottom w:w="100.0" w:type="dxa"/>
+              <w:right w:w="100.0" w:type="dxa"/>
+            </w:tcMar>
+            <w:vAlign w:val="top"/>
+          </w:tcPr>
+          <w:p>
+            <w:pPr>
+              <w:keepNext w:val="0"/>
+              <w:keepLines w:val="0"/>
+              <w:pageBreakBefore w:val="0"/>
+              <w:widowControl w:val="0"/>
+              <w:pBdr>
+                <w:top w:space="0" w:sz="0" w:val="nil"/>
+                <w:left w:space="0" w:sz="0" w:val="nil"/>
+                <w:bottom w:space="0" w:sz="0" w:val="nil"/>
+                <w:right w:space="0" w:sz="0" w:val="nil"/>
+                <w:between w:space="0" w:sz="0" w:val="nil"/>
+              </w:pBdr>
+              <w:shd w:fill="auto" w:val="clear"/>
+              <w:spacing w:after="0" w:before="0" w:line="240" w:lineRule="auto"/>
+              <w:ind w:left="0" w:right="0" w:firstLine="0"/>
+              <w:jc w:val="left"/>
+              <w:rPr/>
+            </w:pPr>
+            <w:r>
+              <w:rPr>
+                <w:rtl w:val="0"/>
+              </w:rPr>
+              <w:t xml:space="preserve">Day_of_week, month, day_of_year</w:t>
+            </w:r>
+          </w:p>
+        </w:tc>
+        <w:tc>
+          <w:tcPr>
+            <w:shd w:fill="auto" w:val="clear"/>
+            <w:tcMar>
+              <w:top w:w="100.0" w:type="dxa"/>
+              <w:left w:w="100.0" w:type="dxa"/>
+              <w:bottom w:w="100.0" w:type="dxa"/>
+              <w:right w:w="100.0" w:type="dxa"/>
+            </w:tcMar>
+            <w:vAlign w:val="top"/>
+          </w:tcPr>
+          <w:p>
+            <w:pPr>
+              <w:keepNext w:val="0"/>
+              <w:keepLines w:val="0"/>
+              <w:pageBreakBefore w:val="0"/>
+              <w:widowControl w:val="0"/>
+              <w:pBdr>
+                <w:top w:space="0" w:sz="0" w:val="nil"/>
+                <w:left w:space="0" w:sz="0" w:val="nil"/>
+                <w:bottom w:space="0" w:sz="0" w:val="nil"/>
+                <w:right w:space="0" w:sz="0" w:val="nil"/>
+                <w:between w:space="0" w:sz="0" w:val="nil"/>
+              </w:pBdr>
+              <w:shd w:fill="auto" w:val="clear"/>
+              <w:spacing w:after="0" w:before="0" w:line="240" w:lineRule="auto"/>
+              <w:ind w:left="0" w:right="0" w:firstLine="0"/>
+              <w:jc w:val="left"/>
+              <w:rPr/>
+            </w:pPr>
+            <w:r>
+              <w:rPr>
+                <w:rtl w:val="0"/>
+              </w:rPr>
+              <w:t xml:space="preserve">Represent seasonal context</w:t>
+            </w:r>
+          </w:p>
+        </w:tc>
+      </w:tr>
+    </w:tbl>
+    <w:p>
+      <w:pPr>
+        <w:spacing w:after="140" w:line="276" w:lineRule="auto"/>
+        <w:ind w:left="0" w:firstLine="0"/>
+        <w:rPr/>
+      </w:pPr>
+      <w:r>
+        <w:rPr>
+          <w:rtl w:val="0"/>
+        </w:rPr>
+      </w:r>
+    </w:p>
+    <w:p>
+      <w:pPr>
+        <w:spacing w:after="140" w:line="276" w:lineRule="auto"/>
+        <w:ind w:left="0" w:firstLine="0"/>
+        <w:rPr/>
+      </w:pPr>
+      <w:r>
+        <w:rPr>
+          <w:rtl w:val="0"/>
+        </w:rPr>
+        <w:t xml:space="preserve">In order to prevent data leakage, I calculated rolling features after making a one-day shift, so the value that was staged to be predicted was never included in its features.</w:t>
+      </w:r>
+    </w:p>
+    <w:p>
+      <w:pPr>
+        <w:spacing w:after="140" w:line="276" w:lineRule="auto"/>
+        <w:ind w:left="0" w:firstLine="720"/>
+        <w:rPr/>
+      </w:pPr>
+      <w:r>
+        <w:rPr/>
+        <w:drawing>
+          <wp:inline distB="114300" distT="114300" distL="114300" distR="114300">
+            <wp:extent cx="4986338" cy="3324225"/>
+            <wp:effectExtent b="0" l="0" r="0" t="0"/>
+            <wp:docPr id="11" name="image1.png"/>
+            <a:graphic>
+              <a:graphicData uri="http://schemas.openxmlformats.org/drawingml/2006/picture">
+                <pic:pic>
+                  <pic:nvPicPr>
+                    <pic:cNvPr id="0" name="image1.png"/>
+                    <pic:cNvPicPr preferRelativeResize="0"/>
+                  </pic:nvPicPr>
+                  <pic:blipFill>
+                    <a:blip r:embed="rId72"/>
+                    <a:srcRect b="0" l="0" r="0" t="0"/>
+                    <a:stretch>
+                      <a:fillRect/>
+                    </a:stretch>
+                  </pic:blipFill>
+                  <pic:spPr>
+                    <a:xfrm>
+                      <a:off x="0" y="0"/>
+                      <a:ext cx="4986338" cy="3324225"/>
+                    </a:xfrm>
+                    <a:prstGeom prst="rect"/>
+                    <a:ln/>
+                  </pic:spPr>
+                </pic:pic>
+              </a:graphicData>
+            </a:graphic>
+          </wp:inline>
+        </w:drawing>
+      </w:r>
+      <w:r>
+        <w:rPr>
+          <w:rtl w:val="0"/>
+        </w:rPr>
+      </w:r>
+    </w:p>
+    <w:p>
+      <w:pPr>
+        <w:spacing w:after="140" w:line="276" w:lineRule="auto"/>
+        <w:ind w:left="0" w:firstLine="0"/>
+        <w:rPr/>
+      </w:pPr>
+      <w:r>
+        <w:rPr>
+          <w:rtl w:val="0"/>
+        </w:rPr>
+        <w:tab/>
+        <w:t xml:space="preserve">                 Picture 5.2.1 Features ordered by their contribution to the prediction</w:t>
+      </w:r>
+    </w:p>
+    <w:p>
+      <w:pPr>
+        <w:spacing w:after="140" w:line="276" w:lineRule="auto"/>
+        <w:ind w:left="0" w:firstLine="0"/>
+        <w:rPr/>
+      </w:pPr>
+      <w:r>
+        <w:rPr>
+          <w:rtl w:val="0"/>
+        </w:rPr>
+        <w:t xml:space="preserve">On the picture 5.2.1 you can see XGBoost feature importance showed that the most recent lag_values had the greatest impact on prediction. This is expected and can be explained by the fact that the target is a smoothed 7-day rolling average, so consecutive values are strongly related.</w:t>
+      </w:r>
+    </w:p>
+    <w:p>
+      <w:pPr>
+        <w:spacing w:after="140" w:line="276" w:lineRule="auto"/>
+        <w:rPr>
+          <w:sz w:val="28"/>
+          <w:szCs w:val="28"/>
+        </w:rPr>
+      </w:pPr>
+      <w:r>
+        <w:rPr>
+          <w:sz w:val="28"/>
+          <w:szCs w:val="28"/>
+          <w:rtl w:val="0"/>
+        </w:rPr>
+        <w:t xml:space="preserve">5.3 Forecasting models</w:t>
+      </w:r>
+    </w:p>
+    <w:p>
+      <w:pPr>
+        <w:spacing w:after="140" w:line="276" w:lineRule="auto"/>
+        <w:rPr/>
+      </w:pPr>
+      <w:r>
+        <w:rPr>
+          <w:rtl w:val="0"/>
+        </w:rPr>
+        <w:t xml:space="preserve">Actually I evaluated three approaches:</w:t>
+      </w:r>
+    </w:p>
+    <w:p>
+      <w:pPr>
+        <w:numPr>
+          <w:ilvl w:val="0"/>
+          <w:numId w:val="2"/>
+        </w:numPr>
+        <w:spacing w:after="0" w:afterAutospacing="0" w:line="276" w:lineRule="auto"/>
+        <w:ind w:left="720" w:hanging="360"/>
+        <w:rPr>
+          <w:u w:val="none"/>
+        </w:rPr>
+      </w:pPr>
+      <w:r>
+        <w:rPr>
+          <w:rtl w:val="0"/>
+        </w:rPr>
+        <w:t xml:space="preserve">XGBoost regression using engineered features</w:t>
+      </w:r>
+    </w:p>
+    <w:p>
+      <w:pPr>
+        <w:numPr>
+          <w:ilvl w:val="0"/>
+          <w:numId w:val="2"/>
+        </w:numPr>
+        <w:spacing w:after="0" w:afterAutospacing="0" w:line="276" w:lineRule="auto"/>
+        <w:ind w:left="720" w:hanging="360"/>
+        <w:rPr>
+          <w:u w:val="none"/>
+        </w:rPr>
+      </w:pPr>
+      <w:r>
+        <w:rPr>
+          <w:rtl w:val="0"/>
+        </w:rPr>
+        <w:t xml:space="preserve">Prophet that is actually a model designed for time-series forecasting</w:t>
+      </w:r>
+    </w:p>
+    <w:p>
+      <w:pPr>
+        <w:numPr>
+          <w:ilvl w:val="0"/>
+          <w:numId w:val="2"/>
+        </w:numPr>
+        <w:spacing w:after="140" w:line="276" w:lineRule="auto"/>
+        <w:ind w:left="720" w:hanging="360"/>
+        <w:rPr>
+          <w:u w:val="none"/>
+        </w:rPr>
+      </w:pPr>
+      <w:r>
+        <w:rPr>
+          <w:rtl w:val="0"/>
+        </w:rPr>
+        <w:t xml:space="preserve">Naive baseline that assumes that future values remain equal to the most recent observed value</w:t>
+      </w:r>
+    </w:p>
+    <w:p>
+      <w:pPr>
+        <w:spacing w:after="140" w:line="276" w:lineRule="auto"/>
+        <w:ind w:left="0" w:firstLine="0"/>
+        <w:rPr/>
+      </w:pPr>
+      <w:r>
+        <w:rPr>
+          <w:rtl w:val="0"/>
+        </w:rPr>
+        <w:t xml:space="preserve">So as I said, Prophet was additionally tested because it is designed for such a task. Throughout experimentation with different parameters and values, I applied logarithmic transformation to the target to reduce negative predictions and that actually significantly improved the performance of the model, however it was still worse than XGBoost. Moreover I decided to train only on the most recent 365 days to remove the influence of older pandemic phases.</w:t>
+      </w:r>
+    </w:p>
+    <w:p>
+      <w:pPr>
+        <w:spacing w:after="140" w:line="276" w:lineRule="auto"/>
+        <w:ind w:left="0" w:firstLine="0"/>
+        <w:rPr/>
+      </w:pPr>
+      <w:r>
+        <w:rPr>
+          <w:rtl w:val="0"/>
+        </w:rPr>
+      </w:r>
+    </w:p>
+    <w:p>
+      <w:pPr>
+        <w:spacing w:after="140" w:line="276" w:lineRule="auto"/>
+        <w:rPr>
+          <w:sz w:val="28"/>
+          <w:szCs w:val="28"/>
+        </w:rPr>
+      </w:pPr>
+      <w:r>
+        <w:rPr>
+          <w:sz w:val="28"/>
+          <w:szCs w:val="28"/>
+          <w:rtl w:val="0"/>
+        </w:rPr>
+        <w:t xml:space="preserve">5.4 Model Validation</w:t>
+      </w:r>
+    </w:p>
+    <w:p>
+      <w:pPr>
+        <w:spacing w:after="140" w:line="276" w:lineRule="auto"/>
+        <w:rPr/>
+      </w:pPr>
+      <w:r>
+        <w:rPr>
+          <w:rtl w:val="0"/>
+        </w:rPr>
+        <w:t xml:space="preserve">I tried both the last 14 and 30 days as a chronological test set, but decided to stick with 14 since it produced better results. I intentionally avoided random train test split because it would lead to data leakage by introducing feature observations to the training data, so it would result in a model predicting either future based on future data or predicting past based on future data.</w:t>
+      </w:r>
+    </w:p>
+    <w:p>
+      <w:pPr>
+        <w:spacing w:after="140" w:line="276" w:lineRule="auto"/>
+        <w:rPr/>
+      </w:pPr>
+      <w:r>
+        <w:rPr>
+          <w:rtl w:val="0"/>
+        </w:rPr>
+        <w:t xml:space="preserve">Here are my last results I got:</w:t>
+      </w:r>
+    </w:p>
+    <w:p>
+      <w:pPr>
+        <w:spacing w:after="140" w:line="276" w:lineRule="auto"/>
+        <w:rPr/>
+      </w:pPr>
+      <w:r>
+        <w:rPr>
+          <w:rtl w:val="0"/>
+        </w:rPr>
+      </w:r>
+    </w:p>
+    <w:tbl>
+      <w:tblPr>
+        <w:tblStyle w:val="Table4"/>
+        <w:tblW w:w="9360.0" w:type="dxa"/>
+        <w:jc w:val="left"/>
+        <w:tblBorders>
+          <w:top w:color="000000" w:space="0" w:sz="8" w:val="single"/>
+          <w:left w:color="000000" w:space="0" w:sz="8" w:val="single"/>
+          <w:bottom w:color="000000" w:space="0" w:sz="8" w:val="single"/>
+          <w:right w:color="000000" w:space="0" w:sz="8" w:val="single"/>
+          <w:insideH w:color="000000" w:space="0" w:sz="8" w:val="single"/>
+          <w:insideV w:color="000000" w:space="0" w:sz="8" w:val="single"/>
+        </w:tblBorders>
+        <w:tblLayout w:type="fixed"/>
+        <w:tblLook w:val="0600"/>
+      </w:tblPr>
+      <w:tblGrid>
+        <w:gridCol w:w="2340"/>
+        <w:gridCol w:w="2340"/>
+        <w:gridCol w:w="2340"/>
+        <w:gridCol w:w="2340"/>
+        <w:tblGridChange w:id="0">
+          <w:tblGrid>
+            <w:gridCol w:w="2340"/>
+            <w:gridCol w:w="2340"/>
+            <w:gridCol w:w="2340"/>
+            <w:gridCol w:w="2340"/>
+          </w:tblGrid>
+        </w:tblGridChange>
+      </w:tblGrid>
+      <w:tr>
+        <w:trPr>
+          <w:cantSplit w:val="0"/>
+          <w:tblHeader w:val="0"/>
+        </w:trPr>
+        <w:tc>
+          <w:tcPr>
+            <w:shd w:fill="auto" w:val="clear"/>
+            <w:tcMar>
+              <w:top w:w="100.0" w:type="dxa"/>
+              <w:left w:w="100.0" w:type="dxa"/>
+              <w:bottom w:w="100.0" w:type="dxa"/>
+              <w:right w:w="100.0" w:type="dxa"/>
+            </w:tcMar>
+            <w:vAlign w:val="top"/>
+          </w:tcPr>
+          <w:p>
+            <w:pPr>
+              <w:keepNext w:val="0"/>
+              <w:keepLines w:val="0"/>
+              <w:pageBreakBefore w:val="0"/>
+              <w:widowControl w:val="0"/>
+              <w:pBdr>
+                <w:top w:space="0" w:sz="0" w:val="nil"/>
+                <w:left w:space="0" w:sz="0" w:val="nil"/>
+                <w:bottom w:space="0" w:sz="0" w:val="nil"/>
+                <w:right w:space="0" w:sz="0" w:val="nil"/>
+                <w:between w:space="0" w:sz="0" w:val="nil"/>
+              </w:pBdr>
+              <w:shd w:fill="auto" w:val="clear"/>
+              <w:spacing w:after="0" w:before="0" w:line="240" w:lineRule="auto"/>
+              <w:ind w:left="0" w:right="0" w:firstLine="0"/>
+              <w:jc w:val="left"/>
+              <w:rPr/>
+            </w:pPr>
+            <w:r>
+              <w:rPr>
+                <w:rtl w:val="0"/>
+              </w:rPr>
+              <w:t xml:space="preserve">Model</w:t>
+            </w:r>
+          </w:p>
+        </w:tc>
+        <w:tc>
+          <w:tcPr>
+            <w:shd w:fill="auto" w:val="clear"/>
+            <w:tcMar>
+              <w:top w:w="100.0" w:type="dxa"/>
+              <w:left w:w="100.0" w:type="dxa"/>
+              <w:bottom w:w="100.0" w:type="dxa"/>
+              <w:right w:w="100.0" w:type="dxa"/>
+            </w:tcMar>
+            <w:vAlign w:val="top"/>
+          </w:tcPr>
+          <w:p>
+            <w:pPr>
+              <w:keepNext w:val="0"/>
+              <w:keepLines w:val="0"/>
+              <w:pageBreakBefore w:val="0"/>
+              <w:widowControl w:val="0"/>
+              <w:pBdr>
+                <w:top w:space="0" w:sz="0" w:val="nil"/>
+                <w:left w:space="0" w:sz="0" w:val="nil"/>
+                <w:bottom w:space="0" w:sz="0" w:val="nil"/>
+                <w:right w:space="0" w:sz="0" w:val="nil"/>
+                <w:between w:space="0" w:sz="0" w:val="nil"/>
+              </w:pBdr>
+              <w:shd w:fill="auto" w:val="clear"/>
+              <w:spacing w:after="0" w:before="0" w:line="240" w:lineRule="auto"/>
+              <w:ind w:left="0" w:right="0" w:firstLine="0"/>
+              <w:jc w:val="left"/>
+              <w:rPr/>
+            </w:pPr>
+            <w:r>
+              <w:rPr>
+                <w:rtl w:val="0"/>
+              </w:rPr>
+              <w:t xml:space="preserve">MAE</w:t>
+            </w:r>
+          </w:p>
+        </w:tc>
+        <w:tc>
+          <w:tcPr>
+            <w:shd w:fill="auto" w:val="clear"/>
+            <w:tcMar>
+              <w:top w:w="100.0" w:type="dxa"/>
+              <w:left w:w="100.0" w:type="dxa"/>
+              <w:bottom w:w="100.0" w:type="dxa"/>
+              <w:right w:w="100.0" w:type="dxa"/>
+            </w:tcMar>
+            <w:vAlign w:val="top"/>
+          </w:tcPr>
+          <w:p>
+            <w:pPr>
+              <w:keepNext w:val="0"/>
+              <w:keepLines w:val="0"/>
+              <w:pageBreakBefore w:val="0"/>
+              <w:widowControl w:val="0"/>
+              <w:pBdr>
+                <w:top w:space="0" w:sz="0" w:val="nil"/>
+                <w:left w:space="0" w:sz="0" w:val="nil"/>
+                <w:bottom w:space="0" w:sz="0" w:val="nil"/>
+                <w:right w:space="0" w:sz="0" w:val="nil"/>
+                <w:between w:space="0" w:sz="0" w:val="nil"/>
+              </w:pBdr>
+              <w:shd w:fill="auto" w:val="clear"/>
+              <w:spacing w:after="0" w:before="0" w:line="240" w:lineRule="auto"/>
+              <w:ind w:left="0" w:right="0" w:firstLine="0"/>
+              <w:jc w:val="left"/>
+              <w:rPr/>
+            </w:pPr>
+            <w:r>
+              <w:rPr>
+                <w:rtl w:val="0"/>
+              </w:rPr>
+              <w:t xml:space="preserve">RMSE</w:t>
+            </w:r>
+          </w:p>
+        </w:tc>
+        <w:tc>
+          <w:tcPr>
+            <w:shd w:fill="auto" w:val="clear"/>
+            <w:tcMar>
+              <w:top w:w="100.0" w:type="dxa"/>
+              <w:left w:w="100.0" w:type="dxa"/>
+              <w:bottom w:w="100.0" w:type="dxa"/>
+              <w:right w:w="100.0" w:type="dxa"/>
+            </w:tcMar>
+            <w:vAlign w:val="top"/>
+          </w:tcPr>
+          <w:p>
+            <w:pPr>
+              <w:keepNext w:val="0"/>
+              <w:keepLines w:val="0"/>
+              <w:pageBreakBefore w:val="0"/>
+              <w:widowControl w:val="0"/>
+              <w:pBdr>
+                <w:top w:space="0" w:sz="0" w:val="nil"/>
+                <w:left w:space="0" w:sz="0" w:val="nil"/>
+                <w:bottom w:space="0" w:sz="0" w:val="nil"/>
+                <w:right w:space="0" w:sz="0" w:val="nil"/>
+                <w:between w:space="0" w:sz="0" w:val="nil"/>
+              </w:pBdr>
+              <w:shd w:fill="auto" w:val="clear"/>
+              <w:spacing w:after="0" w:before="0" w:line="240" w:lineRule="auto"/>
+              <w:ind w:left="0" w:right="0" w:firstLine="0"/>
+              <w:jc w:val="left"/>
+              <w:rPr/>
+            </w:pPr>
+            <w:r>
+              <w:rPr>
+                <w:rtl w:val="0"/>
+              </w:rPr>
+              <w:t xml:space="preserve">R^2</w:t>
+            </w:r>
+          </w:p>
+        </w:tc>
+      </w:tr>
+      <w:tr>
+        <w:trPr>
+          <w:cantSplit w:val="0"/>
+          <w:tblHeader w:val="0"/>
+        </w:trPr>
+        <w:tc>
+          <w:tcPr>
+            <w:shd w:fill="auto" w:val="clear"/>
+            <w:tcMar>
+              <w:top w:w="100.0" w:type="dxa"/>
+              <w:left w:w="100.0" w:type="dxa"/>
+              <w:bottom w:w="100.0" w:type="dxa"/>
+              <w:right w:w="100.0" w:type="dxa"/>
+            </w:tcMar>
+            <w:vAlign w:val="top"/>
+          </w:tcPr>
+          <w:p>
+            <w:pPr>
+              <w:keepNext w:val="0"/>
+              <w:keepLines w:val="0"/>
+              <w:pageBreakBefore w:val="0"/>
+              <w:widowControl w:val="0"/>
+              <w:pBdr>
+                <w:top w:space="0" w:sz="0" w:val="nil"/>
+                <w:left w:space="0" w:sz="0" w:val="nil"/>
+                <w:bottom w:space="0" w:sz="0" w:val="nil"/>
+                <w:right w:space="0" w:sz="0" w:val="nil"/>
+                <w:between w:space="0" w:sz="0" w:val="nil"/>
+              </w:pBdr>
+              <w:shd w:fill="auto" w:val="clear"/>
+              <w:spacing w:after="0" w:before="0" w:line="240" w:lineRule="auto"/>
+              <w:ind w:left="0" w:right="0" w:firstLine="0"/>
+              <w:jc w:val="left"/>
+              <w:rPr/>
+            </w:pPr>
+            <w:r>
+              <w:rPr>
+                <w:rtl w:val="0"/>
+              </w:rPr>
+              <w:t xml:space="preserve">XGBoost</w:t>
+            </w:r>
+          </w:p>
+        </w:tc>
+        <w:tc>
+          <w:tcPr>
+            <w:shd w:fill="auto" w:val="clear"/>
+            <w:tcMar>
+              <w:top w:w="100.0" w:type="dxa"/>
+              <w:left w:w="100.0" w:type="dxa"/>
+              <w:bottom w:w="100.0" w:type="dxa"/>
+              <w:right w:w="100.0" w:type="dxa"/>
+            </w:tcMar>
+            <w:vAlign w:val="top"/>
+          </w:tcPr>
+          <w:p>
+            <w:pPr>
+              <w:keepNext w:val="0"/>
+              <w:keepLines w:val="0"/>
+              <w:pageBreakBefore w:val="0"/>
+              <w:widowControl w:val="0"/>
+              <w:pBdr>
+                <w:top w:space="0" w:sz="0" w:val="nil"/>
+                <w:left w:space="0" w:sz="0" w:val="nil"/>
+                <w:bottom w:space="0" w:sz="0" w:val="nil"/>
+                <w:right w:space="0" w:sz="0" w:val="nil"/>
+                <w:between w:space="0" w:sz="0" w:val="nil"/>
+              </w:pBdr>
+              <w:shd w:fill="auto" w:val="clear"/>
+              <w:spacing w:after="0" w:before="0" w:line="240" w:lineRule="auto"/>
+              <w:ind w:left="0" w:right="0" w:firstLine="0"/>
+              <w:jc w:val="left"/>
+              <w:rPr/>
+            </w:pPr>
+            <w:r>
+              <w:rPr>
+                <w:rtl w:val="0"/>
+              </w:rPr>
+              <w:t xml:space="preserve">23.41</w:t>
+            </w:r>
+          </w:p>
+        </w:tc>
+        <w:tc>
+          <w:tcPr>
+            <w:shd w:fill="auto" w:val="clear"/>
+            <w:tcMar>
+              <w:top w:w="100.0" w:type="dxa"/>
+              <w:left w:w="100.0" w:type="dxa"/>
+              <w:bottom w:w="100.0" w:type="dxa"/>
+              <w:right w:w="100.0" w:type="dxa"/>
+            </w:tcMar>
+            <w:vAlign w:val="top"/>
+          </w:tcPr>
+          <w:p>
+            <w:pPr>
+              <w:keepNext w:val="0"/>
+              <w:keepLines w:val="0"/>
+              <w:pageBreakBefore w:val="0"/>
+              <w:widowControl w:val="0"/>
+              <w:pBdr>
+                <w:top w:space="0" w:sz="0" w:val="nil"/>
+                <w:left w:space="0" w:sz="0" w:val="nil"/>
+                <w:bottom w:space="0" w:sz="0" w:val="nil"/>
+                <w:right w:space="0" w:sz="0" w:val="nil"/>
+                <w:between w:space="0" w:sz="0" w:val="nil"/>
+              </w:pBdr>
+              <w:shd w:fill="auto" w:val="clear"/>
+              <w:spacing w:after="0" w:before="0" w:line="240" w:lineRule="auto"/>
+              <w:ind w:left="0" w:right="0" w:firstLine="0"/>
+              <w:jc w:val="left"/>
+              <w:rPr/>
+            </w:pPr>
+            <w:r>
+              <w:rPr>
+                <w:rtl w:val="0"/>
+              </w:rPr>
+              <w:t xml:space="preserve">24.27</w:t>
+            </w:r>
+          </w:p>
+        </w:tc>
+        <w:tc>
+          <w:tcPr>
+            <w:shd w:fill="auto" w:val="clear"/>
+            <w:tcMar>
+              <w:top w:w="100.0" w:type="dxa"/>
+              <w:left w:w="100.0" w:type="dxa"/>
+              <w:bottom w:w="100.0" w:type="dxa"/>
+              <w:right w:w="100.0" w:type="dxa"/>
+            </w:tcMar>
+            <w:vAlign w:val="top"/>
+          </w:tcPr>
+          <w:p>
+            <w:pPr>
+              <w:keepNext w:val="0"/>
+              <w:keepLines w:val="0"/>
+              <w:pageBreakBefore w:val="0"/>
+              <w:widowControl w:val="0"/>
+              <w:pBdr>
+                <w:top w:space="0" w:sz="0" w:val="nil"/>
+                <w:left w:space="0" w:sz="0" w:val="nil"/>
+                <w:bottom w:space="0" w:sz="0" w:val="nil"/>
+                <w:right w:space="0" w:sz="0" w:val="nil"/>
+                <w:between w:space="0" w:sz="0" w:val="nil"/>
+              </w:pBdr>
+              <w:shd w:fill="auto" w:val="clear"/>
+              <w:spacing w:after="0" w:before="0" w:line="240" w:lineRule="auto"/>
+              <w:ind w:left="0" w:right="0" w:firstLine="0"/>
+              <w:jc w:val="left"/>
+              <w:rPr/>
+            </w:pPr>
+            <w:r>
+              <w:rPr>
+                <w:rtl w:val="0"/>
+              </w:rPr>
+              <w:t xml:space="preserve">-2.2260</w:t>
+            </w:r>
+          </w:p>
+        </w:tc>
+      </w:tr>
+      <w:tr>
+        <w:trPr>
+          <w:cantSplit w:val="0"/>
+          <w:tblHeader w:val="0"/>
+        </w:trPr>
+        <w:tc>
+          <w:tcPr>
+            <w:shd w:fill="auto" w:val="clear"/>
+            <w:tcMar>
+              <w:top w:w="100.0" w:type="dxa"/>
+              <w:left w:w="100.0" w:type="dxa"/>
+              <w:bottom w:w="100.0" w:type="dxa"/>
+              <w:right w:w="100.0" w:type="dxa"/>
+            </w:tcMar>
+            <w:vAlign w:val="top"/>
+          </w:tcPr>
+          <w:p>
+            <w:pPr>
+              <w:keepNext w:val="0"/>
+              <w:keepLines w:val="0"/>
+              <w:pageBreakBefore w:val="0"/>
+              <w:widowControl w:val="0"/>
+              <w:pBdr>
+                <w:top w:space="0" w:sz="0" w:val="nil"/>
+                <w:left w:space="0" w:sz="0" w:val="nil"/>
+                <w:bottom w:space="0" w:sz="0" w:val="nil"/>
+                <w:right w:space="0" w:sz="0" w:val="nil"/>
+                <w:between w:space="0" w:sz="0" w:val="nil"/>
+              </w:pBdr>
+              <w:shd w:fill="auto" w:val="clear"/>
+              <w:spacing w:after="0" w:before="0" w:line="240" w:lineRule="auto"/>
+              <w:ind w:left="0" w:right="0" w:firstLine="0"/>
+              <w:jc w:val="left"/>
+              <w:rPr/>
+            </w:pPr>
+            <w:r>
+              <w:rPr>
+                <w:rtl w:val="0"/>
+              </w:rPr>
+              <w:t xml:space="preserve">Baseline</w:t>
+            </w:r>
+          </w:p>
+        </w:tc>
+        <w:tc>
+          <w:tcPr>
+            <w:shd w:fill="auto" w:val="clear"/>
+            <w:tcMar>
+              <w:top w:w="100.0" w:type="dxa"/>
+              <w:left w:w="100.0" w:type="dxa"/>
+              <w:bottom w:w="100.0" w:type="dxa"/>
+              <w:right w:w="100.0" w:type="dxa"/>
+            </w:tcMar>
+            <w:vAlign w:val="top"/>
+          </w:tcPr>
+          <w:p>
+            <w:pPr>
+              <w:keepNext w:val="0"/>
+              <w:keepLines w:val="0"/>
+              <w:pageBreakBefore w:val="0"/>
+              <w:widowControl w:val="0"/>
+              <w:pBdr>
+                <w:top w:space="0" w:sz="0" w:val="nil"/>
+                <w:left w:space="0" w:sz="0" w:val="nil"/>
+                <w:bottom w:space="0" w:sz="0" w:val="nil"/>
+                <w:right w:space="0" w:sz="0" w:val="nil"/>
+                <w:between w:space="0" w:sz="0" w:val="nil"/>
+              </w:pBdr>
+              <w:shd w:fill="auto" w:val="clear"/>
+              <w:spacing w:after="0" w:before="0" w:line="240" w:lineRule="auto"/>
+              <w:ind w:left="0" w:right="0" w:firstLine="0"/>
+              <w:jc w:val="left"/>
+              <w:rPr/>
+            </w:pPr>
+            <w:r>
+              <w:rPr>
+                <w:rtl w:val="0"/>
+              </w:rPr>
+              <w:t xml:space="preserve">28.51</w:t>
+            </w:r>
+          </w:p>
+        </w:tc>
+        <w:tc>
+          <w:tcPr>
+            <w:shd w:fill="auto" w:val="clear"/>
+            <w:tcMar>
+              <w:top w:w="100.0" w:type="dxa"/>
+              <w:left w:w="100.0" w:type="dxa"/>
+              <w:bottom w:w="100.0" w:type="dxa"/>
+              <w:right w:w="100.0" w:type="dxa"/>
+            </w:tcMar>
+            <w:vAlign w:val="top"/>
+          </w:tcPr>
+          <w:p>
+            <w:pPr>
+              <w:keepNext w:val="0"/>
+              <w:keepLines w:val="0"/>
+              <w:pageBreakBefore w:val="0"/>
+              <w:widowControl w:val="0"/>
+              <w:pBdr>
+                <w:top w:space="0" w:sz="0" w:val="nil"/>
+                <w:left w:space="0" w:sz="0" w:val="nil"/>
+                <w:bottom w:space="0" w:sz="0" w:val="nil"/>
+                <w:right w:space="0" w:sz="0" w:val="nil"/>
+                <w:between w:space="0" w:sz="0" w:val="nil"/>
+              </w:pBdr>
+              <w:shd w:fill="auto" w:val="clear"/>
+              <w:spacing w:after="0" w:before="0" w:line="240" w:lineRule="auto"/>
+              <w:ind w:left="0" w:right="0" w:firstLine="0"/>
+              <w:jc w:val="left"/>
+              <w:rPr/>
+            </w:pPr>
+            <w:r>
+              <w:rPr>
+                <w:rtl w:val="0"/>
+              </w:rPr>
+              <w:t xml:space="preserve">29.37</w:t>
+            </w:r>
+          </w:p>
+        </w:tc>
+        <w:tc>
+          <w:tcPr>
+            <w:shd w:fill="auto" w:val="clear"/>
+            <w:tcMar>
+              <w:top w:w="100.0" w:type="dxa"/>
+              <w:left w:w="100.0" w:type="dxa"/>
+              <w:bottom w:w="100.0" w:type="dxa"/>
+              <w:right w:w="100.0" w:type="dxa"/>
+            </w:tcMar>
+            <w:vAlign w:val="top"/>
+          </w:tcPr>
+          <w:p>
+            <w:pPr>
+              <w:keepNext w:val="0"/>
+              <w:keepLines w:val="0"/>
+              <w:pageBreakBefore w:val="0"/>
+              <w:widowControl w:val="0"/>
+              <w:pBdr>
+                <w:top w:space="0" w:sz="0" w:val="nil"/>
+                <w:left w:space="0" w:sz="0" w:val="nil"/>
+                <w:bottom w:space="0" w:sz="0" w:val="nil"/>
+                <w:right w:space="0" w:sz="0" w:val="nil"/>
+                <w:between w:space="0" w:sz="0" w:val="nil"/>
+              </w:pBdr>
+              <w:shd w:fill="auto" w:val="clear"/>
+              <w:spacing w:after="0" w:before="0" w:line="240" w:lineRule="auto"/>
+              <w:ind w:left="0" w:right="0" w:firstLine="0"/>
+              <w:jc w:val="left"/>
+              <w:rPr/>
+            </w:pPr>
+            <w:r>
+              <w:rPr>
+                <w:rtl w:val="0"/>
+              </w:rPr>
+              <w:t xml:space="preserve">-3.7257</w:t>
+            </w:r>
+          </w:p>
+        </w:tc>
+      </w:tr>
+      <w:tr>
+        <w:trPr>
+          <w:cantSplit w:val="0"/>
+          <w:tblHeader w:val="0"/>
+        </w:trPr>
+        <w:tc>
+          <w:tcPr>
+            <w:shd w:fill="auto" w:val="clear"/>
+            <w:tcMar>
+              <w:top w:w="100.0" w:type="dxa"/>
+              <w:left w:w="100.0" w:type="dxa"/>
+              <w:bottom w:w="100.0" w:type="dxa"/>
+              <w:right w:w="100.0" w:type="dxa"/>
+            </w:tcMar>
+            <w:vAlign w:val="top"/>
+          </w:tcPr>
+          <w:p>
+            <w:pPr>
+              <w:keepNext w:val="0"/>
+              <w:keepLines w:val="0"/>
+              <w:pageBreakBefore w:val="0"/>
+              <w:widowControl w:val="0"/>
+              <w:pBdr>
+                <w:top w:space="0" w:sz="0" w:val="nil"/>
+                <w:left w:space="0" w:sz="0" w:val="nil"/>
+                <w:bottom w:space="0" w:sz="0" w:val="nil"/>
+                <w:right w:space="0" w:sz="0" w:val="nil"/>
+                <w:between w:space="0" w:sz="0" w:val="nil"/>
+              </w:pBdr>
+              <w:shd w:fill="auto" w:val="clear"/>
+              <w:spacing w:after="0" w:before="0" w:line="240" w:lineRule="auto"/>
+              <w:ind w:left="0" w:right="0" w:firstLine="0"/>
+              <w:jc w:val="left"/>
+              <w:rPr/>
+            </w:pPr>
+            <w:r>
+              <w:rPr>
+                <w:rtl w:val="0"/>
+              </w:rPr>
+              <w:t xml:space="preserve">Prophet</w:t>
+            </w:r>
+          </w:p>
+        </w:tc>
+        <w:tc>
+          <w:tcPr>
+            <w:shd w:fill="auto" w:val="clear"/>
+            <w:tcMar>
+              <w:top w:w="100.0" w:type="dxa"/>
+              <w:left w:w="100.0" w:type="dxa"/>
+              <w:bottom w:w="100.0" w:type="dxa"/>
+              <w:right w:w="100.0" w:type="dxa"/>
+            </w:tcMar>
+            <w:vAlign w:val="top"/>
+          </w:tcPr>
+          <w:p>
+            <w:pPr>
+              <w:keepNext w:val="0"/>
+              <w:keepLines w:val="0"/>
+              <w:pageBreakBefore w:val="0"/>
+              <w:widowControl w:val="0"/>
+              <w:pBdr>
+                <w:top w:space="0" w:sz="0" w:val="nil"/>
+                <w:left w:space="0" w:sz="0" w:val="nil"/>
+                <w:bottom w:space="0" w:sz="0" w:val="nil"/>
+                <w:right w:space="0" w:sz="0" w:val="nil"/>
+                <w:between w:space="0" w:sz="0" w:val="nil"/>
+              </w:pBdr>
+              <w:shd w:fill="auto" w:val="clear"/>
+              <w:spacing w:after="0" w:before="0" w:line="240" w:lineRule="auto"/>
+              <w:ind w:left="0" w:right="0" w:firstLine="0"/>
+              <w:jc w:val="left"/>
+              <w:rPr/>
+            </w:pPr>
+            <w:r>
+              <w:rPr>
+                <w:rtl w:val="0"/>
+              </w:rPr>
+              <w:t xml:space="preserve">96.99</w:t>
+            </w:r>
+          </w:p>
+        </w:tc>
+        <w:tc>
+          <w:tcPr>
+            <w:shd w:fill="auto" w:val="clear"/>
+            <w:tcMar>
+              <w:top w:w="100.0" w:type="dxa"/>
+              <w:left w:w="100.0" w:type="dxa"/>
+              <w:bottom w:w="100.0" w:type="dxa"/>
+              <w:right w:w="100.0" w:type="dxa"/>
+            </w:tcMar>
+            <w:vAlign w:val="top"/>
+          </w:tcPr>
+          <w:p>
+            <w:pPr>
+              <w:keepNext w:val="0"/>
+              <w:keepLines w:val="0"/>
+              <w:pageBreakBefore w:val="0"/>
+              <w:widowControl w:val="0"/>
+              <w:pBdr>
+                <w:top w:space="0" w:sz="0" w:val="nil"/>
+                <w:left w:space="0" w:sz="0" w:val="nil"/>
+                <w:bottom w:space="0" w:sz="0" w:val="nil"/>
+                <w:right w:space="0" w:sz="0" w:val="nil"/>
+                <w:between w:space="0" w:sz="0" w:val="nil"/>
+              </w:pBdr>
+              <w:shd w:fill="auto" w:val="clear"/>
+              <w:spacing w:after="0" w:before="0" w:line="240" w:lineRule="auto"/>
+              <w:ind w:left="0" w:right="0" w:firstLine="0"/>
+              <w:jc w:val="left"/>
+              <w:rPr/>
+            </w:pPr>
+            <w:r>
+              <w:rPr>
+                <w:rtl w:val="0"/>
+              </w:rPr>
+              <w:t xml:space="preserve">98.84</w:t>
+            </w:r>
+          </w:p>
+        </w:tc>
+        <w:tc>
+          <w:tcPr>
+            <w:shd w:fill="auto" w:val="clear"/>
+            <w:tcMar>
+              <w:top w:w="100.0" w:type="dxa"/>
+              <w:left w:w="100.0" w:type="dxa"/>
+              <w:bottom w:w="100.0" w:type="dxa"/>
+              <w:right w:w="100.0" w:type="dxa"/>
+            </w:tcMar>
+            <w:vAlign w:val="top"/>
+          </w:tcPr>
+          <w:p>
+            <w:pPr>
+              <w:keepNext w:val="0"/>
+              <w:keepLines w:val="0"/>
+              <w:pageBreakBefore w:val="0"/>
+              <w:widowControl w:val="0"/>
+              <w:pBdr>
+                <w:top w:space="0" w:sz="0" w:val="nil"/>
+                <w:left w:space="0" w:sz="0" w:val="nil"/>
+                <w:bottom w:space="0" w:sz="0" w:val="nil"/>
+                <w:right w:space="0" w:sz="0" w:val="nil"/>
+                <w:between w:space="0" w:sz="0" w:val="nil"/>
+              </w:pBdr>
+              <w:shd w:fill="auto" w:val="clear"/>
+              <w:spacing w:after="0" w:before="0" w:line="240" w:lineRule="auto"/>
+              <w:ind w:left="0" w:right="0" w:firstLine="0"/>
+              <w:jc w:val="left"/>
+              <w:rPr/>
+            </w:pPr>
+            <w:r>
+              <w:rPr>
+                <w:rtl w:val="0"/>
+              </w:rPr>
+              <w:t xml:space="preserve">-52.5043</w:t>
+            </w:r>
+          </w:p>
+        </w:tc>
+      </w:tr>
+    </w:tbl>
+    <w:p>
+      <w:pPr>
+        <w:spacing w:after="140" w:line="276" w:lineRule="auto"/>
+        <w:rPr/>
+      </w:pPr>
+      <w:r>
+        <w:rPr>
+          <w:rtl w:val="0"/>
+        </w:rPr>
+      </w:r>
+    </w:p>
+    <w:p>
+      <w:pPr>
+        <w:spacing w:after="140" w:line="276" w:lineRule="auto"/>
+        <w:rPr/>
+      </w:pPr>
+      <w:r>
+        <w:rPr>
+          <w:rtl w:val="0"/>
+        </w:rPr>
+        <w:t xml:space="preserve">XGBoost achieved the lowest MAE AND RMSE and therefore produced the best short-term forecast among the tested approaches.  It also outperformed the naive persistence baseline, indicating that the engineered features provided additional predictive value.</w:t>
+      </w:r>
+    </w:p>
+    <w:p>
+      <w:pPr>
+        <w:spacing w:after="140" w:line="276" w:lineRule="auto"/>
+        <w:rPr/>
+      </w:pPr>
+      <w:r>
+        <w:rPr>
+          <w:rtl w:val="0"/>
+        </w:rPr>
+        <w:t xml:space="preserve">However R^2 remained to be negative for all models, which indicates that none of the models reproduced short-term variation well. So I suggest using forecasting results as a demonstration of the modelling pipeline rather than as an accurate epidemiological forecast.</w:t>
+      </w:r>
+    </w:p>
+    <w:p>
+      <w:pPr>
+        <w:spacing w:after="140" w:line="276" w:lineRule="auto"/>
+        <w:rPr/>
+      </w:pPr>
+      <w:r>
+        <w:rPr/>
+        <w:drawing>
+          <wp:inline distB="114300" distT="114300" distL="114300" distR="114300">
+            <wp:extent cx="5943600" cy="2971800"/>
+            <wp:effectExtent b="0" l="0" r="0" t="0"/>
+            <wp:docPr id="49" name="image38.png"/>
+            <a:graphic>
+              <a:graphicData uri="http://schemas.openxmlformats.org/drawingml/2006/picture">
+                <pic:pic>
+                  <pic:nvPicPr>
+                    <pic:cNvPr id="0" name="image38.png"/>
+                    <pic:cNvPicPr preferRelativeResize="0"/>
+                  </pic:nvPicPr>
+                  <pic:blipFill>
+                    <a:blip r:embed="rId73"/>
+                    <a:srcRect b="0" l="0" r="0" t="0"/>
+                    <a:stretch>
+                      <a:fillRect/>
+                    </a:stretch>
+                  </pic:blipFill>
+                  <pic:spPr>
+                    <a:xfrm>
+                      <a:off x="0" y="0"/>
+                      <a:ext cx="5943600" cy="2971800"/>
+                    </a:xfrm>
+                    <a:prstGeom prst="rect"/>
+                    <a:ln/>
+                  </pic:spPr>
+                </pic:pic>
+              </a:graphicData>
+            </a:graphic>
+          </wp:inline>
+        </w:drawing>
+      </w:r>
+      <w:r>
+        <w:rPr>
+          <w:rtl w:val="0"/>
+        </w:rPr>
+      </w:r>
+    </w:p>
+    <w:p>
+      <w:pPr>
+        <w:spacing w:after="140" w:line="276" w:lineRule="auto"/>
+        <w:rPr/>
+      </w:pPr>
+      <w:r>
+        <w:rPr>
+          <w:rtl w:val="0"/>
+        </w:rPr>
+        <w:t xml:space="preserve">         Picture 5.4.1 Comparison of actual values, XGBoost, Prophet and baseline predictions over 14 days</w:t>
+      </w:r>
+    </w:p>
+    <w:p>
+      <w:pPr>
+        <w:spacing w:after="140" w:line="276" w:lineRule="auto"/>
+        <w:rPr>
+          <w:sz w:val="28"/>
+          <w:szCs w:val="28"/>
+        </w:rPr>
+      </w:pPr>
+      <w:r>
+        <w:rPr>
+          <w:sz w:val="28"/>
+          <w:szCs w:val="28"/>
+          <w:rtl w:val="0"/>
+        </w:rPr>
+        <w:t xml:space="preserve">5.5. 30 days holdout experiment</w:t>
+      </w:r>
+    </w:p>
+    <w:p>
+      <w:pPr>
+        <w:spacing w:after="140" w:line="276" w:lineRule="auto"/>
+        <w:rPr/>
+      </w:pPr>
+      <w:r>
+        <w:rPr>
+          <w:rtl w:val="0"/>
+        </w:rPr>
+        <w:t xml:space="preserve">I performed a 30 day validation experiment to check whether the models remained reliable over a longer period.</w:t>
+      </w:r>
+    </w:p>
+    <w:p>
+      <w:pPr>
+        <w:spacing w:after="140" w:line="276" w:lineRule="auto"/>
+        <w:rPr/>
+      </w:pPr>
+      <w:r>
+        <w:rPr>
+          <w:rtl w:val="0"/>
+        </w:rPr>
+      </w:r>
+    </w:p>
+    <w:tbl>
+      <w:tblPr>
+        <w:tblStyle w:val="Table5"/>
+        <w:tblW w:w="9360.0" w:type="dxa"/>
+        <w:jc w:val="left"/>
+        <w:tblBorders>
+          <w:top w:color="000000" w:space="0" w:sz="8" w:val="single"/>
+          <w:left w:color="000000" w:space="0" w:sz="8" w:val="single"/>
+          <w:bottom w:color="000000" w:space="0" w:sz="8" w:val="single"/>
+          <w:right w:color="000000" w:space="0" w:sz="8" w:val="single"/>
+          <w:insideH w:color="000000" w:space="0" w:sz="8" w:val="single"/>
+          <w:insideV w:color="000000" w:space="0" w:sz="8" w:val="single"/>
+        </w:tblBorders>
+        <w:tblLayout w:type="fixed"/>
+        <w:tblLook w:val="0600"/>
+      </w:tblPr>
+      <w:tblGrid>
+        <w:gridCol w:w="3120"/>
+        <w:gridCol w:w="3120"/>
+        <w:gridCol w:w="3120"/>
+        <w:tblGridChange w:id="0">
+          <w:tblGrid>
+            <w:gridCol w:w="3120"/>
+            <w:gridCol w:w="3120"/>
+            <w:gridCol w:w="3120"/>
+          </w:tblGrid>
+        </w:tblGridChange>
+      </w:tblGrid>
+      <w:tr>
+        <w:trPr>
+          <w:cantSplit w:val="0"/>
+          <w:tblHeader w:val="0"/>
+        </w:trPr>
+        <w:tc>
+          <w:tcPr>
+            <w:shd w:fill="auto" w:val="clear"/>
+            <w:tcMar>
+              <w:top w:w="100.0" w:type="dxa"/>
+              <w:left w:w="100.0" w:type="dxa"/>
+              <w:bottom w:w="100.0" w:type="dxa"/>
+              <w:right w:w="100.0" w:type="dxa"/>
+            </w:tcMar>
+            <w:vAlign w:val="top"/>
+          </w:tcPr>
+          <w:p>
+            <w:pPr>
+              <w:widowControl w:val="0"/>
+              <w:spacing w:after="0" w:line="240" w:lineRule="auto"/>
+              <w:rPr/>
+            </w:pPr>
+            <w:r>
+              <w:rPr>
+                <w:rtl w:val="0"/>
+              </w:rPr>
+              <w:t xml:space="preserve">Model</w:t>
+            </w:r>
+          </w:p>
+        </w:tc>
+        <w:tc>
+          <w:tcPr>
+            <w:shd w:fill="auto" w:val="clear"/>
+            <w:tcMar>
+              <w:top w:w="100.0" w:type="dxa"/>
+              <w:left w:w="100.0" w:type="dxa"/>
+              <w:bottom w:w="100.0" w:type="dxa"/>
+              <w:right w:w="100.0" w:type="dxa"/>
+            </w:tcMar>
+            <w:vAlign w:val="top"/>
+          </w:tcPr>
+          <w:p>
+            <w:pPr>
+              <w:widowControl w:val="0"/>
+              <w:spacing w:after="0" w:line="240" w:lineRule="auto"/>
+              <w:rPr/>
+            </w:pPr>
+            <w:r>
+              <w:rPr>
+                <w:rtl w:val="0"/>
+              </w:rPr>
+              <w:t xml:space="preserve">MAE</w:t>
+            </w:r>
+          </w:p>
+        </w:tc>
+        <w:tc>
+          <w:tcPr>
+            <w:shd w:fill="auto" w:val="clear"/>
+            <w:tcMar>
+              <w:top w:w="100.0" w:type="dxa"/>
+              <w:left w:w="100.0" w:type="dxa"/>
+              <w:bottom w:w="100.0" w:type="dxa"/>
+              <w:right w:w="100.0" w:type="dxa"/>
+            </w:tcMar>
+            <w:vAlign w:val="top"/>
+          </w:tcPr>
+          <w:p>
+            <w:pPr>
+              <w:widowControl w:val="0"/>
+              <w:spacing w:after="0" w:line="240" w:lineRule="auto"/>
+              <w:rPr/>
+            </w:pPr>
+            <w:r>
+              <w:rPr>
+                <w:rtl w:val="0"/>
+              </w:rPr>
+              <w:t xml:space="preserve">RMSE</w:t>
+            </w:r>
+          </w:p>
+        </w:tc>
+      </w:tr>
+      <w:tr>
+        <w:trPr>
+          <w:cantSplit w:val="0"/>
+          <w:tblHeader w:val="0"/>
+        </w:trPr>
+        <w:tc>
+          <w:tcPr>
+            <w:shd w:fill="auto" w:val="clear"/>
+            <w:tcMar>
+              <w:top w:w="100.0" w:type="dxa"/>
+              <w:left w:w="100.0" w:type="dxa"/>
+              <w:bottom w:w="100.0" w:type="dxa"/>
+              <w:right w:w="100.0" w:type="dxa"/>
+            </w:tcMar>
+            <w:vAlign w:val="top"/>
+          </w:tcPr>
+          <w:p>
+            <w:pPr>
+              <w:widowControl w:val="0"/>
+              <w:spacing w:after="0" w:line="240" w:lineRule="auto"/>
+              <w:rPr/>
+            </w:pPr>
+            <w:r>
+              <w:rPr>
+                <w:rtl w:val="0"/>
+              </w:rPr>
+              <w:t xml:space="preserve">Baseline</w:t>
+            </w:r>
+          </w:p>
+        </w:tc>
+        <w:tc>
+          <w:tcPr>
+            <w:shd w:fill="auto" w:val="clear"/>
+            <w:tcMar>
+              <w:top w:w="100.0" w:type="dxa"/>
+              <w:left w:w="100.0" w:type="dxa"/>
+              <w:bottom w:w="100.0" w:type="dxa"/>
+              <w:right w:w="100.0" w:type="dxa"/>
+            </w:tcMar>
+            <w:vAlign w:val="top"/>
+          </w:tcPr>
+          <w:p>
+            <w:pPr>
+              <w:widowControl w:val="0"/>
+              <w:spacing w:after="0" w:line="240" w:lineRule="auto"/>
+              <w:rPr/>
+            </w:pPr>
+            <w:r>
+              <w:rPr>
+                <w:rtl w:val="0"/>
+              </w:rPr>
+              <w:t xml:space="preserve">20.78</w:t>
+            </w:r>
+          </w:p>
+        </w:tc>
+        <w:tc>
+          <w:tcPr>
+            <w:shd w:fill="auto" w:val="clear"/>
+            <w:tcMar>
+              <w:top w:w="100.0" w:type="dxa"/>
+              <w:left w:w="100.0" w:type="dxa"/>
+              <w:bottom w:w="100.0" w:type="dxa"/>
+              <w:right w:w="100.0" w:type="dxa"/>
+            </w:tcMar>
+            <w:vAlign w:val="top"/>
+          </w:tcPr>
+          <w:p>
+            <w:pPr>
+              <w:widowControl w:val="0"/>
+              <w:spacing w:after="0" w:line="240" w:lineRule="auto"/>
+              <w:rPr/>
+            </w:pPr>
+            <w:r>
+              <w:rPr>
+                <w:rtl w:val="0"/>
+              </w:rPr>
+              <w:t xml:space="preserve">24.11</w:t>
+            </w:r>
+          </w:p>
+        </w:tc>
+      </w:tr>
+      <w:tr>
+        <w:trPr>
+          <w:cantSplit w:val="0"/>
+          <w:tblHeader w:val="0"/>
+        </w:trPr>
+        <w:tc>
+          <w:tcPr>
+            <w:shd w:fill="auto" w:val="clear"/>
+            <w:tcMar>
+              <w:top w:w="100.0" w:type="dxa"/>
+              <w:left w:w="100.0" w:type="dxa"/>
+              <w:bottom w:w="100.0" w:type="dxa"/>
+              <w:right w:w="100.0" w:type="dxa"/>
+            </w:tcMar>
+            <w:vAlign w:val="top"/>
+          </w:tcPr>
+          <w:p>
+            <w:pPr>
+              <w:widowControl w:val="0"/>
+              <w:spacing w:after="0" w:line="240" w:lineRule="auto"/>
+              <w:rPr/>
+            </w:pPr>
+            <w:r>
+              <w:rPr>
+                <w:rtl w:val="0"/>
+              </w:rPr>
+              <w:t xml:space="preserve">XGBoost</w:t>
+            </w:r>
+          </w:p>
+        </w:tc>
+        <w:tc>
+          <w:tcPr>
+            <w:shd w:fill="auto" w:val="clear"/>
+            <w:tcMar>
+              <w:top w:w="100.0" w:type="dxa"/>
+              <w:left w:w="100.0" w:type="dxa"/>
+              <w:bottom w:w="100.0" w:type="dxa"/>
+              <w:right w:w="100.0" w:type="dxa"/>
+            </w:tcMar>
+            <w:vAlign w:val="top"/>
+          </w:tcPr>
+          <w:p>
+            <w:pPr>
+              <w:widowControl w:val="0"/>
+              <w:spacing w:after="0" w:line="240" w:lineRule="auto"/>
+              <w:rPr/>
+            </w:pPr>
+            <w:r>
+              <w:rPr>
+                <w:rtl w:val="0"/>
+              </w:rPr>
+              <w:t xml:space="preserve">23.44</w:t>
+            </w:r>
+          </w:p>
+        </w:tc>
+        <w:tc>
+          <w:tcPr>
+            <w:shd w:fill="auto" w:val="clear"/>
+            <w:tcMar>
+              <w:top w:w="100.0" w:type="dxa"/>
+              <w:left w:w="100.0" w:type="dxa"/>
+              <w:bottom w:w="100.0" w:type="dxa"/>
+              <w:right w:w="100.0" w:type="dxa"/>
+            </w:tcMar>
+            <w:vAlign w:val="top"/>
+          </w:tcPr>
+          <w:p>
+            <w:pPr>
+              <w:widowControl w:val="0"/>
+              <w:spacing w:after="0" w:line="240" w:lineRule="auto"/>
+              <w:rPr/>
+            </w:pPr>
+            <w:r>
+              <w:rPr>
+                <w:rtl w:val="0"/>
+              </w:rPr>
+              <w:t xml:space="preserve">27.00</w:t>
+            </w:r>
+          </w:p>
+        </w:tc>
+      </w:tr>
+      <w:tr>
+        <w:trPr>
+          <w:cantSplit w:val="0"/>
+          <w:tblHeader w:val="0"/>
+        </w:trPr>
+        <w:tc>
+          <w:tcPr>
+            <w:shd w:fill="auto" w:val="clear"/>
+            <w:tcMar>
+              <w:top w:w="100.0" w:type="dxa"/>
+              <w:left w:w="100.0" w:type="dxa"/>
+              <w:bottom w:w="100.0" w:type="dxa"/>
+              <w:right w:w="100.0" w:type="dxa"/>
+            </w:tcMar>
+            <w:vAlign w:val="top"/>
+          </w:tcPr>
+          <w:p>
+            <w:pPr>
+              <w:widowControl w:val="0"/>
+              <w:spacing w:after="0" w:line="240" w:lineRule="auto"/>
+              <w:rPr/>
+            </w:pPr>
+            <w:r>
+              <w:rPr>
+                <w:rtl w:val="0"/>
+              </w:rPr>
+              <w:t xml:space="preserve">Prophet</w:t>
+            </w:r>
+          </w:p>
+        </w:tc>
+        <w:tc>
+          <w:tcPr>
+            <w:shd w:fill="auto" w:val="clear"/>
+            <w:tcMar>
+              <w:top w:w="100.0" w:type="dxa"/>
+              <w:left w:w="100.0" w:type="dxa"/>
+              <w:bottom w:w="100.0" w:type="dxa"/>
+              <w:right w:w="100.0" w:type="dxa"/>
+            </w:tcMar>
+            <w:vAlign w:val="top"/>
+          </w:tcPr>
+          <w:p>
+            <w:pPr>
+              <w:widowControl w:val="0"/>
+              <w:spacing w:after="0" w:line="240" w:lineRule="auto"/>
+              <w:rPr/>
+            </w:pPr>
+            <w:r>
+              <w:rPr>
+                <w:rtl w:val="0"/>
+              </w:rPr>
+              <w:t xml:space="preserve">39.81</w:t>
+            </w:r>
+          </w:p>
+        </w:tc>
+        <w:tc>
+          <w:tcPr>
+            <w:shd w:fill="auto" w:val="clear"/>
+            <w:tcMar>
+              <w:top w:w="100.0" w:type="dxa"/>
+              <w:left w:w="100.0" w:type="dxa"/>
+              <w:bottom w:w="100.0" w:type="dxa"/>
+              <w:right w:w="100.0" w:type="dxa"/>
+            </w:tcMar>
+            <w:vAlign w:val="top"/>
+          </w:tcPr>
+          <w:p>
+            <w:pPr>
+              <w:widowControl w:val="0"/>
+              <w:spacing w:after="0" w:line="240" w:lineRule="auto"/>
+              <w:rPr/>
+            </w:pPr>
+            <w:r>
+              <w:rPr>
+                <w:rtl w:val="0"/>
+              </w:rPr>
+              <w:t xml:space="preserve">50.74</w:t>
+            </w:r>
+          </w:p>
+        </w:tc>
+      </w:tr>
+    </w:tbl>
+    <w:p>
+      <w:pPr>
+        <w:spacing w:after="140" w:line="276" w:lineRule="auto"/>
+        <w:rPr/>
+      </w:pPr>
+      <w:r>
+        <w:rPr>
+          <w:rtl w:val="0"/>
+        </w:rPr>
+      </w:r>
+    </w:p>
+    <w:p>
+      <w:pPr>
+        <w:spacing w:after="140" w:line="276" w:lineRule="auto"/>
+        <w:rPr/>
+      </w:pPr>
+      <w:r>
+        <w:rPr>
+          <w:rtl w:val="0"/>
+        </w:rPr>
+        <w:t xml:space="preserve">So within the 30 days period the baseline slightly outperformed XGBoost. This suggests that recursive XGBoost forecasting becomes less reliable as the forecasting period increases because each predicted value is reused over and over as an input for subsequent predictions. So the accumulation is the underlying stone here.</w:t>
+      </w:r>
+    </w:p>
+    <w:p>
+      <w:pPr>
+        <w:spacing w:after="140" w:line="276" w:lineRule="auto"/>
+        <w:rPr/>
+      </w:pPr>
+      <w:r>
+        <w:rPr>
+          <w:rtl w:val="0"/>
+        </w:rPr>
+        <w:t xml:space="preserve">So it is the reason why I decided to stick with the 14 days period, where XGBoost actually demonstrated better performance than the baseline.</w:t>
+      </w:r>
+    </w:p>
+    <w:p>
+      <w:pPr>
+        <w:spacing w:after="140" w:line="276" w:lineRule="auto"/>
+        <w:rPr>
+          <w:sz w:val="28"/>
+          <w:szCs w:val="28"/>
+        </w:rPr>
+      </w:pPr>
+      <w:r>
+        <w:rPr>
+          <w:sz w:val="28"/>
+          <w:szCs w:val="28"/>
+          <w:rtl w:val="0"/>
+        </w:rPr>
+        <w:t xml:space="preserve">5.6. Final Forecast</w:t>
+      </w:r>
+    </w:p>
+    <w:p>
+      <w:pPr>
+        <w:spacing w:after="140" w:line="276" w:lineRule="auto"/>
+        <w:rPr/>
+      </w:pPr>
+      <w:r>
+        <w:rPr>
+          <w:rtl w:val="0"/>
+        </w:rPr>
+        <w:t xml:space="preserve">After model selection, XGBoost was retrained using all available historical observations and used to forecast the next 14 days.</w:t>
+      </w:r>
+    </w:p>
+    <w:p>
+      <w:pPr>
+        <w:spacing w:after="140" w:line="276" w:lineRule="auto"/>
+        <w:rPr/>
+      </w:pPr>
+      <w:r>
+        <w:rPr/>
+        <w:drawing>
+          <wp:inline distB="114300" distT="114300" distL="114300" distR="114300">
+            <wp:extent cx="5943600" cy="2971800"/>
+            <wp:effectExtent b="0" l="0" r="0" t="0"/>
+            <wp:docPr id="29" name="image32.png"/>
+            <a:graphic>
+              <a:graphicData uri="http://schemas.openxmlformats.org/drawingml/2006/picture">
+                <pic:pic>
+                  <pic:nvPicPr>
+                    <pic:cNvPr id="0" name="image32.png"/>
+                    <pic:cNvPicPr preferRelativeResize="0"/>
+                  </pic:nvPicPr>
+                  <pic:blipFill>
+                    <a:blip r:embed="rId74"/>
+                    <a:srcRect b="0" l="0" r="0" t="0"/>
+                    <a:stretch>
+                      <a:fillRect/>
+                    </a:stretch>
+                  </pic:blipFill>
+                  <pic:spPr>
+                    <a:xfrm>
+                      <a:off x="0" y="0"/>
+                      <a:ext cx="5943600" cy="2971800"/>
+                    </a:xfrm>
+                    <a:prstGeom prst="rect"/>
+                    <a:ln/>
+                  </pic:spPr>
+                </pic:pic>
+              </a:graphicData>
+            </a:graphic>
+          </wp:inline>
+        </w:drawing>
+      </w:r>
+      <w:r>
+        <w:rPr>
+          <w:rtl w:val="0"/>
+        </w:rPr>
+      </w:r>
+    </w:p>
+    <w:p>
+      <w:pPr>
+        <w:spacing w:after="140" w:line="276" w:lineRule="auto"/>
+        <w:rPr/>
+      </w:pPr>
+      <w:r>
+        <w:rPr>
+          <w:rtl w:val="0"/>
+        </w:rPr>
+        <w:tab/>
+        <w:tab/>
+        <w:tab/>
+        <w:t xml:space="preserve">Picture 5.6.1 Final forecast based on the last 365 days</w:t>
+      </w:r>
+    </w:p>
+    <w:p>
+      <w:pPr>
+        <w:spacing w:after="140" w:line="276" w:lineRule="auto"/>
+        <w:rPr/>
+      </w:pPr>
+      <w:r>
+        <w:rPr>
+          <w:rtl w:val="0"/>
+        </w:rPr>
+        <w:t xml:space="preserve">The resulting forecast stabilizes at approximately 270-280 average daily cases. The relatively flat forecast is partly caused by the recursive forecasting approach and the strong importance of recent lag features as was mentioned before. So as predicted values are repeatedly used as future lag inputs, the series gradually becomes at a stable level.</w:t>
+      </w:r>
       <w:r>
         <w:rPr>
           <w:rtl w:val="0"/>
@@ -8925,6 +11138,116 @@
       <w:lvlText w:val="%1."/>
       <w:lvlJc w:val="left"/>
       <w:pPr>
+        <w:ind w:left="720" w:hanging="360"/>
+      </w:pPr>
+      <w:rPr>
+        <w:u w:val="none"/>
+      </w:rPr>
+    </w:lvl>
+    <w:lvl w:ilvl="1">
+      <w:start w:val="1"/>
+      <w:numFmt w:val="lowerLetter"/>
+      <w:lvlText w:val="%2."/>
+      <w:lvlJc w:val="left"/>
+      <w:pPr>
+        <w:ind w:left="1440" w:hanging="360"/>
+      </w:pPr>
+      <w:rPr>
+        <w:u w:val="none"/>
+      </w:rPr>
+    </w:lvl>
+    <w:lvl w:ilvl="2">
+      <w:start w:val="1"/>
+      <w:numFmt w:val="lowerRoman"/>
+      <w:lvlText w:val="%3."/>
+      <w:lvlJc w:val="right"/>
+      <w:pPr>
+        <w:ind w:left="2160" w:hanging="360"/>
+      </w:pPr>
+      <w:rPr>
+        <w:u w:val="none"/>
+      </w:rPr>
+    </w:lvl>
+    <w:lvl w:ilvl="3">
+      <w:start w:val="1"/>
+      <w:numFmt w:val="decimal"/>
+      <w:lvlText w:val="%4."/>
+      <w:lvlJc w:val="left"/>
+      <w:pPr>
+        <w:ind w:left="2880" w:hanging="360"/>
+      </w:pPr>
+      <w:rPr>
+        <w:u w:val="none"/>
+      </w:rPr>
+    </w:lvl>
+    <w:lvl w:ilvl="4">
+      <w:start w:val="1"/>
+      <w:numFmt w:val="lowerLetter"/>
+      <w:lvlText w:val="%5."/>
+      <w:lvlJc w:val="left"/>
+      <w:pPr>
+        <w:ind w:left="3600" w:hanging="360"/>
+      </w:pPr>
+      <w:rPr>
+        <w:u w:val="none"/>
+      </w:rPr>
+    </w:lvl>
+    <w:lvl w:ilvl="5">
+      <w:start w:val="1"/>
+      <w:numFmt w:val="lowerRoman"/>
+      <w:lvlText w:val="%6."/>
+      <w:lvlJc w:val="right"/>
+      <w:pPr>
+        <w:ind w:left="4320" w:hanging="360"/>
+      </w:pPr>
+      <w:rPr>
+        <w:u w:val="none"/>
+      </w:rPr>
+    </w:lvl>
+    <w:lvl w:ilvl="6">
+      <w:start w:val="1"/>
+      <w:numFmt w:val="decimal"/>
+      <w:lvlText w:val="%7."/>
+      <w:lvlJc w:val="left"/>
+      <w:pPr>
+        <w:ind w:left="5040" w:hanging="360"/>
+      </w:pPr>
+      <w:rPr>
+        <w:u w:val="none"/>
+      </w:rPr>
+    </w:lvl>
+    <w:lvl w:ilvl="7">
+      <w:start w:val="1"/>
+      <w:numFmt w:val="lowerLetter"/>
+      <w:lvlText w:val="%8."/>
+      <w:lvlJc w:val="left"/>
+      <w:pPr>
+        <w:ind w:left="5760" w:hanging="360"/>
+      </w:pPr>
+      <w:rPr>
+        <w:u w:val="none"/>
+      </w:rPr>
+    </w:lvl>
+    <w:lvl w:ilvl="8">
+      <w:start w:val="1"/>
+      <w:numFmt w:val="lowerRoman"/>
+      <w:lvlText w:val="%9."/>
+      <w:lvlJc w:val="right"/>
+      <w:pPr>
+        <w:ind w:left="6480" w:hanging="360"/>
+      </w:pPr>
+      <w:rPr>
+        <w:u w:val="none"/>
+      </w:rPr>
+    </w:lvl>
+  </w:abstractNum>
+  <w:abstractNum w:abstractNumId="3">
+    <w:lvl w:ilvl="0">
+      <w:start w:val="1"/>
+      <w:numFmt w:val="decimal"/>
+      <w:lvlText w:val="%1."/>
+      <w:lvlJc w:val="left"/>
+      <w:pPr>
         <w:ind w:left="1440" w:hanging="360"/>
       </w:pPr>
       <w:rPr>
@@ -9033,6 +11356,9 @@
   </w:num>
   <w:num w:numId="2">
     <w:abstractNumId w:val="2"/>
+  </w:num>
+  <w:num w:numId="3">
+    <w:abstractNumId w:val="3"/>
   </w:num>
 </w:numbering>
 </file>
@@ -9212,6 +11538,27 @@
     </w:tblPr>
   </w:style>
   <w:style w:type="table" w:styleId="Table2">
+    <w:basedOn w:val="TableNormal"/>
+    <w:tblPr>
+      <w:tblStyleRowBandSize w:val="1"/>
+      <w:tblStyleColBandSize w:val="1"/>
+    </w:tblPr>
+  </w:style>
+  <w:style w:type="table" w:styleId="Table3">
+    <w:basedOn w:val="TableNormal"/>
+    <w:tblPr>
+      <w:tblStyleRowBandSize w:val="1"/>
+      <w:tblStyleColBandSize w:val="1"/>
+    </w:tblPr>
+  </w:style>
+  <w:style w:type="table" w:styleId="Table4">
+    <w:basedOn w:val="TableNormal"/>
+    <w:tblPr>
+      <w:tblStyleRowBandSize w:val="1"/>
+      <w:tblStyleColBandSize w:val="1"/>
+    </w:tblPr>
+  </w:style>
+  <w:style w:type="table" w:styleId="Table5">
     <w:basedOn w:val="TableNormal"/>
     <w:tblPr>
       <w:tblStyleRowBandSize w:val="1"/>

</xml_diff>

<commit_message>
Add clusterisation and update report
</commit_message>
<xml_diff>
--- a/Report_Kirill_Postrehan_2026.docx
+++ b/Report_Kirill_Postrehan_2026.docx
@@ -23,7 +23,6 @@
         <w:rPr>
           <w:rtl w:val="0"/>
         </w:rPr>
-        <w:t xml:space="preserve">REPORT</w:t>
       </w:r>
     </w:p>
     <w:p>
@@ -122,12 +121,12 @@
             <wp:extent cx="5943600" cy="3022600"/>
             <wp:effectExtent b="0" l="0" r="0" t="0"/>
             <wp:wrapSquare wrapText="bothSides" distB="0" distT="0" distL="0" distR="0"/>
-            <wp:docPr id="46" name="image37.png"/>
+            <wp:docPr id="49" name="image36.png"/>
             <a:graphic>
               <a:graphicData uri="http://schemas.openxmlformats.org/drawingml/2006/picture">
                 <pic:pic>
                   <pic:nvPicPr>
-                    <pic:cNvPr id="0" name="image37.png"/>
+                    <pic:cNvPr id="0" name="image36.png"/>
                     <pic:cNvPicPr preferRelativeResize="0"/>
                   </pic:nvPicPr>
                   <pic:blipFill>
@@ -177,12 +176,12 @@
             <wp:extent cx="6332220" cy="2113915"/>
             <wp:effectExtent b="0" l="0" r="0" t="0"/>
             <wp:wrapSquare wrapText="bothSides" distB="0" distT="0" distL="0" distR="0"/>
-            <wp:docPr id="24" name="image12.png"/>
+            <wp:docPr id="26" name="image14.png"/>
             <a:graphic>
               <a:graphicData uri="http://schemas.openxmlformats.org/drawingml/2006/picture">
                 <pic:pic>
                   <pic:nvPicPr>
-                    <pic:cNvPr id="0" name="image12.png"/>
+                    <pic:cNvPr id="0" name="image14.png"/>
                     <pic:cNvPicPr preferRelativeResize="0"/>
                   </pic:nvPicPr>
                   <pic:blipFill>
@@ -420,12 +419,12 @@
             <wp:extent cx="5943600" cy="2152015"/>
             <wp:effectExtent b="0" l="0" r="0" t="0"/>
             <wp:wrapSquare wrapText="bothSides" distB="0" distT="0" distL="0" distR="0"/>
-            <wp:docPr id="36" name="image29.png"/>
+            <wp:docPr id="38" name="image35.png"/>
             <a:graphic>
               <a:graphicData uri="http://schemas.openxmlformats.org/drawingml/2006/picture">
                 <pic:pic>
                   <pic:nvPicPr>
-                    <pic:cNvPr id="0" name="image29.png"/>
+                    <pic:cNvPr id="0" name="image35.png"/>
                     <pic:cNvPicPr preferRelativeResize="0"/>
                   </pic:nvPicPr>
                   <pic:blipFill>
@@ -475,12 +474,12 @@
           <wp:inline distB="114300" distT="114300" distL="114300" distR="114300">
             <wp:extent cx="5943600" cy="1638300"/>
             <wp:effectExtent b="0" l="0" r="0" t="0"/>
-            <wp:docPr id="69" name="image66.png"/>
+            <wp:docPr id="75" name="image72.png"/>
             <a:graphic>
               <a:graphicData uri="http://schemas.openxmlformats.org/drawingml/2006/picture">
                 <pic:pic>
                   <pic:nvPicPr>
-                    <pic:cNvPr id="0" name="image66.png"/>
+                    <pic:cNvPr id="0" name="image72.png"/>
                     <pic:cNvPicPr preferRelativeResize="0"/>
                   </pic:nvPicPr>
                   <pic:blipFill>
@@ -541,12 +540,12 @@
           <wp:inline distB="114300" distT="114300" distL="114300" distR="114300">
             <wp:extent cx="3833813" cy="2746337"/>
             <wp:effectExtent b="0" l="0" r="0" t="0"/>
-            <wp:docPr id="6" name="image7.png"/>
+            <wp:docPr id="6" name="image10.png"/>
             <a:graphic>
               <a:graphicData uri="http://schemas.openxmlformats.org/drawingml/2006/picture">
                 <pic:pic>
                   <pic:nvPicPr>
-                    <pic:cNvPr id="0" name="image7.png"/>
+                    <pic:cNvPr id="0" name="image10.png"/>
                     <pic:cNvPicPr preferRelativeResize="0"/>
                   </pic:nvPicPr>
                   <pic:blipFill>
@@ -719,12 +718,12 @@
           <wp:inline distB="114300" distT="114300" distL="114300" distR="114300">
             <wp:extent cx="3490913" cy="1149272"/>
             <wp:effectExtent b="0" l="0" r="0" t="0"/>
-            <wp:docPr id="32" name="image25.png"/>
+            <wp:docPr id="34" name="image27.png"/>
             <a:graphic>
               <a:graphicData uri="http://schemas.openxmlformats.org/drawingml/2006/picture">
                 <pic:pic>
                   <pic:nvPicPr>
-                    <pic:cNvPr id="0" name="image25.png"/>
+                    <pic:cNvPr id="0" name="image27.png"/>
                     <pic:cNvPicPr preferRelativeResize="0"/>
                   </pic:nvPicPr>
                   <pic:blipFill>
@@ -805,12 +804,12 @@
           <wp:inline distB="114300" distT="114300" distL="114300" distR="114300">
             <wp:extent cx="5943600" cy="863600"/>
             <wp:effectExtent b="0" l="0" r="0" t="0"/>
-            <wp:docPr id="28" name="image43.png"/>
+            <wp:docPr id="30" name="image29.png"/>
             <a:graphic>
               <a:graphicData uri="http://schemas.openxmlformats.org/drawingml/2006/picture">
                 <pic:pic>
                   <pic:nvPicPr>
-                    <pic:cNvPr id="0" name="image43.png"/>
+                    <pic:cNvPr id="0" name="image29.png"/>
                     <pic:cNvPicPr preferRelativeResize="0"/>
                   </pic:nvPicPr>
                   <pic:blipFill>
@@ -901,12 +900,12 @@
           <wp:inline distB="114300" distT="114300" distL="114300" distR="114300">
             <wp:extent cx="5943600" cy="2463800"/>
             <wp:effectExtent b="0" l="0" r="0" t="0"/>
-            <wp:docPr id="23" name="image27.png"/>
+            <wp:docPr id="25" name="image26.png"/>
             <a:graphic>
               <a:graphicData uri="http://schemas.openxmlformats.org/drawingml/2006/picture">
                 <pic:pic>
                   <pic:nvPicPr>
-                    <pic:cNvPr id="0" name="image27.png"/>
+                    <pic:cNvPr id="0" name="image26.png"/>
                     <pic:cNvPicPr preferRelativeResize="0"/>
                   </pic:nvPicPr>
                   <pic:blipFill>
@@ -1042,12 +1041,12 @@
           <wp:inline distB="114300" distT="114300" distL="114300" distR="114300">
             <wp:extent cx="3190875" cy="952500"/>
             <wp:effectExtent b="0" l="0" r="0" t="0"/>
-            <wp:docPr id="59" name="image51.png"/>
+            <wp:docPr id="63" name="image70.png"/>
             <a:graphic>
               <a:graphicData uri="http://schemas.openxmlformats.org/drawingml/2006/picture">
                 <pic:pic>
                   <pic:nvPicPr>
-                    <pic:cNvPr id="0" name="image51.png"/>
+                    <pic:cNvPr id="0" name="image70.png"/>
                     <pic:cNvPicPr preferRelativeResize="0"/>
                   </pic:nvPicPr>
                   <pic:blipFill>
@@ -1157,12 +1156,12 @@
           <wp:inline distB="114300" distT="114300" distL="114300" distR="114300">
             <wp:extent cx="5943600" cy="2527300"/>
             <wp:effectExtent b="0" l="0" r="0" t="0"/>
-            <wp:docPr id="1" name="image24.png"/>
+            <wp:docPr id="1" name="image17.png"/>
             <a:graphic>
               <a:graphicData uri="http://schemas.openxmlformats.org/drawingml/2006/picture">
                 <pic:pic>
                   <pic:nvPicPr>
-                    <pic:cNvPr id="0" name="image24.png"/>
+                    <pic:cNvPr id="0" name="image17.png"/>
                     <pic:cNvPicPr preferRelativeResize="0"/>
                   </pic:nvPicPr>
                   <pic:blipFill>
@@ -1246,12 +1245,12 @@
           <wp:inline distB="114300" distT="114300" distL="114300" distR="114300">
             <wp:extent cx="5943600" cy="3098800"/>
             <wp:effectExtent b="0" l="0" r="0" t="0"/>
-            <wp:docPr id="53" name="image63.png"/>
+            <wp:docPr id="56" name="image57.png"/>
             <a:graphic>
               <a:graphicData uri="http://schemas.openxmlformats.org/drawingml/2006/picture">
                 <pic:pic>
                   <pic:nvPicPr>
-                    <pic:cNvPr id="0" name="image63.png"/>
+                    <pic:cNvPr id="0" name="image57.png"/>
                     <pic:cNvPicPr preferRelativeResize="0"/>
                   </pic:nvPicPr>
                   <pic:blipFill>
@@ -1358,12 +1357,12 @@
           <wp:inline distB="114300" distT="114300" distL="114300" distR="114300">
             <wp:extent cx="5591175" cy="790575"/>
             <wp:effectExtent b="0" l="0" r="0" t="0"/>
-            <wp:docPr id="27" name="image42.png"/>
+            <wp:docPr id="29" name="image20.png"/>
             <a:graphic>
               <a:graphicData uri="http://schemas.openxmlformats.org/drawingml/2006/picture">
                 <pic:pic>
                   <pic:nvPicPr>
-                    <pic:cNvPr id="0" name="image42.png"/>
+                    <pic:cNvPr id="0" name="image20.png"/>
                     <pic:cNvPicPr preferRelativeResize="0"/>
                   </pic:nvPicPr>
                   <pic:blipFill>
@@ -1523,12 +1522,12 @@
           <wp:inline distB="114300" distT="114300" distL="114300" distR="114300">
             <wp:extent cx="5943600" cy="711200"/>
             <wp:effectExtent b="0" l="0" r="0" t="0"/>
-            <wp:docPr id="30" name="image39.png"/>
+            <wp:docPr id="32" name="image34.png"/>
             <a:graphic>
               <a:graphicData uri="http://schemas.openxmlformats.org/drawingml/2006/picture">
                 <pic:pic>
                   <pic:nvPicPr>
-                    <pic:cNvPr id="0" name="image39.png"/>
+                    <pic:cNvPr id="0" name="image34.png"/>
                     <pic:cNvPicPr preferRelativeResize="0"/>
                   </pic:nvPicPr>
                   <pic:blipFill>
@@ -1612,12 +1611,12 @@
           <wp:inline distB="114300" distT="114300" distL="114300" distR="114300">
             <wp:extent cx="5943600" cy="711200"/>
             <wp:effectExtent b="0" l="0" r="0" t="0"/>
-            <wp:docPr id="26" name="image20.png"/>
+            <wp:docPr id="28" name="image25.png"/>
             <a:graphic>
               <a:graphicData uri="http://schemas.openxmlformats.org/drawingml/2006/picture">
                 <pic:pic>
                   <pic:nvPicPr>
-                    <pic:cNvPr id="0" name="image20.png"/>
+                    <pic:cNvPr id="0" name="image25.png"/>
                     <pic:cNvPicPr preferRelativeResize="0"/>
                   </pic:nvPicPr>
                   <pic:blipFill>
@@ -1686,12 +1685,12 @@
           <wp:inline distB="114300" distT="114300" distL="114300" distR="114300">
             <wp:extent cx="4619625" cy="1438275"/>
             <wp:effectExtent b="0" l="0" r="0" t="0"/>
-            <wp:docPr id="60" name="image50.png"/>
+            <wp:docPr id="64" name="image58.png"/>
             <a:graphic>
               <a:graphicData uri="http://schemas.openxmlformats.org/drawingml/2006/picture">
                 <pic:pic>
                   <pic:nvPicPr>
-                    <pic:cNvPr id="0" name="image50.png"/>
+                    <pic:cNvPr id="0" name="image58.png"/>
                     <pic:cNvPicPr preferRelativeResize="0"/>
                   </pic:nvPicPr>
                   <pic:blipFill>
@@ -1784,12 +1783,12 @@
           <wp:inline distB="114300" distT="114300" distL="114300" distR="114300">
             <wp:extent cx="5943600" cy="2641600"/>
             <wp:effectExtent b="0" l="0" r="0" t="0"/>
-            <wp:docPr id="66" name="image65.png"/>
+            <wp:docPr id="72" name="image74.png"/>
             <a:graphic>
               <a:graphicData uri="http://schemas.openxmlformats.org/drawingml/2006/picture">
                 <pic:pic>
                   <pic:nvPicPr>
-                    <pic:cNvPr id="0" name="image65.png"/>
+                    <pic:cNvPr id="0" name="image74.png"/>
                     <pic:cNvPicPr preferRelativeResize="0"/>
                   </pic:nvPicPr>
                   <pic:blipFill>
@@ -1873,12 +1872,12 @@
           <wp:inline distB="114300" distT="114300" distL="114300" distR="114300">
             <wp:extent cx="5943600" cy="2641600"/>
             <wp:effectExtent b="0" l="0" r="0" t="0"/>
-            <wp:docPr id="44" name="image57.png"/>
+            <wp:docPr id="47" name="image65.png"/>
             <a:graphic>
               <a:graphicData uri="http://schemas.openxmlformats.org/drawingml/2006/picture">
                 <pic:pic>
                   <pic:nvPicPr>
-                    <pic:cNvPr id="0" name="image57.png"/>
+                    <pic:cNvPr id="0" name="image65.png"/>
                     <pic:cNvPicPr preferRelativeResize="0"/>
                   </pic:nvPicPr>
                   <pic:blipFill>
@@ -1962,12 +1961,12 @@
           <wp:inline distB="114300" distT="114300" distL="114300" distR="114300">
             <wp:extent cx="4572000" cy="2571750"/>
             <wp:effectExtent b="0" l="0" r="0" t="0"/>
-            <wp:docPr id="4" name="image5.png"/>
+            <wp:docPr id="4" name="image2.png"/>
             <a:graphic>
               <a:graphicData uri="http://schemas.openxmlformats.org/drawingml/2006/picture">
                 <pic:pic>
                   <pic:nvPicPr>
-                    <pic:cNvPr id="0" name="image5.png"/>
+                    <pic:cNvPr id="0" name="image2.png"/>
                     <pic:cNvPicPr preferRelativeResize="0"/>
                   </pic:nvPicPr>
                   <pic:blipFill>
@@ -2060,12 +2059,12 @@
           <wp:inline distB="114300" distT="114300" distL="114300" distR="114300">
             <wp:extent cx="5943600" cy="3721100"/>
             <wp:effectExtent b="0" l="0" r="0" t="0"/>
-            <wp:docPr id="19" name="image9.png"/>
+            <wp:docPr id="20" name="image41.png"/>
             <a:graphic>
               <a:graphicData uri="http://schemas.openxmlformats.org/drawingml/2006/picture">
                 <pic:pic>
                   <pic:nvPicPr>
-                    <pic:cNvPr id="0" name="image9.png"/>
+                    <pic:cNvPr id="0" name="image41.png"/>
                     <pic:cNvPicPr preferRelativeResize="0"/>
                   </pic:nvPicPr>
                   <pic:blipFill>
@@ -2122,12 +2121,12 @@
           <wp:inline distB="114300" distT="114300" distL="114300" distR="114300">
             <wp:extent cx="5943600" cy="1549400"/>
             <wp:effectExtent b="0" l="0" r="0" t="0"/>
-            <wp:docPr id="12" name="image16.png"/>
+            <wp:docPr id="13" name="image11.png"/>
             <a:graphic>
               <a:graphicData uri="http://schemas.openxmlformats.org/drawingml/2006/picture">
                 <pic:pic>
                   <pic:nvPicPr>
-                    <pic:cNvPr id="0" name="image16.png"/>
+                    <pic:cNvPr id="0" name="image11.png"/>
                     <pic:cNvPicPr preferRelativeResize="0"/>
                   </pic:nvPicPr>
                   <pic:blipFill>
@@ -2197,12 +2196,12 @@
           <wp:inline distB="114300" distT="114300" distL="114300" distR="114300">
             <wp:extent cx="5943600" cy="3568700"/>
             <wp:effectExtent b="0" l="0" r="0" t="0"/>
-            <wp:docPr id="13" name="image13.png"/>
+            <wp:docPr id="14" name="image8.png"/>
             <a:graphic>
               <a:graphicData uri="http://schemas.openxmlformats.org/drawingml/2006/picture">
                 <pic:pic>
                   <pic:nvPicPr>
-                    <pic:cNvPr id="0" name="image13.png"/>
+                    <pic:cNvPr id="0" name="image8.png"/>
                     <pic:cNvPicPr preferRelativeResize="0"/>
                   </pic:nvPicPr>
                   <pic:blipFill>
@@ -2260,7 +2259,7 @@
           <wp:inline distB="114300" distT="114300" distL="114300" distR="114300">
             <wp:extent cx="5943600" cy="3568700"/>
             <wp:effectExtent b="0" l="0" r="0" t="0"/>
-            <wp:docPr id="18" name="image22.png"/>
+            <wp:docPr id="19" name="image22.png"/>
             <a:graphic>
               <a:graphicData uri="http://schemas.openxmlformats.org/drawingml/2006/picture">
                 <pic:pic>
@@ -2337,12 +2336,12 @@
           <wp:inline distB="114300" distT="114300" distL="114300" distR="114300">
             <wp:extent cx="5943600" cy="1460500"/>
             <wp:effectExtent b="0" l="0" r="0" t="0"/>
-            <wp:docPr id="63" name="image64.png"/>
+            <wp:docPr id="67" name="image67.png"/>
             <a:graphic>
               <a:graphicData uri="http://schemas.openxmlformats.org/drawingml/2006/picture">
                 <pic:pic>
                   <pic:nvPicPr>
-                    <pic:cNvPr id="0" name="image64.png"/>
+                    <pic:cNvPr id="0" name="image67.png"/>
                     <pic:cNvPicPr preferRelativeResize="0"/>
                   </pic:nvPicPr>
                   <pic:blipFill>
@@ -2400,12 +2399,12 @@
           <wp:inline distB="114300" distT="114300" distL="114300" distR="114300">
             <wp:extent cx="5943600" cy="3175000"/>
             <wp:effectExtent b="0" l="0" r="0" t="0"/>
-            <wp:docPr id="25" name="image30.png"/>
+            <wp:docPr id="27" name="image31.png"/>
             <a:graphic>
               <a:graphicData uri="http://schemas.openxmlformats.org/drawingml/2006/picture">
                 <pic:pic>
                   <pic:nvPicPr>
-                    <pic:cNvPr id="0" name="image30.png"/>
+                    <pic:cNvPr id="0" name="image31.png"/>
                     <pic:cNvPicPr preferRelativeResize="0"/>
                   </pic:nvPicPr>
                   <pic:blipFill>
@@ -2475,12 +2474,12 @@
           <wp:inline distB="114300" distT="114300" distL="114300" distR="114300">
             <wp:extent cx="5943600" cy="3835400"/>
             <wp:effectExtent b="0" l="0" r="0" t="0"/>
-            <wp:docPr id="43" name="image49.png"/>
+            <wp:docPr id="46" name="image52.png"/>
             <a:graphic>
               <a:graphicData uri="http://schemas.openxmlformats.org/drawingml/2006/picture">
                 <pic:pic>
                   <pic:nvPicPr>
-                    <pic:cNvPr id="0" name="image49.png"/>
+                    <pic:cNvPr id="0" name="image52.png"/>
                     <pic:cNvPicPr preferRelativeResize="0"/>
                   </pic:nvPicPr>
                   <pic:blipFill>
@@ -2569,12 +2568,12 @@
           <wp:inline distB="114300" distT="114300" distL="114300" distR="114300">
             <wp:extent cx="5943600" cy="3492500"/>
             <wp:effectExtent b="0" l="0" r="0" t="0"/>
-            <wp:docPr id="34" name="image36.png"/>
+            <wp:docPr id="36" name="image40.png"/>
             <a:graphic>
               <a:graphicData uri="http://schemas.openxmlformats.org/drawingml/2006/picture">
                 <pic:pic>
                   <pic:nvPicPr>
-                    <pic:cNvPr id="0" name="image36.png"/>
+                    <pic:cNvPr id="0" name="image40.png"/>
                     <pic:cNvPicPr preferRelativeResize="0"/>
                   </pic:nvPicPr>
                   <pic:blipFill>
@@ -2644,12 +2643,12 @@
           <wp:inline distB="114300" distT="114300" distL="114300" distR="114300">
             <wp:extent cx="5943600" cy="3492500"/>
             <wp:effectExtent b="0" l="0" r="0" t="0"/>
-            <wp:docPr id="14" name="image21.png"/>
+            <wp:docPr id="15" name="image28.png"/>
             <a:graphic>
               <a:graphicData uri="http://schemas.openxmlformats.org/drawingml/2006/picture">
                 <pic:pic>
                   <pic:nvPicPr>
-                    <pic:cNvPr id="0" name="image21.png"/>
+                    <pic:cNvPr id="0" name="image28.png"/>
                     <pic:cNvPicPr preferRelativeResize="0"/>
                   </pic:nvPicPr>
                   <pic:blipFill>
@@ -2801,12 +2800,12 @@
           <wp:inline distB="114300" distT="114300" distL="114300" distR="114300">
             <wp:extent cx="4486275" cy="1600200"/>
             <wp:effectExtent b="0" l="0" r="0" t="0"/>
-            <wp:docPr id="22" name="image15.png"/>
+            <wp:docPr id="24" name="image18.png"/>
             <a:graphic>
               <a:graphicData uri="http://schemas.openxmlformats.org/drawingml/2006/picture">
                 <pic:pic>
                   <pic:nvPicPr>
-                    <pic:cNvPr id="0" name="image15.png"/>
+                    <pic:cNvPr id="0" name="image18.png"/>
                     <pic:cNvPicPr preferRelativeResize="0"/>
                   </pic:nvPicPr>
                   <pic:blipFill>
@@ -2862,12 +2861,12 @@
           <wp:inline distB="114300" distT="114300" distL="114300" distR="114300">
             <wp:extent cx="4333875" cy="971550"/>
             <wp:effectExtent b="0" l="0" r="0" t="0"/>
-            <wp:docPr id="51" name="image48.png"/>
+            <wp:docPr id="54" name="image46.png"/>
             <a:graphic>
               <a:graphicData uri="http://schemas.openxmlformats.org/drawingml/2006/picture">
                 <pic:pic>
                   <pic:nvPicPr>
-                    <pic:cNvPr id="0" name="image48.png"/>
+                    <pic:cNvPr id="0" name="image46.png"/>
                     <pic:cNvPicPr preferRelativeResize="0"/>
                   </pic:nvPicPr>
                   <pic:blipFill>
@@ -2924,12 +2923,12 @@
           <wp:inline distB="114300" distT="114300" distL="114300" distR="114300">
             <wp:extent cx="5424488" cy="1143000"/>
             <wp:effectExtent b="0" l="0" r="0" t="0"/>
-            <wp:docPr id="41" name="image34.png"/>
+            <wp:docPr id="44" name="image39.png"/>
             <a:graphic>
               <a:graphicData uri="http://schemas.openxmlformats.org/drawingml/2006/picture">
                 <pic:pic>
                   <pic:nvPicPr>
-                    <pic:cNvPr id="0" name="image34.png"/>
+                    <pic:cNvPr id="0" name="image39.png"/>
                     <pic:cNvPicPr preferRelativeResize="0"/>
                   </pic:nvPicPr>
                   <pic:blipFill>
@@ -2986,12 +2985,12 @@
           <wp:inline distB="114300" distT="114300" distL="114300" distR="114300">
             <wp:extent cx="4914900" cy="1000125"/>
             <wp:effectExtent b="0" l="0" r="0" t="0"/>
-            <wp:docPr id="55" name="image41.png"/>
+            <wp:docPr id="59" name="image54.png"/>
             <a:graphic>
               <a:graphicData uri="http://schemas.openxmlformats.org/drawingml/2006/picture">
                 <pic:pic>
                   <pic:nvPicPr>
-                    <pic:cNvPr id="0" name="image41.png"/>
+                    <pic:cNvPr id="0" name="image54.png"/>
                     <pic:cNvPicPr preferRelativeResize="0"/>
                   </pic:nvPicPr>
                   <pic:blipFill>
@@ -3097,12 +3096,12 @@
           <wp:inline distB="114300" distT="114300" distL="114300" distR="114300">
             <wp:extent cx="4343400" cy="1066800"/>
             <wp:effectExtent b="0" l="0" r="0" t="0"/>
-            <wp:docPr id="39" name="image26.png"/>
+            <wp:docPr id="42" name="image37.png"/>
             <a:graphic>
               <a:graphicData uri="http://schemas.openxmlformats.org/drawingml/2006/picture">
                 <pic:pic>
                   <pic:nvPicPr>
-                    <pic:cNvPr id="0" name="image26.png"/>
+                    <pic:cNvPr id="0" name="image37.png"/>
                     <pic:cNvPicPr preferRelativeResize="0"/>
                   </pic:nvPicPr>
                   <pic:blipFill>
@@ -3158,12 +3157,12 @@
           <wp:inline distB="114300" distT="114300" distL="114300" distR="114300">
             <wp:extent cx="4981575" cy="1076325"/>
             <wp:effectExtent b="0" l="0" r="0" t="0"/>
-            <wp:docPr id="37" name="image31.png"/>
+            <wp:docPr id="39" name="image38.png"/>
             <a:graphic>
               <a:graphicData uri="http://schemas.openxmlformats.org/drawingml/2006/picture">
                 <pic:pic>
                   <pic:nvPicPr>
-                    <pic:cNvPr id="0" name="image31.png"/>
+                    <pic:cNvPr id="0" name="image38.png"/>
                     <pic:cNvPicPr preferRelativeResize="0"/>
                   </pic:nvPicPr>
                   <pic:blipFill>
@@ -3231,12 +3230,12 @@
           <wp:inline distB="114300" distT="114300" distL="114300" distR="114300">
             <wp:extent cx="2805113" cy="2577472"/>
             <wp:effectExtent b="0" l="0" r="0" t="0"/>
-            <wp:docPr id="54" name="image44.png"/>
+            <wp:docPr id="57" name="image47.png"/>
             <a:graphic>
               <a:graphicData uri="http://schemas.openxmlformats.org/drawingml/2006/picture">
                 <pic:pic>
                   <pic:nvPicPr>
-                    <pic:cNvPr id="0" name="image44.png"/>
+                    <pic:cNvPr id="0" name="image47.png"/>
                     <pic:cNvPicPr preferRelativeResize="0"/>
                   </pic:nvPicPr>
                   <pic:blipFill>
@@ -3291,12 +3290,12 @@
           <wp:inline distB="114300" distT="114300" distL="114300" distR="114300">
             <wp:extent cx="3162300" cy="1524000"/>
             <wp:effectExtent b="0" l="0" r="0" t="0"/>
-            <wp:docPr id="40" name="image33.png"/>
+            <wp:docPr id="43" name="image48.png"/>
             <a:graphic>
               <a:graphicData uri="http://schemas.openxmlformats.org/drawingml/2006/picture">
                 <pic:pic>
                   <pic:nvPicPr>
-                    <pic:cNvPr id="0" name="image33.png"/>
+                    <pic:cNvPr id="0" name="image48.png"/>
                     <pic:cNvPicPr preferRelativeResize="0"/>
                   </pic:nvPicPr>
                   <pic:blipFill>
@@ -3364,12 +3363,12 @@
           <wp:inline distB="114300" distT="114300" distL="114300" distR="114300">
             <wp:extent cx="4953000" cy="1143000"/>
             <wp:effectExtent b="0" l="0" r="0" t="0"/>
-            <wp:docPr id="33" name="image23.png"/>
+            <wp:docPr id="35" name="image30.png"/>
             <a:graphic>
               <a:graphicData uri="http://schemas.openxmlformats.org/drawingml/2006/picture">
                 <pic:pic>
                   <pic:nvPicPr>
-                    <pic:cNvPr id="0" name="image23.png"/>
+                    <pic:cNvPr id="0" name="image30.png"/>
                     <pic:cNvPicPr preferRelativeResize="0"/>
                   </pic:nvPicPr>
                   <pic:blipFill>
@@ -3439,12 +3438,12 @@
           <wp:inline distB="114300" distT="114300" distL="114300" distR="114300">
             <wp:extent cx="2733675" cy="1476375"/>
             <wp:effectExtent b="0" l="0" r="0" t="0"/>
-            <wp:docPr id="52" name="image54.png"/>
+            <wp:docPr id="55" name="image49.png"/>
             <a:graphic>
               <a:graphicData uri="http://schemas.openxmlformats.org/drawingml/2006/picture">
                 <pic:pic>
                   <pic:nvPicPr>
-                    <pic:cNvPr id="0" name="image54.png"/>
+                    <pic:cNvPr id="0" name="image49.png"/>
                     <pic:cNvPicPr preferRelativeResize="0"/>
                   </pic:nvPicPr>
                   <pic:blipFill>
@@ -3592,12 +3591,12 @@
           <wp:inline distB="114300" distT="114300" distL="114300" distR="114300">
             <wp:extent cx="5943600" cy="901700"/>
             <wp:effectExtent b="0" l="0" r="0" t="0"/>
-            <wp:docPr id="57" name="image53.png"/>
+            <wp:docPr id="61" name="image55.png"/>
             <a:graphic>
               <a:graphicData uri="http://schemas.openxmlformats.org/drawingml/2006/picture">
                 <pic:pic>
                   <pic:nvPicPr>
-                    <pic:cNvPr id="0" name="image53.png"/>
+                    <pic:cNvPr id="0" name="image55.png"/>
                     <pic:cNvPicPr preferRelativeResize="0"/>
                   </pic:nvPicPr>
                   <pic:blipFill>
@@ -3653,12 +3652,12 @@
           <wp:inline distB="114300" distT="114300" distL="114300" distR="114300">
             <wp:extent cx="5943600" cy="1968500"/>
             <wp:effectExtent b="0" l="0" r="0" t="0"/>
-            <wp:docPr id="48" name="image46.png"/>
+            <wp:docPr id="51" name="image75.png"/>
             <a:graphic>
               <a:graphicData uri="http://schemas.openxmlformats.org/drawingml/2006/picture">
                 <pic:pic>
                   <pic:nvPicPr>
-                    <pic:cNvPr id="0" name="image46.png"/>
+                    <pic:cNvPr id="0" name="image75.png"/>
                     <pic:cNvPicPr preferRelativeResize="0"/>
                   </pic:nvPicPr>
                   <pic:blipFill>
@@ -3741,12 +3740,12 @@
           <wp:inline distB="114300" distT="114300" distL="114300" distR="114300">
             <wp:extent cx="5943600" cy="2298700"/>
             <wp:effectExtent b="0" l="0" r="0" t="0"/>
-            <wp:docPr id="7" name="image14.png"/>
+            <wp:docPr id="7" name="image12.png"/>
             <a:graphic>
               <a:graphicData uri="http://schemas.openxmlformats.org/drawingml/2006/picture">
                 <pic:pic>
                   <pic:nvPicPr>
-                    <pic:cNvPr id="0" name="image14.png"/>
+                    <pic:cNvPr id="0" name="image12.png"/>
                     <pic:cNvPicPr preferRelativeResize="0"/>
                   </pic:nvPicPr>
                   <pic:blipFill>
@@ -3803,12 +3802,12 @@
           <wp:inline distB="114300" distT="114300" distL="114300" distR="114300">
             <wp:extent cx="5943600" cy="2552700"/>
             <wp:effectExtent b="0" l="0" r="0" t="0"/>
-            <wp:docPr id="64" name="image56.png"/>
+            <wp:docPr id="68" name="image69.png"/>
             <a:graphic>
               <a:graphicData uri="http://schemas.openxmlformats.org/drawingml/2006/picture">
                 <pic:pic>
                   <pic:nvPicPr>
-                    <pic:cNvPr id="0" name="image56.png"/>
+                    <pic:cNvPr id="0" name="image69.png"/>
                     <pic:cNvPicPr preferRelativeResize="0"/>
                   </pic:nvPicPr>
                   <pic:blipFill>
@@ -3869,12 +3868,12 @@
           <wp:inline distB="114300" distT="114300" distL="114300" distR="114300">
             <wp:extent cx="5943600" cy="4318000"/>
             <wp:effectExtent b="0" l="0" r="0" t="0"/>
-            <wp:docPr id="5" name="image6.png"/>
+            <wp:docPr id="5" name="image7.png"/>
             <a:graphic>
               <a:graphicData uri="http://schemas.openxmlformats.org/drawingml/2006/picture">
                 <pic:pic>
                   <pic:nvPicPr>
-                    <pic:cNvPr id="0" name="image6.png"/>
+                    <pic:cNvPr id="0" name="image7.png"/>
                     <pic:cNvPicPr preferRelativeResize="0"/>
                   </pic:nvPicPr>
                   <pic:blipFill>
@@ -4022,12 +4021,12 @@
           <wp:inline distB="114300" distT="114300" distL="114300" distR="114300">
             <wp:extent cx="5943600" cy="889000"/>
             <wp:effectExtent b="0" l="0" r="0" t="0"/>
-            <wp:docPr id="50" name="image45.png"/>
+            <wp:docPr id="53" name="image59.png"/>
             <a:graphic>
               <a:graphicData uri="http://schemas.openxmlformats.org/drawingml/2006/picture">
                 <pic:pic>
                   <pic:nvPicPr>
-                    <pic:cNvPr id="0" name="image45.png"/>
+                    <pic:cNvPr id="0" name="image59.png"/>
                     <pic:cNvPicPr preferRelativeResize="0"/>
                   </pic:nvPicPr>
                   <pic:blipFill>
@@ -5672,12 +5671,12 @@
           <wp:inline distB="114300" distT="114300" distL="114300" distR="114300">
             <wp:extent cx="3535159" cy="1471613"/>
             <wp:effectExtent b="0" l="0" r="0" t="0"/>
-            <wp:docPr id="68" name="image69.png"/>
+            <wp:docPr id="74" name="image63.png"/>
             <a:graphic>
               <a:graphicData uri="http://schemas.openxmlformats.org/drawingml/2006/picture">
                 <pic:pic>
                   <pic:nvPicPr>
-                    <pic:cNvPr id="0" name="image69.png"/>
+                    <pic:cNvPr id="0" name="image63.png"/>
                     <pic:cNvPicPr preferRelativeResize="0"/>
                   </pic:nvPicPr>
                   <pic:blipFill>
@@ -5792,7 +5791,7 @@
       <w:pPr>
         <w:numPr>
           <w:ilvl w:val="0"/>
-          <w:numId w:val="3"/>
+          <w:numId w:val="4"/>
         </w:numPr>
         <w:spacing w:after="0" w:afterAutospacing="0" w:line="276" w:lineRule="auto"/>
         <w:ind w:left="1440" w:hanging="360"/>
@@ -5811,7 +5810,7 @@
       <w:pPr>
         <w:numPr>
           <w:ilvl w:val="0"/>
-          <w:numId w:val="3"/>
+          <w:numId w:val="4"/>
         </w:numPr>
         <w:spacing w:after="0" w:afterAutospacing="0" w:line="276" w:lineRule="auto"/>
         <w:ind w:left="1440" w:hanging="360"/>
@@ -5830,7 +5829,7 @@
       <w:pPr>
         <w:numPr>
           <w:ilvl w:val="0"/>
-          <w:numId w:val="3"/>
+          <w:numId w:val="4"/>
         </w:numPr>
         <w:spacing w:after="0" w:afterAutospacing="0" w:line="276" w:lineRule="auto"/>
         <w:ind w:left="1440" w:hanging="360"/>
@@ -5849,7 +5848,7 @@
       <w:pPr>
         <w:numPr>
           <w:ilvl w:val="0"/>
-          <w:numId w:val="3"/>
+          <w:numId w:val="4"/>
         </w:numPr>
         <w:spacing w:after="140" w:line="276" w:lineRule="auto"/>
         <w:ind w:left="1440" w:hanging="360"/>
@@ -5887,12 +5886,12 @@
           <wp:inline distB="114300" distT="114300" distL="114300" distR="114300">
             <wp:extent cx="5943600" cy="1346200"/>
             <wp:effectExtent b="0" l="0" r="0" t="0"/>
-            <wp:docPr id="20" name="image8.png"/>
+            <wp:docPr id="21" name="image23.png"/>
             <a:graphic>
               <a:graphicData uri="http://schemas.openxmlformats.org/drawingml/2006/picture">
                 <pic:pic>
                   <pic:nvPicPr>
-                    <pic:cNvPr id="0" name="image8.png"/>
+                    <pic:cNvPr id="0" name="image23.png"/>
                     <pic:cNvPicPr preferRelativeResize="0"/>
                   </pic:nvPicPr>
                   <pic:blipFill>
@@ -5981,12 +5980,12 @@
           <wp:inline distB="114300" distT="114300" distL="114300" distR="114300">
             <wp:extent cx="5943600" cy="977900"/>
             <wp:effectExtent b="0" l="0" r="0" t="0"/>
-            <wp:docPr id="65" name="image58.png"/>
+            <wp:docPr id="71" name="image64.png"/>
             <a:graphic>
               <a:graphicData uri="http://schemas.openxmlformats.org/drawingml/2006/picture">
                 <pic:pic>
                   <pic:nvPicPr>
-                    <pic:cNvPr id="0" name="image58.png"/>
+                    <pic:cNvPr id="0" name="image64.png"/>
                     <pic:cNvPicPr preferRelativeResize="0"/>
                   </pic:nvPicPr>
                   <pic:blipFill>
@@ -6195,12 +6194,12 @@
           <wp:inline distB="114300" distT="114300" distL="114300" distR="114300">
             <wp:extent cx="5943600" cy="2286000"/>
             <wp:effectExtent b="0" l="0" r="0" t="0"/>
-            <wp:docPr id="62" name="image59.png"/>
+            <wp:docPr id="66" name="image68.png"/>
             <a:graphic>
               <a:graphicData uri="http://schemas.openxmlformats.org/drawingml/2006/picture">
                 <pic:pic>
                   <pic:nvPicPr>
-                    <pic:cNvPr id="0" name="image59.png"/>
+                    <pic:cNvPr id="0" name="image68.png"/>
                     <pic:cNvPicPr preferRelativeResize="0"/>
                   </pic:nvPicPr>
                   <pic:blipFill>
@@ -6257,12 +6256,12 @@
           <wp:inline distB="114300" distT="114300" distL="114300" distR="114300">
             <wp:extent cx="4333875" cy="3257550"/>
             <wp:effectExtent b="0" l="0" r="0" t="0"/>
-            <wp:docPr id="38" name="image28.png"/>
+            <wp:docPr id="41" name="image32.png"/>
             <a:graphic>
               <a:graphicData uri="http://schemas.openxmlformats.org/drawingml/2006/picture">
                 <pic:pic>
                   <pic:nvPicPr>
-                    <pic:cNvPr id="0" name="image28.png"/>
+                    <pic:cNvPr id="0" name="image32.png"/>
                     <pic:cNvPicPr preferRelativeResize="0"/>
                   </pic:nvPicPr>
                   <pic:blipFill>
@@ -6373,12 +6372,12 @@
           <wp:inline distB="114300" distT="114300" distL="114300" distR="114300">
             <wp:extent cx="5943600" cy="1625600"/>
             <wp:effectExtent b="0" l="0" r="0" t="0"/>
-            <wp:docPr id="56" name="image55.png"/>
+            <wp:docPr id="60" name="image61.png"/>
             <a:graphic>
               <a:graphicData uri="http://schemas.openxmlformats.org/drawingml/2006/picture">
                 <pic:pic>
                   <pic:nvPicPr>
-                    <pic:cNvPr id="0" name="image55.png"/>
+                    <pic:cNvPr id="0" name="image61.png"/>
                     <pic:cNvPicPr preferRelativeResize="0"/>
                   </pic:nvPicPr>
                   <pic:blipFill>
@@ -6448,12 +6447,12 @@
           <wp:inline distB="114300" distT="114300" distL="114300" distR="114300">
             <wp:extent cx="5943600" cy="1333500"/>
             <wp:effectExtent b="0" l="0" r="0" t="0"/>
-            <wp:docPr id="17" name="image11.png"/>
+            <wp:docPr id="18" name="image15.png"/>
             <a:graphic>
               <a:graphicData uri="http://schemas.openxmlformats.org/drawingml/2006/picture">
                 <pic:pic>
                   <pic:nvPicPr>
-                    <pic:cNvPr id="0" name="image11.png"/>
+                    <pic:cNvPr id="0" name="image15.png"/>
                     <pic:cNvPicPr preferRelativeResize="0"/>
                   </pic:nvPicPr>
                   <pic:blipFill>
@@ -6512,12 +6511,12 @@
           <wp:inline distB="114300" distT="114300" distL="114300" distR="114300">
             <wp:extent cx="5943600" cy="2413000"/>
             <wp:effectExtent b="0" l="0" r="0" t="0"/>
-            <wp:docPr id="21" name="image10.png"/>
+            <wp:docPr id="22" name="image19.png"/>
             <a:graphic>
               <a:graphicData uri="http://schemas.openxmlformats.org/drawingml/2006/picture">
                 <pic:pic>
                   <pic:nvPicPr>
-                    <pic:cNvPr id="0" name="image10.png"/>
+                    <pic:cNvPr id="0" name="image19.png"/>
                     <pic:cNvPicPr preferRelativeResize="0"/>
                   </pic:nvPicPr>
                   <pic:blipFill>
@@ -7526,12 +7525,12 @@
           <wp:inline distB="114300" distT="114300" distL="114300" distR="114300">
             <wp:extent cx="5943600" cy="3289300"/>
             <wp:effectExtent b="0" l="0" r="0" t="0"/>
-            <wp:docPr id="8" name="image19.png"/>
+            <wp:docPr id="8" name="image6.png"/>
             <a:graphic>
               <a:graphicData uri="http://schemas.openxmlformats.org/drawingml/2006/picture">
                 <pic:pic>
                   <pic:nvPicPr>
-                    <pic:cNvPr id="0" name="image19.png"/>
+                    <pic:cNvPr id="0" name="image6.png"/>
                     <pic:cNvPicPr preferRelativeResize="0"/>
                   </pic:nvPicPr>
                   <pic:blipFill>
@@ -7589,12 +7588,12 @@
           <wp:inline distB="114300" distT="114300" distL="114300" distR="114300">
             <wp:extent cx="2481263" cy="3369497"/>
             <wp:effectExtent b="0" l="0" r="0" t="0"/>
-            <wp:docPr id="2" name="image2.png"/>
+            <wp:docPr id="2" name="image4.png"/>
             <a:graphic>
               <a:graphicData uri="http://schemas.openxmlformats.org/drawingml/2006/picture">
                 <pic:pic>
                   <pic:nvPicPr>
-                    <pic:cNvPr id="0" name="image2.png"/>
+                    <pic:cNvPr id="0" name="image4.png"/>
                     <pic:cNvPicPr preferRelativeResize="0"/>
                   </pic:nvPicPr>
                   <pic:blipFill>
@@ -7649,12 +7648,12 @@
           <wp:inline distB="114300" distT="114300" distL="114300" distR="114300">
             <wp:extent cx="2443163" cy="3502337"/>
             <wp:effectExtent b="0" l="0" r="0" t="0"/>
-            <wp:docPr id="35" name="image35.png"/>
+            <wp:docPr id="37" name="image50.png"/>
             <a:graphic>
               <a:graphicData uri="http://schemas.openxmlformats.org/drawingml/2006/picture">
                 <pic:pic>
                   <pic:nvPicPr>
-                    <pic:cNvPr id="0" name="image35.png"/>
+                    <pic:cNvPr id="0" name="image50.png"/>
                     <pic:cNvPicPr preferRelativeResize="0"/>
                   </pic:nvPicPr>
                   <pic:blipFill>
@@ -7787,12 +7786,12 @@
           <wp:inline distB="114300" distT="114300" distL="114300" distR="114300">
             <wp:extent cx="5943600" cy="2247900"/>
             <wp:effectExtent b="0" l="0" r="0" t="0"/>
-            <wp:docPr id="9" name="image52.png"/>
+            <wp:docPr id="9" name="image13.png"/>
             <a:graphic>
               <a:graphicData uri="http://schemas.openxmlformats.org/drawingml/2006/picture">
                 <pic:pic>
                   <pic:nvPicPr>
-                    <pic:cNvPr id="0" name="image52.png"/>
+                    <pic:cNvPr id="0" name="image13.png"/>
                     <pic:cNvPicPr preferRelativeResize="0"/>
                   </pic:nvPicPr>
                   <pic:blipFill>
@@ -7917,12 +7916,12 @@
           <wp:inline distB="114300" distT="114300" distL="114300" distR="114300">
             <wp:extent cx="5943600" cy="1993900"/>
             <wp:effectExtent b="0" l="0" r="0" t="0"/>
-            <wp:docPr id="15" name="image17.png"/>
+            <wp:docPr id="16" name="image24.png"/>
             <a:graphic>
               <a:graphicData uri="http://schemas.openxmlformats.org/drawingml/2006/picture">
                 <pic:pic>
                   <pic:nvPicPr>
-                    <pic:cNvPr id="0" name="image17.png"/>
+                    <pic:cNvPr id="0" name="image24.png"/>
                     <pic:cNvPicPr preferRelativeResize="0"/>
                   </pic:nvPicPr>
                   <pic:blipFill>
@@ -7979,12 +7978,12 @@
           <wp:inline distB="114300" distT="114300" distL="114300" distR="114300">
             <wp:extent cx="5943600" cy="1993900"/>
             <wp:effectExtent b="0" l="0" r="0" t="0"/>
-            <wp:docPr id="58" name="image61.png"/>
+            <wp:docPr id="62" name="image66.png"/>
             <a:graphic>
               <a:graphicData uri="http://schemas.openxmlformats.org/drawingml/2006/picture">
                 <pic:pic>
                   <pic:nvPicPr>
-                    <pic:cNvPr id="0" name="image61.png"/>
+                    <pic:cNvPr id="0" name="image66.png"/>
                     <pic:cNvPicPr preferRelativeResize="0"/>
                   </pic:nvPicPr>
                   <pic:blipFill>
@@ -8085,12 +8084,12 @@
           <wp:inline distB="114300" distT="114300" distL="114300" distR="114300">
             <wp:extent cx="5943600" cy="1993900"/>
             <wp:effectExtent b="0" l="0" r="0" t="0"/>
-            <wp:docPr id="31" name="image40.png"/>
+            <wp:docPr id="33" name="image45.png"/>
             <a:graphic>
               <a:graphicData uri="http://schemas.openxmlformats.org/drawingml/2006/picture">
                 <pic:pic>
                   <pic:nvPicPr>
-                    <pic:cNvPr id="0" name="image40.png"/>
+                    <pic:cNvPr id="0" name="image45.png"/>
                     <pic:cNvPicPr preferRelativeResize="0"/>
                   </pic:nvPicPr>
                   <pic:blipFill>
@@ -8192,12 +8191,12 @@
           <wp:inline distB="114300" distT="114300" distL="114300" distR="114300">
             <wp:extent cx="5943600" cy="3149600"/>
             <wp:effectExtent b="0" l="0" r="0" t="0"/>
-            <wp:docPr id="42" name="image68.png"/>
+            <wp:docPr id="45" name="image53.png"/>
             <a:graphic>
               <a:graphicData uri="http://schemas.openxmlformats.org/drawingml/2006/picture">
                 <pic:pic>
                   <pic:nvPicPr>
-                    <pic:cNvPr id="0" name="image68.png"/>
+                    <pic:cNvPr id="0" name="image53.png"/>
                     <pic:cNvPicPr preferRelativeResize="0"/>
                   </pic:nvPicPr>
                   <pic:blipFill>
@@ -8321,12 +8320,12 @@
           <wp:inline distB="114300" distT="114300" distL="114300" distR="114300">
             <wp:extent cx="5943600" cy="2044700"/>
             <wp:effectExtent b="0" l="0" r="0" t="0"/>
-            <wp:docPr id="67" name="image67.png"/>
+            <wp:docPr id="73" name="image73.png"/>
             <a:graphic>
               <a:graphicData uri="http://schemas.openxmlformats.org/drawingml/2006/picture">
                 <pic:pic>
                   <pic:nvPicPr>
-                    <pic:cNvPr id="0" name="image67.png"/>
+                    <pic:cNvPr id="0" name="image73.png"/>
                     <pic:cNvPicPr preferRelativeResize="0"/>
                   </pic:nvPicPr>
                   <pic:blipFill>
@@ -8427,12 +8426,12 @@
           <wp:inline distB="114300" distT="114300" distL="114300" distR="114300">
             <wp:extent cx="5943600" cy="2070100"/>
             <wp:effectExtent b="0" l="0" r="0" t="0"/>
-            <wp:docPr id="16" name="image18.png"/>
+            <wp:docPr id="17" name="image21.png"/>
             <a:graphic>
               <a:graphicData uri="http://schemas.openxmlformats.org/drawingml/2006/picture">
                 <pic:pic>
                   <pic:nvPicPr>
-                    <pic:cNvPr id="0" name="image18.png"/>
+                    <pic:cNvPr id="0" name="image21.png"/>
                     <pic:cNvPicPr preferRelativeResize="0"/>
                   </pic:nvPicPr>
                   <pic:blipFill>
@@ -8520,12 +8519,12 @@
           <wp:inline distB="114300" distT="114300" distL="114300" distR="114300">
             <wp:extent cx="5943600" cy="3708400"/>
             <wp:effectExtent b="0" l="0" r="0" t="0"/>
-            <wp:docPr id="47" name="image47.png"/>
+            <wp:docPr id="50" name="image56.png"/>
             <a:graphic>
               <a:graphicData uri="http://schemas.openxmlformats.org/drawingml/2006/picture">
                 <pic:pic>
                   <pic:nvPicPr>
-                    <pic:cNvPr id="0" name="image47.png"/>
+                    <pic:cNvPr id="0" name="image56.png"/>
                     <pic:cNvPicPr preferRelativeResize="0"/>
                   </pic:nvPicPr>
                   <pic:blipFill>
@@ -8625,7 +8624,7 @@
           <wp:inline distB="114300" distT="114300" distL="114300" distR="114300">
             <wp:extent cx="5943600" cy="2641600"/>
             <wp:effectExtent b="0" l="0" r="0" t="0"/>
-            <wp:docPr id="61" name="image62.png"/>
+            <wp:docPr id="65" name="image62.png"/>
             <a:graphic>
               <a:graphicData uri="http://schemas.openxmlformats.org/drawingml/2006/picture">
                 <pic:pic>
@@ -8697,12 +8696,12 @@
           <wp:inline distB="114300" distT="114300" distL="114300" distR="114300">
             <wp:extent cx="5943600" cy="2641600"/>
             <wp:effectExtent b="0" l="0" r="0" t="0"/>
-            <wp:docPr id="10" name="image4.png"/>
+            <wp:docPr id="11" name="image9.png"/>
             <a:graphic>
               <a:graphicData uri="http://schemas.openxmlformats.org/drawingml/2006/picture">
                 <pic:pic>
                   <pic:nvPicPr>
-                    <pic:cNvPr id="0" name="image4.png"/>
+                    <pic:cNvPr id="0" name="image9.png"/>
                     <pic:cNvPicPr preferRelativeResize="0"/>
                   </pic:nvPicPr>
                   <pic:blipFill>
@@ -8855,12 +8854,12 @@
           <wp:inline distB="114300" distT="114300" distL="114300" distR="114300">
             <wp:extent cx="4486275" cy="1724025"/>
             <wp:effectExtent b="0" l="0" r="0" t="0"/>
-            <wp:docPr id="45" name="image60.png"/>
+            <wp:docPr id="48" name="image42.png"/>
             <a:graphic>
               <a:graphicData uri="http://schemas.openxmlformats.org/drawingml/2006/picture">
                 <pic:pic>
                   <pic:nvPicPr>
-                    <pic:cNvPr id="0" name="image60.png"/>
+                    <pic:cNvPr id="0" name="image42.png"/>
                     <pic:cNvPicPr preferRelativeResize="0"/>
                   </pic:nvPicPr>
                   <pic:blipFill>
@@ -9494,12 +9493,12 @@
           <wp:inline distB="114300" distT="114300" distL="114300" distR="114300">
             <wp:extent cx="4986338" cy="3324225"/>
             <wp:effectExtent b="0" l="0" r="0" t="0"/>
-            <wp:docPr id="11" name="image1.png"/>
+            <wp:docPr id="12" name="image5.png"/>
             <a:graphic>
               <a:graphicData uri="http://schemas.openxmlformats.org/drawingml/2006/picture">
                 <pic:pic>
                   <pic:nvPicPr>
-                    <pic:cNvPr id="0" name="image1.png"/>
+                    <pic:cNvPr id="0" name="image5.png"/>
                     <pic:cNvPicPr preferRelativeResize="0"/>
                   </pic:nvPicPr>
                   <pic:blipFill>
@@ -10428,12 +10427,12 @@
           <wp:inline distB="114300" distT="114300" distL="114300" distR="114300">
             <wp:extent cx="5943600" cy="2971800"/>
             <wp:effectExtent b="0" l="0" r="0" t="0"/>
-            <wp:docPr id="49" name="image38.png"/>
+            <wp:docPr id="52" name="image44.png"/>
             <a:graphic>
               <a:graphicData uri="http://schemas.openxmlformats.org/drawingml/2006/picture">
                 <pic:pic>
                   <pic:nvPicPr>
-                    <pic:cNvPr id="0" name="image38.png"/>
+                    <pic:cNvPr id="0" name="image44.png"/>
                     <pic:cNvPicPr preferRelativeResize="0"/>
                   </pic:nvPicPr>
                   <pic:blipFill>
@@ -10943,12 +10942,12 @@
           <wp:inline distB="114300" distT="114300" distL="114300" distR="114300">
             <wp:extent cx="5943600" cy="2971800"/>
             <wp:effectExtent b="0" l="0" r="0" t="0"/>
-            <wp:docPr id="29" name="image32.png"/>
+            <wp:docPr id="31" name="image33.png"/>
             <a:graphic>
               <a:graphicData uri="http://schemas.openxmlformats.org/drawingml/2006/picture">
                 <pic:pic>
                   <pic:nvPicPr>
-                    <pic:cNvPr id="0" name="image32.png"/>
+                    <pic:cNvPr id="0" name="image33.png"/>
                     <pic:cNvPicPr preferRelativeResize="0"/>
                   </pic:nvPicPr>
                   <pic:blipFill>
@@ -11004,6 +11003,689 @@
         </w:rPr>
         <w:t xml:space="preserve">The resulting forecast stabilizes at approximately 270-280 average daily cases. The relatively flat forecast is partly caused by the recursive forecasting approach and the strong importance of recent lag features as was mentioned before. So as predicted values are repeatedly used as future lag inputs, the series gradually becomes at a stable level.</w:t>
       </w:r>
+    </w:p>
+    <w:p>
+      <w:pPr>
+        <w:spacing w:after="140" w:line="276" w:lineRule="auto"/>
+        <w:rPr/>
+      </w:pPr>
+      <w:r>
+        <w:rPr>
+          <w:rtl w:val="0"/>
+        </w:rPr>
+      </w:r>
+    </w:p>
+    <w:p>
+      <w:pPr>
+        <w:spacing w:after="140" w:line="276" w:lineRule="auto"/>
+        <w:rPr/>
+      </w:pPr>
+      <w:r>
+        <w:rPr>
+          <w:sz w:val="28"/>
+          <w:szCs w:val="28"/>
+          <w:rtl w:val="0"/>
+        </w:rPr>
+        <w:t xml:space="preserve">5.7 Country Clustering</w:t>
+      </w:r>
+      <w:r>
+        <w:rPr>
+          <w:rtl w:val="0"/>
+        </w:rPr>
+      </w:r>
+    </w:p>
+    <w:p>
+      <w:pPr>
+        <w:spacing w:after="140" w:line="276" w:lineRule="auto"/>
+        <w:rPr/>
+      </w:pPr>
+      <w:r>
+        <w:rPr>
+          <w:rtl w:val="0"/>
+        </w:rPr>
+        <w:t xml:space="preserve">As specified in a task I decided to apply KMeans for clustering to segment countries according to similarities  in COVID_19 outcomes. Since I already mentioned that the data for 2023 is not complete, I decided to refrain from including it and stuck to 2020-2022.</w:t>
+      </w:r>
+    </w:p>
+    <w:p>
+      <w:pPr>
+        <w:spacing w:after="140" w:line="276" w:lineRule="auto"/>
+        <w:rPr/>
+      </w:pPr>
+      <w:r>
+        <w:rPr>
+          <w:rtl w:val="0"/>
+        </w:rPr>
+        <w:t xml:space="preserve">Regarding features  that were included in clustering, they are cases/deaths per 100k and case fatality rate for each year of 2020-2022 time range. I pivoted yearly rows the way so the country is represented by one row containing column outcomes for each year.</w:t>
+      </w:r>
+    </w:p>
+    <w:p>
+      <w:pPr>
+        <w:spacing w:after="140" w:line="276" w:lineRule="auto"/>
+        <w:rPr/>
+      </w:pPr>
+      <w:r>
+        <w:rPr/>
+        <w:drawing>
+          <wp:inline distB="114300" distT="114300" distL="114300" distR="114300">
+            <wp:extent cx="5943600" cy="2146300"/>
+            <wp:effectExtent b="0" l="0" r="0" t="0"/>
+            <wp:docPr id="70" name="image71.png"/>
+            <a:graphic>
+              <a:graphicData uri="http://schemas.openxmlformats.org/drawingml/2006/picture">
+                <pic:pic>
+                  <pic:nvPicPr>
+                    <pic:cNvPr id="0" name="image71.png"/>
+                    <pic:cNvPicPr preferRelativeResize="0"/>
+                  </pic:nvPicPr>
+                  <pic:blipFill>
+                    <a:blip r:embed="rId75"/>
+                    <a:srcRect b="0" l="0" r="0" t="0"/>
+                    <a:stretch>
+                      <a:fillRect/>
+                    </a:stretch>
+                  </pic:blipFill>
+                  <pic:spPr>
+                    <a:xfrm>
+                      <a:off x="0" y="0"/>
+                      <a:ext cx="5943600" cy="2146300"/>
+                    </a:xfrm>
+                    <a:prstGeom prst="rect"/>
+                    <a:ln/>
+                  </pic:spPr>
+                </pic:pic>
+              </a:graphicData>
+            </a:graphic>
+          </wp:inline>
+        </w:drawing>
+      </w:r>
+      <w:r>
+        <w:rPr>
+          <w:rtl w:val="0"/>
+        </w:rPr>
+      </w:r>
+    </w:p>
+    <w:p>
+      <w:pPr>
+        <w:spacing w:after="140" w:line="276" w:lineRule="auto"/>
+        <w:rPr/>
+      </w:pPr>
+      <w:r>
+        <w:rPr>
+          <w:rtl w:val="0"/>
+        </w:rPr>
+        <w:tab/>
+        <w:tab/>
+        <w:tab/>
+        <w:t xml:space="preserve">Picture 5.7.1 How pivoted dataset looks like</w:t>
+      </w:r>
+    </w:p>
+    <w:p>
+      <w:pPr>
+        <w:spacing w:after="140" w:line="276" w:lineRule="auto"/>
+        <w:rPr>
+          <w:sz w:val="28"/>
+          <w:szCs w:val="28"/>
+        </w:rPr>
+      </w:pPr>
+      <w:r>
+        <w:rPr>
+          <w:sz w:val="28"/>
+          <w:szCs w:val="28"/>
+          <w:rtl w:val="0"/>
+        </w:rPr>
+        <w:t xml:space="preserve">5.7.1 Data Preparation</w:t>
+      </w:r>
+    </w:p>
+    <w:p>
+      <w:pPr>
+        <w:spacing w:after="140" w:line="276" w:lineRule="auto"/>
+        <w:rPr/>
+      </w:pPr>
+      <w:r>
+        <w:rPr>
+          <w:rtl w:val="0"/>
+        </w:rPr>
+        <w:t xml:space="preserve">Since the selected variables have significantly different numerical scales, the features were standardized using StandardScaler. This was necessary because K-Means calculates distances between observations, and without scaling, variables such as cases per 100k would dominate variables such as case fatality rate simply because of their larger numerical values. And after removing countries with incomplete data for the selected years, 180 countries remained for clustering.</w:t>
+      </w:r>
+    </w:p>
+    <w:p>
+      <w:pPr>
+        <w:spacing w:after="140" w:line="276" w:lineRule="auto"/>
+        <w:rPr>
+          <w:sz w:val="28"/>
+          <w:szCs w:val="28"/>
+        </w:rPr>
+      </w:pPr>
+      <w:r>
+        <w:rPr>
+          <w:sz w:val="28"/>
+          <w:szCs w:val="28"/>
+          <w:rtl w:val="0"/>
+        </w:rPr>
+        <w:t xml:space="preserve">5.7.2 Selection of the Number of Clusters</w:t>
+      </w:r>
+    </w:p>
+    <w:p>
+      <w:pPr>
+        <w:spacing w:after="140" w:line="276" w:lineRule="auto"/>
+        <w:rPr/>
+      </w:pPr>
+      <w:r>
+        <w:rPr>
+          <w:rtl w:val="0"/>
+        </w:rPr>
+        <w:t xml:space="preserve">In order the decide on the number of clusters (k) I used three clustering validation measures:</w:t>
+      </w:r>
+    </w:p>
+    <w:p>
+      <w:pPr>
+        <w:numPr>
+          <w:ilvl w:val="0"/>
+          <w:numId w:val="3"/>
+        </w:numPr>
+        <w:spacing w:after="0" w:afterAutospacing="0" w:line="276" w:lineRule="auto"/>
+        <w:ind w:left="720" w:hanging="360"/>
+        <w:rPr>
+          <w:u w:val="none"/>
+        </w:rPr>
+      </w:pPr>
+      <w:r>
+        <w:rPr>
+          <w:rtl w:val="0"/>
+        </w:rPr>
+        <w:t xml:space="preserve">Silhouette score - higher is better separated clusters</w:t>
+      </w:r>
+    </w:p>
+    <w:p>
+      <w:pPr>
+        <w:numPr>
+          <w:ilvl w:val="0"/>
+          <w:numId w:val="3"/>
+        </w:numPr>
+        <w:spacing w:after="0" w:afterAutospacing="0" w:line="276" w:lineRule="auto"/>
+        <w:ind w:left="720" w:hanging="360"/>
+        <w:rPr>
+          <w:u w:val="none"/>
+        </w:rPr>
+      </w:pPr>
+      <w:r>
+        <w:rPr>
+          <w:rtl w:val="0"/>
+        </w:rPr>
+        <w:t xml:space="preserve">Calinski-Harabasz Score - higher means better separation of clusters</w:t>
+      </w:r>
+    </w:p>
+    <w:p>
+      <w:pPr>
+        <w:numPr>
+          <w:ilvl w:val="0"/>
+          <w:numId w:val="3"/>
+        </w:numPr>
+        <w:spacing w:after="140" w:line="276" w:lineRule="auto"/>
+        <w:ind w:left="720" w:hanging="360"/>
+        <w:rPr>
+          <w:u w:val="none"/>
+        </w:rPr>
+      </w:pPr>
+      <w:r>
+        <w:rPr>
+          <w:rtl w:val="0"/>
+        </w:rPr>
+        <w:t xml:space="preserve">Davies-Bouldin Score - lower means better clustering</w:t>
+      </w:r>
+    </w:p>
+    <w:p>
+      <w:pPr>
+        <w:spacing w:after="140" w:line="276" w:lineRule="auto"/>
+        <w:ind w:left="0" w:firstLine="0"/>
+        <w:rPr/>
+      </w:pPr>
+      <w:r>
+        <w:rPr>
+          <w:rtl w:val="0"/>
+        </w:rPr>
+        <w:t xml:space="preserve">The Silhouette reached its highest values at k=3, Davies-Bouldin Score preferred k=3, however, Calinski-Harabasz Score was highest for k=2.</w:t>
+      </w:r>
+    </w:p>
+    <w:p>
+      <w:pPr>
+        <w:spacing w:after="140" w:line="276" w:lineRule="auto"/>
+        <w:ind w:left="0" w:firstLine="720"/>
+        <w:rPr/>
+      </w:pPr>
+      <w:r>
+        <w:rPr/>
+        <w:drawing>
+          <wp:inline distB="114300" distT="114300" distL="114300" distR="114300">
+            <wp:extent cx="4767263" cy="2987179"/>
+            <wp:effectExtent b="0" l="0" r="0" t="0"/>
+            <wp:docPr id="10" name="image1.png"/>
+            <a:graphic>
+              <a:graphicData uri="http://schemas.openxmlformats.org/drawingml/2006/picture">
+                <pic:pic>
+                  <pic:nvPicPr>
+                    <pic:cNvPr id="0" name="image1.png"/>
+                    <pic:cNvPicPr preferRelativeResize="0"/>
+                  </pic:nvPicPr>
+                  <pic:blipFill>
+                    <a:blip r:embed="rId76"/>
+                    <a:srcRect b="0" l="0" r="0" t="0"/>
+                    <a:stretch>
+                      <a:fillRect/>
+                    </a:stretch>
+                  </pic:blipFill>
+                  <pic:spPr>
+                    <a:xfrm>
+                      <a:off x="0" y="0"/>
+                      <a:ext cx="4767263" cy="2987179"/>
+                    </a:xfrm>
+                    <a:prstGeom prst="rect"/>
+                    <a:ln/>
+                  </pic:spPr>
+                </pic:pic>
+              </a:graphicData>
+            </a:graphic>
+          </wp:inline>
+        </w:drawing>
+      </w:r>
+      <w:r>
+        <w:rPr>
+          <w:rtl w:val="0"/>
+        </w:rPr>
+      </w:r>
+    </w:p>
+    <w:p>
+      <w:pPr>
+        <w:spacing w:after="140" w:line="276" w:lineRule="auto"/>
+        <w:ind w:left="0" w:firstLine="720"/>
+        <w:rPr/>
+      </w:pPr>
+      <w:r>
+        <w:rPr>
+          <w:rtl w:val="0"/>
+        </w:rPr>
+        <w:tab/>
+        <w:t xml:space="preserve">     Picture 5.7.2.1 Silhouette Score for different numbers of clusters</w:t>
+      </w:r>
+    </w:p>
+    <w:p>
+      <w:pPr>
+        <w:spacing w:after="140" w:line="276" w:lineRule="auto"/>
+        <w:ind w:left="0" w:firstLine="720"/>
+        <w:rPr/>
+      </w:pPr>
+      <w:r>
+        <w:rPr/>
+        <w:drawing>
+          <wp:inline distB="114300" distT="114300" distL="114300" distR="114300">
+            <wp:extent cx="4711579" cy="2951721"/>
+            <wp:effectExtent b="0" l="0" r="0" t="0"/>
+            <wp:docPr id="23" name="image16.png"/>
+            <a:graphic>
+              <a:graphicData uri="http://schemas.openxmlformats.org/drawingml/2006/picture">
+                <pic:pic>
+                  <pic:nvPicPr>
+                    <pic:cNvPr id="0" name="image16.png"/>
+                    <pic:cNvPicPr preferRelativeResize="0"/>
+                  </pic:nvPicPr>
+                  <pic:blipFill>
+                    <a:blip r:embed="rId77"/>
+                    <a:srcRect b="0" l="0" r="0" t="0"/>
+                    <a:stretch>
+                      <a:fillRect/>
+                    </a:stretch>
+                  </pic:blipFill>
+                  <pic:spPr>
+                    <a:xfrm>
+                      <a:off x="0" y="0"/>
+                      <a:ext cx="4711579" cy="2951721"/>
+                    </a:xfrm>
+                    <a:prstGeom prst="rect"/>
+                    <a:ln/>
+                  </pic:spPr>
+                </pic:pic>
+              </a:graphicData>
+            </a:graphic>
+          </wp:inline>
+        </w:drawing>
+      </w:r>
+      <w:r>
+        <w:rPr>
+          <w:rtl w:val="0"/>
+        </w:rPr>
+      </w:r>
+    </w:p>
+    <w:p>
+      <w:pPr>
+        <w:spacing w:after="140" w:line="276" w:lineRule="auto"/>
+        <w:ind w:left="720" w:firstLine="720"/>
+        <w:rPr/>
+      </w:pPr>
+      <w:r>
+        <w:rPr>
+          <w:rtl w:val="0"/>
+        </w:rPr>
+        <w:t xml:space="preserve">Picture 5.7.2.2 Calinski-Harabasz Score for different numbers of clusters</w:t>
+      </w:r>
+    </w:p>
+    <w:p>
+      <w:pPr>
+        <w:spacing w:after="140" w:line="276" w:lineRule="auto"/>
+        <w:ind w:left="0" w:firstLine="720"/>
+        <w:rPr/>
+      </w:pPr>
+      <w:r>
+        <w:rPr/>
+        <w:drawing>
+          <wp:inline distB="114300" distT="114300" distL="114300" distR="114300">
+            <wp:extent cx="4938713" cy="3094610"/>
+            <wp:effectExtent b="0" l="0" r="0" t="0"/>
+            <wp:docPr id="69" name="image60.png"/>
+            <a:graphic>
+              <a:graphicData uri="http://schemas.openxmlformats.org/drawingml/2006/picture">
+                <pic:pic>
+                  <pic:nvPicPr>
+                    <pic:cNvPr id="0" name="image60.png"/>
+                    <pic:cNvPicPr preferRelativeResize="0"/>
+                  </pic:nvPicPr>
+                  <pic:blipFill>
+                    <a:blip r:embed="rId78"/>
+                    <a:srcRect b="0" l="0" r="0" t="0"/>
+                    <a:stretch>
+                      <a:fillRect/>
+                    </a:stretch>
+                  </pic:blipFill>
+                  <pic:spPr>
+                    <a:xfrm>
+                      <a:off x="0" y="0"/>
+                      <a:ext cx="4938713" cy="3094610"/>
+                    </a:xfrm>
+                    <a:prstGeom prst="rect"/>
+                    <a:ln/>
+                  </pic:spPr>
+                </pic:pic>
+              </a:graphicData>
+            </a:graphic>
+          </wp:inline>
+        </w:drawing>
+      </w:r>
+      <w:r>
+        <w:rPr>
+          <w:rtl w:val="0"/>
+        </w:rPr>
+      </w:r>
+    </w:p>
+    <w:p>
+      <w:pPr>
+        <w:spacing w:after="140" w:line="276" w:lineRule="auto"/>
+        <w:ind w:left="720" w:firstLine="720"/>
+        <w:rPr/>
+      </w:pPr>
+      <w:r>
+        <w:rPr>
+          <w:rtl w:val="0"/>
+        </w:rPr>
+        <w:t xml:space="preserve">Picture 5.7.2.3 Davies-Bouldin Score for different numbers of clusters</w:t>
+      </w:r>
+    </w:p>
+    <w:p>
+      <w:pPr>
+        <w:spacing w:after="140" w:line="276" w:lineRule="auto"/>
+        <w:ind w:left="720" w:firstLine="0"/>
+        <w:rPr/>
+      </w:pPr>
+      <w:r>
+        <w:rPr>
+          <w:rtl w:val="0"/>
+        </w:rPr>
+      </w:r>
+    </w:p>
+    <w:p>
+      <w:pPr>
+        <w:spacing w:after="140" w:line="276" w:lineRule="auto"/>
+        <w:ind w:left="720" w:firstLine="0"/>
+        <w:rPr/>
+      </w:pPr>
+      <w:r>
+        <w:rPr>
+          <w:rtl w:val="0"/>
+        </w:rPr>
+        <w:t xml:space="preserve">Although two of the three metrics favoured three clusters, inspection of the resulting cluster sizes showed that the k=3 solution created clusters containing 59, 120 and only 1 country respectively. The third cluster contained only Yemen.</w:t>
+      </w:r>
+    </w:p>
+    <w:p>
+      <w:pPr>
+        <w:spacing w:after="140" w:line="276" w:lineRule="auto"/>
+        <w:ind w:left="720" w:firstLine="0"/>
+        <w:rPr/>
+      </w:pPr>
+      <w:r>
+        <w:rPr>
+          <w:rtl w:val="0"/>
+        </w:rPr>
+      </w:r>
+    </w:p>
+    <w:p>
+      <w:pPr>
+        <w:spacing w:after="140" w:line="276" w:lineRule="auto"/>
+        <w:ind w:left="0" w:firstLine="0"/>
+        <w:rPr>
+          <w:sz w:val="28"/>
+          <w:szCs w:val="28"/>
+        </w:rPr>
+      </w:pPr>
+      <w:r>
+        <w:rPr>
+          <w:sz w:val="28"/>
+          <w:szCs w:val="28"/>
+          <w:rtl w:val="0"/>
+        </w:rPr>
+        <w:t xml:space="preserve">5.7.3 Final Cluster Selection</w:t>
+      </w:r>
+    </w:p>
+    <w:p>
+      <w:pPr>
+        <w:spacing w:after="140" w:line="276" w:lineRule="auto"/>
+        <w:ind w:left="0" w:firstLine="0"/>
+        <w:rPr/>
+      </w:pPr>
+      <w:r>
+        <w:rPr>
+          <w:rtl w:val="0"/>
+        </w:rPr>
+        <w:t xml:space="preserve">For this reason, the final selection was not based only on the highest Silhouette Score. Cluster balance and interpretability were also considered. Although k=3 produced slightly better Silhouette and Davies-Bouldin values, the additional cluster represented only one extreme observation. Therefore, k=2 was selected as a more interpretable segmentation of countries.</w:t>
+      </w:r>
+    </w:p>
+    <w:p>
+      <w:pPr>
+        <w:spacing w:after="140" w:line="276" w:lineRule="auto"/>
+        <w:ind w:left="0" w:firstLine="720"/>
+        <w:rPr/>
+      </w:pPr>
+      <w:r>
+        <w:rPr/>
+        <w:drawing>
+          <wp:inline distB="114300" distT="114300" distL="114300" distR="114300">
+            <wp:extent cx="4767263" cy="3338612"/>
+            <wp:effectExtent b="0" l="0" r="0" t="0"/>
+            <wp:docPr id="58" name="image51.png"/>
+            <a:graphic>
+              <a:graphicData uri="http://schemas.openxmlformats.org/drawingml/2006/picture">
+                <pic:pic>
+                  <pic:nvPicPr>
+                    <pic:cNvPr id="0" name="image51.png"/>
+                    <pic:cNvPicPr preferRelativeResize="0"/>
+                  </pic:nvPicPr>
+                  <pic:blipFill>
+                    <a:blip r:embed="rId79"/>
+                    <a:srcRect b="0" l="0" r="0" t="0"/>
+                    <a:stretch>
+                      <a:fillRect/>
+                    </a:stretch>
+                  </pic:blipFill>
+                  <pic:spPr>
+                    <a:xfrm>
+                      <a:off x="0" y="0"/>
+                      <a:ext cx="4767263" cy="3338612"/>
+                    </a:xfrm>
+                    <a:prstGeom prst="rect"/>
+                    <a:ln/>
+                  </pic:spPr>
+                </pic:pic>
+              </a:graphicData>
+            </a:graphic>
+          </wp:inline>
+        </w:drawing>
+      </w:r>
+      <w:r>
+        <w:rPr>
+          <w:rtl w:val="0"/>
+        </w:rPr>
+      </w:r>
+    </w:p>
+    <w:p>
+      <w:pPr>
+        <w:spacing w:after="140" w:line="276" w:lineRule="auto"/>
+        <w:ind w:left="1440" w:firstLine="0"/>
+        <w:rPr/>
+      </w:pPr>
+      <w:r>
+        <w:rPr>
+          <w:rtl w:val="0"/>
+        </w:rPr>
+        <w:t xml:space="preserve">      Picture 5.7.3 PCA visualization of COVID-19 country clusters</w:t>
+      </w:r>
+    </w:p>
+    <w:p>
+      <w:pPr>
+        <w:spacing w:after="140" w:line="276" w:lineRule="auto"/>
+        <w:ind w:left="1440" w:firstLine="0"/>
+        <w:rPr/>
+      </w:pPr>
+      <w:r>
+        <w:rPr>
+          <w:rtl w:val="0"/>
+        </w:rPr>
+      </w:r>
+    </w:p>
+    <w:p>
+      <w:pPr>
+        <w:spacing w:after="140" w:line="276" w:lineRule="auto"/>
+        <w:ind w:left="0" w:firstLine="0"/>
+        <w:rPr/>
+      </w:pPr>
+      <w:r>
+        <w:rPr>
+          <w:rtl w:val="0"/>
+        </w:rPr>
+        <w:t xml:space="preserve">PCA was used for visualization of the high-dimensional clustering results. The actual K-Means model was trained using all standardized features, while PCA reduced them to two components so that the country groups could be displayed on a two-dimensional chart.</w:t>
+      </w:r>
+    </w:p>
+    <w:p>
+      <w:pPr>
+        <w:spacing w:after="140" w:line="276" w:lineRule="auto"/>
+        <w:ind w:left="0" w:firstLine="0"/>
+        <w:rPr/>
+      </w:pPr>
+      <w:r>
+        <w:rPr>
+          <w:rtl w:val="0"/>
+        </w:rPr>
+      </w:r>
+    </w:p>
+    <w:p>
+      <w:pPr>
+        <w:spacing w:after="140" w:line="276" w:lineRule="auto"/>
+        <w:ind w:left="0" w:firstLine="0"/>
+        <w:rPr>
+          <w:sz w:val="28"/>
+          <w:szCs w:val="28"/>
+        </w:rPr>
+      </w:pPr>
+      <w:r>
+        <w:rPr>
+          <w:sz w:val="28"/>
+          <w:szCs w:val="28"/>
+          <w:rtl w:val="0"/>
+        </w:rPr>
+        <w:t xml:space="preserve">5.7.4 Interpretation of Clusters</w:t>
+      </w:r>
+    </w:p>
+    <w:p>
+      <w:pPr>
+        <w:spacing w:after="140" w:line="276" w:lineRule="auto"/>
+        <w:ind w:left="0" w:firstLine="0"/>
+        <w:rPr/>
+      </w:pPr>
+      <w:r>
+        <w:rPr>
+          <w:rtl w:val="0"/>
+        </w:rPr>
+        <w:t xml:space="preserve">The two clusters represent countries with different COVID-19 outcome profiles. One group contains countries with generally higher reported cases and deaths per 100,000 people, while the other contains countries with lower reported values. The cluster association should not be interpreted alone as evidence that geography or economic development directly caused these differences, since other factors may also influence the recorded statistics.</w:t>
+      </w:r>
+    </w:p>
+    <w:p>
+      <w:pPr>
+        <w:spacing w:after="140" w:line="276" w:lineRule="auto"/>
+        <w:ind w:left="0" w:firstLine="0"/>
+        <w:rPr/>
+      </w:pPr>
+      <w:r>
+        <w:rPr/>
+        <w:drawing>
+          <wp:inline distB="114300" distT="114300" distL="114300" distR="114300">
+            <wp:extent cx="5943600" cy="1066800"/>
+            <wp:effectExtent b="0" l="0" r="0" t="0"/>
+            <wp:docPr id="40" name="image43.png"/>
+            <a:graphic>
+              <a:graphicData uri="http://schemas.openxmlformats.org/drawingml/2006/picture">
+                <pic:pic>
+                  <pic:nvPicPr>
+                    <pic:cNvPr id="0" name="image43.png"/>
+                    <pic:cNvPicPr preferRelativeResize="0"/>
+                  </pic:nvPicPr>
+                  <pic:blipFill>
+                    <a:blip r:embed="rId80"/>
+                    <a:srcRect b="0" l="0" r="0" t="0"/>
+                    <a:stretch>
+                      <a:fillRect/>
+                    </a:stretch>
+                  </pic:blipFill>
+                  <pic:spPr>
+                    <a:xfrm>
+                      <a:off x="0" y="0"/>
+                      <a:ext cx="5943600" cy="1066800"/>
+                    </a:xfrm>
+                    <a:prstGeom prst="rect"/>
+                    <a:ln/>
+                  </pic:spPr>
+                </pic:pic>
+              </a:graphicData>
+            </a:graphic>
+          </wp:inline>
+        </w:drawing>
+      </w:r>
+      <w:r>
+        <w:rPr>
+          <w:rtl w:val="0"/>
+        </w:rPr>
+      </w:r>
+    </w:p>
+    <w:p>
+      <w:pPr>
+        <w:spacing w:after="140" w:line="276" w:lineRule="auto"/>
+        <w:ind w:left="0" w:firstLine="0"/>
+        <w:rPr/>
+      </w:pPr>
+      <w:r>
+        <w:rPr>
+          <w:rtl w:val="0"/>
+        </w:rPr>
+        <w:tab/>
+        <w:tab/>
+        <w:tab/>
+        <w:t xml:space="preserve">  Picture 5.7.4 Average values each cluster has</w:t>
+      </w:r>
       <w:r>
         <w:rPr>
           <w:rtl w:val="0"/>
@@ -11248,6 +11930,116 @@
       <w:lvlText w:val="%1."/>
       <w:lvlJc w:val="left"/>
       <w:pPr>
+        <w:ind w:left="720" w:hanging="360"/>
+      </w:pPr>
+      <w:rPr>
+        <w:u w:val="none"/>
+      </w:rPr>
+    </w:lvl>
+    <w:lvl w:ilvl="1">
+      <w:start w:val="1"/>
+      <w:numFmt w:val="lowerLetter"/>
+      <w:lvlText w:val="%2."/>
+      <w:lvlJc w:val="left"/>
+      <w:pPr>
+        <w:ind w:left="1440" w:hanging="360"/>
+      </w:pPr>
+      <w:rPr>
+        <w:u w:val="none"/>
+      </w:rPr>
+    </w:lvl>
+    <w:lvl w:ilvl="2">
+      <w:start w:val="1"/>
+      <w:numFmt w:val="lowerRoman"/>
+      <w:lvlText w:val="%3."/>
+      <w:lvlJc w:val="right"/>
+      <w:pPr>
+        <w:ind w:left="2160" w:hanging="360"/>
+      </w:pPr>
+      <w:rPr>
+        <w:u w:val="none"/>
+      </w:rPr>
+    </w:lvl>
+    <w:lvl w:ilvl="3">
+      <w:start w:val="1"/>
+      <w:numFmt w:val="decimal"/>
+      <w:lvlText w:val="%4."/>
+      <w:lvlJc w:val="left"/>
+      <w:pPr>
+        <w:ind w:left="2880" w:hanging="360"/>
+      </w:pPr>
+      <w:rPr>
+        <w:u w:val="none"/>
+      </w:rPr>
+    </w:lvl>
+    <w:lvl w:ilvl="4">
+      <w:start w:val="1"/>
+      <w:numFmt w:val="lowerLetter"/>
+      <w:lvlText w:val="%5."/>
+      <w:lvlJc w:val="left"/>
+      <w:pPr>
+        <w:ind w:left="3600" w:hanging="360"/>
+      </w:pPr>
+      <w:rPr>
+        <w:u w:val="none"/>
+      </w:rPr>
+    </w:lvl>
+    <w:lvl w:ilvl="5">
+      <w:start w:val="1"/>
+      <w:numFmt w:val="lowerRoman"/>
+      <w:lvlText w:val="%6."/>
+      <w:lvlJc w:val="right"/>
+      <w:pPr>
+        <w:ind w:left="4320" w:hanging="360"/>
+      </w:pPr>
+      <w:rPr>
+        <w:u w:val="none"/>
+      </w:rPr>
+    </w:lvl>
+    <w:lvl w:ilvl="6">
+      <w:start w:val="1"/>
+      <w:numFmt w:val="decimal"/>
+      <w:lvlText w:val="%7."/>
+      <w:lvlJc w:val="left"/>
+      <w:pPr>
+        <w:ind w:left="5040" w:hanging="360"/>
+      </w:pPr>
+      <w:rPr>
+        <w:u w:val="none"/>
+      </w:rPr>
+    </w:lvl>
+    <w:lvl w:ilvl="7">
+      <w:start w:val="1"/>
+      <w:numFmt w:val="lowerLetter"/>
+      <w:lvlText w:val="%8."/>
+      <w:lvlJc w:val="left"/>
+      <w:pPr>
+        <w:ind w:left="5760" w:hanging="360"/>
+      </w:pPr>
+      <w:rPr>
+        <w:u w:val="none"/>
+      </w:rPr>
+    </w:lvl>
+    <w:lvl w:ilvl="8">
+      <w:start w:val="1"/>
+      <w:numFmt w:val="lowerRoman"/>
+      <w:lvlText w:val="%9."/>
+      <w:lvlJc w:val="right"/>
+      <w:pPr>
+        <w:ind w:left="6480" w:hanging="360"/>
+      </w:pPr>
+      <w:rPr>
+        <w:u w:val="none"/>
+      </w:rPr>
+    </w:lvl>
+  </w:abstractNum>
+  <w:abstractNum w:abstractNumId="4">
+    <w:lvl w:ilvl="0">
+      <w:start w:val="1"/>
+      <w:numFmt w:val="decimal"/>
+      <w:lvlText w:val="%1."/>
+      <w:lvlJc w:val="left"/>
+      <w:pPr>
         <w:ind w:left="1440" w:hanging="360"/>
       </w:pPr>
       <w:rPr>
@@ -11359,6 +12151,9 @@
   </w:num>
   <w:num w:numId="3">
     <w:abstractNumId w:val="3"/>
+  </w:num>
+  <w:num w:numId="4">
+    <w:abstractNumId w:val="4"/>
   </w:num>
 </w:numbering>
 </file>

</xml_diff>